<commit_message>
feat(web): add configuration parameter to use different domain for DataURL communication
</commit_message>
<xml_diff>
--- a/doc/PDFAS4_WebDokumentation.docx
+++ b/doc/PDFAS4_WebDokumentation.docx
@@ -34,7 +34,8 @@
           <w:p>
             <w:pPr>
               <w:pStyle w:val="NoSpacing"/>
-              <w:widowControl/>
+              <w:widowControl w:val="false"/>
+              <w:suppressAutoHyphens w:val="true"/>
               <w:spacing w:before="60" w:after="0"/>
               <w:ind w:left="0" w:right="0" w:hanging="0"/>
               <w:jc w:val="left"/>
@@ -45,12 +46,8 @@
             </w:pPr>
             <w:r>
               <w:rPr>
-                <w:rFonts w:eastAsia="" w:cs="" w:ascii="Century Gothic" w:hAnsi="Century Gothic"/>
-                <w:color w:val="4C483D"/>
-                <w:kern w:val="0"/>
-                <w:sz w:val="20"/>
-                <w:szCs w:val="20"/>
-                <w:lang w:val="en-US" w:eastAsia="ja-JP" w:bidi="ar-SA"/>
+                <w:rFonts w:asciiTheme="majorHAnsi" w:hAnsiTheme="majorHAnsi" w:ascii="Century Gothic" w:hAnsi="Century Gothic"/>
+                <w:sz w:val="18"/>
               </w:rPr>
               <mc:AlternateContent>
                 <mc:Choice Requires="wps">
@@ -170,11 +167,12 @@
           <w:p>
             <w:pPr>
               <w:pStyle w:val="NoSpacing"/>
-              <w:widowControl/>
+              <w:widowControl w:val="false"/>
               <w:tabs>
                 <w:tab w:val="clear" w:pos="720"/>
                 <w:tab w:val="left" w:pos="3297" w:leader="none"/>
               </w:tabs>
+              <w:suppressAutoHyphens w:val="true"/>
               <w:spacing w:before="60" w:after="0"/>
               <w:ind w:left="0" w:right="0" w:hanging="0"/>
               <w:jc w:val="center"/>
@@ -251,7 +249,7 @@
         <w:tblStyle w:val="Tabellenraster"/>
         <w:tblW w:w="8788" w:type="dxa"/>
         <w:jc w:val="left"/>
-        <w:tblInd w:w="392" w:type="dxa"/>
+        <w:tblInd w:w="505" w:type="dxa"/>
         <w:tblLayout w:type="fixed"/>
         <w:tblCellMar>
           <w:top w:w="0" w:type="dxa"/>
@@ -262,8 +260,8 @@
         <w:tblLook w:val="04a0" w:noHBand="0" w:noVBand="1" w:firstColumn="1" w:lastRow="0" w:lastColumn="0" w:firstRow="1"/>
       </w:tblPr>
       <w:tblGrid>
-        <w:gridCol w:w="283"/>
-        <w:gridCol w:w="8504"/>
+        <w:gridCol w:w="282"/>
+        <w:gridCol w:w="8505"/>
       </w:tblGrid>
       <w:tr>
         <w:trPr>
@@ -271,7 +269,7 @@
         </w:trPr>
         <w:tc>
           <w:tcPr>
-            <w:tcW w:w="283" w:type="dxa"/>
+            <w:tcW w:w="282" w:type="dxa"/>
             <w:tcBorders>
               <w:top w:val="nil"/>
               <w:left w:val="single" w:sz="4" w:space="0" w:color="E4E3E2"/>
@@ -282,7 +280,8 @@
           <w:p>
             <w:pPr>
               <w:pStyle w:val="Titel"/>
-              <w:widowControl/>
+              <w:widowControl w:val="false"/>
+              <w:suppressAutoHyphens w:val="true"/>
               <w:spacing w:before="120" w:after="0"/>
               <w:rPr>
                 <w:lang w:eastAsia="ja-JP" w:bidi="ar-SA"/>
@@ -297,7 +296,7 @@
         </w:tc>
         <w:tc>
           <w:tcPr>
-            <w:tcW w:w="8504" w:type="dxa"/>
+            <w:tcW w:w="8505" w:type="dxa"/>
             <w:tcBorders>
               <w:top w:val="nil"/>
               <w:left w:val="nil"/>
@@ -308,7 +307,8 @@
           <w:p>
             <w:pPr>
               <w:pStyle w:val="Titel"/>
-              <w:widowControl/>
+              <w:widowControl w:val="false"/>
+              <w:suppressAutoHyphens w:val="true"/>
               <w:spacing w:before="120" w:after="0"/>
               <w:rPr>
                 <w:lang w:eastAsia="ja-JP" w:bidi="ar-SA"/>
@@ -329,7 +329,7 @@
         </w:trPr>
         <w:tc>
           <w:tcPr>
-            <w:tcW w:w="283" w:type="dxa"/>
+            <w:tcW w:w="282" w:type="dxa"/>
             <w:tcBorders>
               <w:top w:val="nil"/>
               <w:left w:val="single" w:sz="4" w:space="0" w:color="E4E3E2"/>
@@ -340,7 +340,8 @@
           <w:p>
             <w:pPr>
               <w:pStyle w:val="Titel"/>
-              <w:widowControl/>
+              <w:widowControl w:val="false"/>
+              <w:suppressAutoHyphens w:val="true"/>
               <w:spacing w:before="120" w:after="0"/>
               <w:rPr>
                 <w:lang w:eastAsia="ja-JP" w:bidi="ar-SA"/>
@@ -355,7 +356,7 @@
         </w:tc>
         <w:tc>
           <w:tcPr>
-            <w:tcW w:w="8504" w:type="dxa"/>
+            <w:tcW w:w="8505" w:type="dxa"/>
             <w:tcBorders>
               <w:top w:val="nil"/>
               <w:left w:val="nil"/>
@@ -367,7 +368,8 @@
           <w:p>
             <w:pPr>
               <w:pStyle w:val="Untertitel"/>
-              <w:widowControl/>
+              <w:widowControl w:val="false"/>
+              <w:suppressAutoHyphens w:val="true"/>
               <w:spacing w:before="320" w:after="0"/>
               <w:rPr>
                 <w:rFonts w:eastAsia="" w:cs=""/>
@@ -393,7 +395,7 @@
         </w:trPr>
         <w:tc>
           <w:tcPr>
-            <w:tcW w:w="283" w:type="dxa"/>
+            <w:tcW w:w="282" w:type="dxa"/>
             <w:tcBorders>
               <w:top w:val="nil"/>
               <w:left w:val="single" w:sz="4" w:space="0" w:color="E4E3E2"/>
@@ -404,7 +406,8 @@
           <w:p>
             <w:pPr>
               <w:pStyle w:val="Titel"/>
-              <w:widowControl/>
+              <w:widowControl w:val="false"/>
+              <w:suppressAutoHyphens w:val="true"/>
               <w:spacing w:before="120" w:after="0"/>
               <w:rPr>
                 <w:lang w:eastAsia="ja-JP" w:bidi="ar-SA"/>
@@ -419,7 +422,7 @@
         </w:tc>
         <w:tc>
           <w:tcPr>
-            <w:tcW w:w="8504" w:type="dxa"/>
+            <w:tcW w:w="8505" w:type="dxa"/>
             <w:tcBorders>
               <w:top w:val="nil"/>
               <w:left w:val="nil"/>
@@ -431,7 +434,8 @@
           <w:p>
             <w:pPr>
               <w:pStyle w:val="Normal"/>
-              <w:widowControl/>
+              <w:widowControl w:val="false"/>
+              <w:suppressAutoHyphens w:val="true"/>
               <w:spacing w:lineRule="auto" w:line="240" w:before="0" w:after="0"/>
               <w:jc w:val="left"/>
               <w:rPr>
@@ -446,31 +450,15 @@
                 <w:kern w:val="0"/>
                 <w:lang w:eastAsia="ja-JP" w:bidi="ar-SA"/>
               </w:rPr>
-              <w:t>Version 0.</w:t>
-            </w:r>
-            <w:r>
-              <w:rPr>
-                <w:rFonts w:eastAsia="" w:cs=""/>
-                <w:kern w:val="0"/>
-                <w:lang w:eastAsia="ja-JP" w:bidi="ar-SA"/>
-              </w:rPr>
-              <w:t>9</w:t>
-            </w:r>
-            <w:r>
-              <w:rPr>
-                <w:rFonts w:eastAsia="" w:cs=""/>
-                <w:kern w:val="0"/>
-                <w:lang w:eastAsia="ja-JP" w:bidi="ar-SA"/>
-              </w:rPr>
-              <w:t>, 0</w:t>
-            </w:r>
-            <w:r>
-              <w:rPr>
-                <w:rFonts w:eastAsia="" w:cs=""/>
-                <w:kern w:val="0"/>
-                <w:lang w:eastAsia="ja-JP" w:bidi="ar-SA"/>
-              </w:rPr>
-              <w:t>2</w:t>
+              <w:t xml:space="preserve">Version </w:t>
+            </w:r>
+            <w:r>
+              <w:rPr>
+                <w:rFonts w:eastAsia="" w:cs=""/>
+                <w:kern w:val="0"/>
+                <w:lang w:eastAsia="ja-JP" w:bidi="ar-SA"/>
+              </w:rPr>
+              <w:t>1</w:t>
             </w:r>
             <w:r>
               <w:rPr>
@@ -486,23 +474,47 @@
                 <w:kern w:val="0"/>
                 <w:lang w:eastAsia="ja-JP" w:bidi="ar-SA"/>
               </w:rPr>
-              <w:t>03</w:t>
-            </w:r>
-            <w:r>
-              <w:rPr>
-                <w:rFonts w:eastAsia="" w:cs=""/>
-                <w:kern w:val="0"/>
-                <w:lang w:eastAsia="ja-JP" w:bidi="ar-SA"/>
-              </w:rPr>
-              <w:t>.20</w:t>
-            </w:r>
-            <w:r>
-              <w:rPr>
-                <w:rFonts w:eastAsia="" w:cs=""/>
-                <w:kern w:val="0"/>
-                <w:lang w:eastAsia="ja-JP" w:bidi="ar-SA"/>
-              </w:rPr>
-              <w:t>23</w:t>
+              <w:t>0</w:t>
+            </w:r>
+            <w:r>
+              <w:rPr>
+                <w:rFonts w:eastAsia="" w:cs=""/>
+                <w:kern w:val="0"/>
+                <w:lang w:eastAsia="ja-JP" w:bidi="ar-SA"/>
+              </w:rPr>
+              <w:t xml:space="preserve">, </w:t>
+            </w:r>
+            <w:r>
+              <w:rPr>
+                <w:rFonts w:eastAsia="" w:cs=""/>
+                <w:kern w:val="0"/>
+                <w:lang w:eastAsia="ja-JP" w:bidi="ar-SA"/>
+              </w:rPr>
+              <w:t>05</w:t>
+            </w:r>
+            <w:r>
+              <w:rPr>
+                <w:rFonts w:eastAsia="" w:cs=""/>
+                <w:kern w:val="0"/>
+                <w:lang w:eastAsia="ja-JP" w:bidi="ar-SA"/>
+              </w:rPr>
+              <w:t>.</w:t>
+            </w:r>
+            <w:r>
+              <w:rPr>
+                <w:rFonts w:eastAsia="" w:cs=""/>
+                <w:kern w:val="0"/>
+                <w:lang w:eastAsia="ja-JP" w:bidi="ar-SA"/>
+              </w:rPr>
+              <w:t>12</w:t>
+            </w:r>
+            <w:r>
+              <w:rPr>
+                <w:rFonts w:eastAsia="" w:cs=""/>
+                <w:kern w:val="0"/>
+                <w:lang w:eastAsia="ja-JP" w:bidi="ar-SA"/>
+              </w:rPr>
+              <w:t>.2023</w:t>
             </w:r>
           </w:p>
         </w:tc>
@@ -513,7 +525,7 @@
         </w:trPr>
         <w:tc>
           <w:tcPr>
-            <w:tcW w:w="283" w:type="dxa"/>
+            <w:tcW w:w="282" w:type="dxa"/>
             <w:tcBorders>
               <w:top w:val="nil"/>
               <w:left w:val="single" w:sz="4" w:space="0" w:color="E4E3E2"/>
@@ -524,7 +536,8 @@
           <w:p>
             <w:pPr>
               <w:pStyle w:val="Titel"/>
-              <w:widowControl/>
+              <w:widowControl w:val="false"/>
+              <w:suppressAutoHyphens w:val="true"/>
               <w:spacing w:before="120" w:after="0"/>
               <w:rPr>
                 <w:lang w:eastAsia="ja-JP" w:bidi="ar-SA"/>
@@ -539,7 +552,7 @@
         </w:tc>
         <w:tc>
           <w:tcPr>
-            <w:tcW w:w="8504" w:type="dxa"/>
+            <w:tcW w:w="8505" w:type="dxa"/>
             <w:tcBorders>
               <w:top w:val="nil"/>
               <w:left w:val="nil"/>
@@ -551,7 +564,8 @@
           <w:p>
             <w:pPr>
               <w:pStyle w:val="Normal"/>
-              <w:widowControl/>
+              <w:widowControl w:val="false"/>
+              <w:suppressAutoHyphens w:val="true"/>
               <w:spacing w:lineRule="auto" w:line="240" w:before="0" w:after="0"/>
               <w:jc w:val="left"/>
               <w:rPr>
@@ -571,7 +585,8 @@
           <w:p>
             <w:pPr>
               <w:pStyle w:val="Normal"/>
-              <w:widowControl/>
+              <w:widowControl w:val="false"/>
+              <w:suppressAutoHyphens w:val="true"/>
               <w:spacing w:lineRule="auto" w:line="240" w:before="0" w:after="0"/>
               <w:jc w:val="left"/>
               <w:rPr>
@@ -602,7 +617,8 @@
           <w:p>
             <w:pPr>
               <w:pStyle w:val="Normal"/>
-              <w:widowControl/>
+              <w:widowControl w:val="false"/>
+              <w:suppressAutoHyphens w:val="true"/>
               <w:spacing w:lineRule="auto" w:line="240" w:before="0" w:after="0"/>
               <w:jc w:val="left"/>
               <w:rPr>
@@ -613,11 +629,9 @@
             </w:pPr>
             <w:r>
               <w:rPr>
-                <w:rFonts w:eastAsia="" w:cs=""/>
-                <w:kern w:val="0"/>
                 <w:sz w:val="8"/>
                 <w:szCs w:val="8"/>
-                <w:lang w:val="en-US" w:eastAsia="ja-JP" w:bidi="ar-SA"/>
+                <w:lang w:val="en-US"/>
               </w:rPr>
             </w:r>
           </w:p>
@@ -629,7 +643,7 @@
         </w:trPr>
         <w:tc>
           <w:tcPr>
-            <w:tcW w:w="283" w:type="dxa"/>
+            <w:tcW w:w="282" w:type="dxa"/>
             <w:tcBorders>
               <w:top w:val="nil"/>
               <w:left w:val="single" w:sz="4" w:space="0" w:color="E4E3E2"/>
@@ -640,7 +654,8 @@
           <w:p>
             <w:pPr>
               <w:pStyle w:val="Titel"/>
-              <w:widowControl/>
+              <w:widowControl w:val="false"/>
+              <w:suppressAutoHyphens w:val="true"/>
               <w:spacing w:before="120" w:after="0"/>
               <w:rPr>
                 <w:lang w:val="en-US"/>
@@ -648,14 +663,14 @@
             </w:pPr>
             <w:r>
               <w:rPr>
-                <w:lang w:val="en-US" w:eastAsia="ja-JP" w:bidi="ar-SA"/>
-              </w:rPr>
-            </w:r>
-          </w:p>
-        </w:tc>
-        <w:tc>
-          <w:tcPr>
-            <w:tcW w:w="8504" w:type="dxa"/>
+                <w:lang w:val="en-US"/>
+              </w:rPr>
+            </w:r>
+          </w:p>
+        </w:tc>
+        <w:tc>
+          <w:tcPr>
+            <w:tcW w:w="8505" w:type="dxa"/>
             <w:tcBorders>
               <w:top w:val="nil"/>
               <w:left w:val="nil"/>
@@ -666,7 +681,8 @@
           <w:p>
             <w:pPr>
               <w:pStyle w:val="Normal"/>
-              <w:widowControl/>
+              <w:widowControl w:val="false"/>
+              <w:suppressAutoHyphens w:val="true"/>
               <w:spacing w:lineRule="auto" w:line="240" w:before="0" w:after="0"/>
               <w:rPr>
                 <w:lang w:val="en-US"/>
@@ -771,6 +787,7 @@
             <w:rPr>
               <w:webHidden/>
               <w:rStyle w:val="Verzeichnissprung"/>
+              <w:vanish w:val="false"/>
             </w:rPr>
             <w:instrText xml:space="preserve"> TOC \z \o "1-3" \u \h</w:instrText>
           </w:r>
@@ -778,6 +795,7 @@
             <w:rPr>
               <w:webHidden/>
               <w:rStyle w:val="Verzeichnissprung"/>
+              <w:vanish w:val="false"/>
             </w:rPr>
             <w:fldChar w:fldCharType="separate"/>
           </w:r>
@@ -785,33 +803,28 @@
             <w:r>
               <w:rPr>
                 <w:webHidden/>
-                <w:rStyle w:val="Verzeichnissprung"/>
-              </w:rPr>
-              <w:t>1 Deployment</w:t>
+              </w:rPr>
+              <w:fldChar w:fldCharType="begin"/>
             </w:r>
             <w:r>
               <w:rPr>
                 <w:webHidden/>
               </w:rPr>
-              <w:fldChar w:fldCharType="begin"/>
+              <w:instrText xml:space="preserve">PAGEREF _Toc396214475 \h</w:instrText>
             </w:r>
             <w:r>
               <w:rPr>
                 <w:webHidden/>
               </w:rPr>
-              <w:instrText xml:space="preserve">PAGEREF _Toc396214475 \h</w:instrText>
+              <w:fldChar w:fldCharType="separate"/>
             </w:r>
             <w:r>
               <w:rPr>
                 <w:webHidden/>
-              </w:rPr>
-              <w:fldChar w:fldCharType="separate"/>
-            </w:r>
-            <w:r>
-              <w:rPr>
                 <w:rStyle w:val="Verzeichnissprung"/>
                 <w:vanish w:val="false"/>
               </w:rPr>
+              <w:t>1 Deployment</w:t>
               <w:tab/>
               <w:t>3</w:t>
             </w:r>
@@ -840,33 +853,28 @@
             <w:r>
               <w:rPr>
                 <w:webHidden/>
-                <w:rStyle w:val="Verzeichnissprung"/>
-              </w:rPr>
-              <w:t>1.1 Konfigurationsparameter</w:t>
+              </w:rPr>
+              <w:fldChar w:fldCharType="begin"/>
             </w:r>
             <w:r>
               <w:rPr>
                 <w:webHidden/>
               </w:rPr>
-              <w:fldChar w:fldCharType="begin"/>
+              <w:instrText xml:space="preserve">PAGEREF _Toc396214476 \h</w:instrText>
             </w:r>
             <w:r>
               <w:rPr>
                 <w:webHidden/>
               </w:rPr>
-              <w:instrText xml:space="preserve">PAGEREF _Toc396214476 \h</w:instrText>
+              <w:fldChar w:fldCharType="separate"/>
             </w:r>
             <w:r>
               <w:rPr>
                 <w:webHidden/>
-              </w:rPr>
-              <w:fldChar w:fldCharType="separate"/>
-            </w:r>
-            <w:r>
-              <w:rPr>
                 <w:rStyle w:val="Verzeichnissprung"/>
                 <w:vanish w:val="false"/>
               </w:rPr>
+              <w:t>1.1 Konfigurationsparameter</w:t>
               <w:tab/>
               <w:t>3</w:t>
             </w:r>
@@ -895,33 +903,28 @@
             <w:r>
               <w:rPr>
                 <w:webHidden/>
-                <w:rStyle w:val="Verzeichnissprung"/>
-              </w:rPr>
-              <w:t>1.2 SOAP-Schnittstelle</w:t>
+              </w:rPr>
+              <w:fldChar w:fldCharType="begin"/>
             </w:r>
             <w:r>
               <w:rPr>
                 <w:webHidden/>
               </w:rPr>
-              <w:fldChar w:fldCharType="begin"/>
+              <w:instrText xml:space="preserve">PAGEREF _Toc396214477 \h</w:instrText>
             </w:r>
             <w:r>
               <w:rPr>
                 <w:webHidden/>
               </w:rPr>
-              <w:instrText xml:space="preserve">PAGEREF _Toc396214477 \h</w:instrText>
+              <w:fldChar w:fldCharType="separate"/>
             </w:r>
             <w:r>
               <w:rPr>
                 <w:webHidden/>
-              </w:rPr>
-              <w:fldChar w:fldCharType="separate"/>
-            </w:r>
-            <w:r>
-              <w:rPr>
                 <w:rStyle w:val="Verzeichnissprung"/>
                 <w:vanish w:val="false"/>
               </w:rPr>
+              <w:t>1.2 SOAP-Schnittstelle</w:t>
               <w:tab/>
               <w:t>3</w:t>
             </w:r>
@@ -950,33 +953,28 @@
             <w:r>
               <w:rPr>
                 <w:webHidden/>
-                <w:rStyle w:val="Verzeichnissprung"/>
-              </w:rPr>
-              <w:t>1.3 PDF-AS Web Clusterbetrieb</w:t>
+              </w:rPr>
+              <w:fldChar w:fldCharType="begin"/>
             </w:r>
             <w:r>
               <w:rPr>
                 <w:webHidden/>
               </w:rPr>
-              <w:fldChar w:fldCharType="begin"/>
+              <w:instrText xml:space="preserve">PAGEREF _Toc396214478 \h</w:instrText>
             </w:r>
             <w:r>
               <w:rPr>
                 <w:webHidden/>
               </w:rPr>
-              <w:instrText xml:space="preserve">PAGEREF _Toc396214478 \h</w:instrText>
+              <w:fldChar w:fldCharType="separate"/>
             </w:r>
             <w:r>
               <w:rPr>
                 <w:webHidden/>
-              </w:rPr>
-              <w:fldChar w:fldCharType="separate"/>
-            </w:r>
-            <w:r>
-              <w:rPr>
                 <w:rStyle w:val="Verzeichnissprung"/>
                 <w:vanish w:val="false"/>
               </w:rPr>
+              <w:t>1.3 PDF-AS Web Clusterbetrieb</w:t>
               <w:tab/>
               <w:t>4</w:t>
             </w:r>
@@ -1005,33 +1003,28 @@
             <w:r>
               <w:rPr>
                 <w:webHidden/>
-                <w:rStyle w:val="Verzeichnissprung"/>
-              </w:rPr>
-              <w:t>1.4 PDF-AS Web Konfigurationsdatei</w:t>
+              </w:rPr>
+              <w:fldChar w:fldCharType="begin"/>
             </w:r>
             <w:r>
               <w:rPr>
                 <w:webHidden/>
               </w:rPr>
-              <w:fldChar w:fldCharType="begin"/>
+              <w:instrText xml:space="preserve">PAGEREF _Toc396214479 \h</w:instrText>
             </w:r>
             <w:r>
               <w:rPr>
                 <w:webHidden/>
               </w:rPr>
-              <w:instrText xml:space="preserve">PAGEREF _Toc396214479 \h</w:instrText>
+              <w:fldChar w:fldCharType="separate"/>
             </w:r>
             <w:r>
               <w:rPr>
                 <w:webHidden/>
-              </w:rPr>
-              <w:fldChar w:fldCharType="separate"/>
-            </w:r>
-            <w:r>
-              <w:rPr>
                 <w:rStyle w:val="Verzeichnissprung"/>
                 <w:vanish w:val="false"/>
               </w:rPr>
+              <w:t>1.4 PDF-AS Web Konfigurationsdatei</w:t>
               <w:tab/>
               <w:t>5</w:t>
             </w:r>
@@ -1060,33 +1053,28 @@
             <w:r>
               <w:rPr>
                 <w:webHidden/>
-                <w:rStyle w:val="Verzeichnissprung"/>
-              </w:rPr>
-              <w:t>1.5 Kommunikation</w:t>
+              </w:rPr>
+              <w:fldChar w:fldCharType="begin"/>
             </w:r>
             <w:r>
               <w:rPr>
                 <w:webHidden/>
               </w:rPr>
-              <w:fldChar w:fldCharType="begin"/>
+              <w:instrText xml:space="preserve">PAGEREF _Toc396214480 \h</w:instrText>
             </w:r>
             <w:r>
               <w:rPr>
                 <w:webHidden/>
               </w:rPr>
-              <w:instrText xml:space="preserve">PAGEREF _Toc396214480 \h</w:instrText>
+              <w:fldChar w:fldCharType="separate"/>
             </w:r>
             <w:r>
               <w:rPr>
                 <w:webHidden/>
-              </w:rPr>
-              <w:fldChar w:fldCharType="separate"/>
-            </w:r>
-            <w:r>
-              <w:rPr>
                 <w:rStyle w:val="Verzeichnissprung"/>
                 <w:vanish w:val="false"/>
               </w:rPr>
+              <w:t>1.5 Kommunikation</w:t>
               <w:tab/>
               <w:t>9</w:t>
             </w:r>
@@ -1115,33 +1103,28 @@
             <w:r>
               <w:rPr>
                 <w:webHidden/>
-                <w:rStyle w:val="Verzeichnissprung"/>
-              </w:rPr>
-              <w:t>2 Beispiele</w:t>
+              </w:rPr>
+              <w:fldChar w:fldCharType="begin"/>
             </w:r>
             <w:r>
               <w:rPr>
                 <w:webHidden/>
               </w:rPr>
-              <w:fldChar w:fldCharType="begin"/>
+              <w:instrText xml:space="preserve">PAGEREF _Toc396214481 \h</w:instrText>
             </w:r>
             <w:r>
               <w:rPr>
                 <w:webHidden/>
               </w:rPr>
-              <w:instrText xml:space="preserve">PAGEREF _Toc396214481 \h</w:instrText>
+              <w:fldChar w:fldCharType="separate"/>
             </w:r>
             <w:r>
               <w:rPr>
                 <w:webHidden/>
-              </w:rPr>
-              <w:fldChar w:fldCharType="separate"/>
-            </w:r>
-            <w:r>
-              <w:rPr>
                 <w:rStyle w:val="Verzeichnissprung"/>
                 <w:vanish w:val="false"/>
               </w:rPr>
+              <w:t>2 Beispiele</w:t>
               <w:tab/>
               <w:t>11</w:t>
             </w:r>
@@ -1292,7 +1275,6 @@
           <w:color w:val="auto"/>
         </w:rPr>
       </w:pPr>
-      <w:bookmarkStart w:id="2" w:name="_Toc396214477"/>
       <w:r>
         <w:rPr>
           <w:color w:val="auto"/>
@@ -1324,12 +1306,12 @@
         </w:numPr>
         <w:rPr/>
       </w:pPr>
-      <w:bookmarkStart w:id="3" w:name="_Toc396214477"/>
+      <w:bookmarkStart w:id="2" w:name="_Toc396214477"/>
       <w:r>
         <w:rPr/>
         <w:t>SOAP-Schnittstelle</w:t>
       </w:r>
-      <w:bookmarkEnd w:id="3"/>
+      <w:bookmarkEnd w:id="2"/>
     </w:p>
     <w:p>
       <w:pPr>
@@ -1437,7 +1419,7 @@
         <w:pStyle w:val="Caption"/>
         <w:rPr/>
       </w:pPr>
-      <w:bookmarkStart w:id="4" w:name="_Ref393120030"/>
+      <w:bookmarkStart w:id="3" w:name="_Ref393120030"/>
       <w:r>
         <w:rPr/>
         <w:t xml:space="preserve">Abbildung </w:t>
@@ -1466,7 +1448,7 @@
         <w:rPr/>
         <w:t>.: Ablauf einer Signatur über die SOAP-Schnittstelle</w:t>
       </w:r>
-      <w:bookmarkEnd w:id="4"/>
+      <w:bookmarkEnd w:id="3"/>
     </w:p>
     <w:p>
       <w:pPr>
@@ -1475,27 +1457,7 @@
       </w:pPr>
       <w:r>
         <w:rPr/>
-        <w:t xml:space="preserve">Die SOAP-Schnittstelle bietet </w:t>
-      </w:r>
-      <w:r>
-        <w:rPr/>
-        <w:t>vier</w:t>
-      </w:r>
-      <w:r>
-        <w:rPr/>
-        <w:t xml:space="preserve"> Methoden „signSingle“, „signBulk“, „</w:t>
-      </w:r>
-      <w:r>
-        <w:rPr/>
-        <w:t>signMultiple“ und „getMultiple“</w:t>
-      </w:r>
-      <w:r>
-        <w:rPr/>
-        <w:t xml:space="preserve">. Mit der Methode „signSingle“ lässt sich ein Dokument signieren. Mit der Methode „signBulk“ lassen sich mehrere Signaturanfragen im Bulk erstellen, </w:t>
-      </w:r>
-      <w:r>
-        <w:rPr/>
-        <w:t>wobei diese Methode nur für Serversignaturen (JKS, oder MOA) zur Verfügung steht.</w:t>
+        <w:t>Die SOAP-Schnittstelle bietet vier Methoden „signSingle“, „signBulk“, „signMultiple“ und „getMultiple“. Mit der Methode „signSingle“ lässt sich ein Dokument signieren. Mit der Methode „signBulk“ lassen sich mehrere Signaturanfragen im Bulk erstellen, wobei diese Methode nur für Serversignaturen (JKS, oder MOA) zur Verfügung steht.</w:t>
       </w:r>
     </w:p>
     <w:p>
@@ -1560,12 +1522,12 @@
         </w:numPr>
         <w:rPr/>
       </w:pPr>
-      <w:bookmarkStart w:id="5" w:name="_Toc396214478"/>
+      <w:bookmarkStart w:id="4" w:name="_Toc396214478"/>
       <w:r>
         <w:rPr/>
         <w:t>PDF-AS Web Clusterbetrieb</w:t>
       </w:r>
-      <w:bookmarkEnd w:id="5"/>
+      <w:bookmarkEnd w:id="4"/>
     </w:p>
     <w:p>
       <w:pPr>
@@ -1763,12 +1725,12 @@
         </w:numPr>
         <w:rPr/>
       </w:pPr>
-      <w:bookmarkStart w:id="6" w:name="_Toc396214479"/>
+      <w:bookmarkStart w:id="5" w:name="_Toc396214479"/>
       <w:r>
         <w:rPr/>
         <w:t>PDF-AS Web Konfigurationsdatei</w:t>
       </w:r>
-      <w:bookmarkEnd w:id="6"/>
+      <w:bookmarkEnd w:id="5"/>
     </w:p>
     <w:p>
       <w:pPr>
@@ -1785,7 +1747,7 @@
         <w:tblStyle w:val="SOWTable"/>
         <w:tblW w:w="10359" w:type="dxa"/>
         <w:jc w:val="left"/>
-        <w:tblInd w:w="0" w:type="dxa"/>
+        <w:tblInd w:w="113" w:type="dxa"/>
         <w:tblLayout w:type="fixed"/>
         <w:tblCellMar>
           <w:top w:w="0" w:type="dxa"/>
@@ -1796,9 +1758,9 @@
         <w:tblLook w:val="04a0" w:noHBand="0" w:noVBand="1" w:firstColumn="1" w:lastRow="0" w:lastColumn="0" w:firstRow="1"/>
       </w:tblPr>
       <w:tblGrid>
-        <w:gridCol w:w="2018"/>
+        <w:gridCol w:w="2017"/>
         <w:gridCol w:w="2909"/>
-        <w:gridCol w:w="5432"/>
+        <w:gridCol w:w="5433"/>
       </w:tblGrid>
       <w:tr>
         <w:trPr>
@@ -1806,7 +1768,7 @@
         </w:trPr>
         <w:tc>
           <w:tcPr>
-            <w:tcW w:w="2018" w:type="dxa"/>
+            <w:tcW w:w="2017" w:type="dxa"/>
             <w:cnfStyle w:val="001000000000" w:firstRow="0" w:lastRow="0" w:firstColumn="1" w:lastColumn="0" w:oddVBand="0" w:evenVBand="0" w:oddHBand="0" w:evenHBand="0" w:firstRowFirstColumn="0" w:firstRowLastColumn="0" w:lastRowFirstColumn="0" w:lastRowLastColumn="0"/>
             <w:tcBorders>
               <w:bottom w:val="nil"/>
@@ -1816,7 +1778,8 @@
           <w:p>
             <w:pPr>
               <w:pStyle w:val="Tabellen"/>
-              <w:widowControl/>
+              <w:widowControl w:val="false"/>
+              <w:suppressAutoHyphens w:val="true"/>
               <w:spacing w:lineRule="auto" w:line="240" w:before="60" w:after="60"/>
               <w:rPr>
                 <w:color w:val="FFFFFF" w:themeColor="background1"/>
@@ -1844,7 +1807,8 @@
           <w:p>
             <w:pPr>
               <w:pStyle w:val="Tabellen"/>
-              <w:widowControl/>
+              <w:widowControl w:val="false"/>
+              <w:suppressAutoHyphens w:val="true"/>
               <w:spacing w:lineRule="auto" w:line="240" w:before="60" w:after="60"/>
               <w:cnfStyle w:val="100000000000" w:firstRow="1" w:lastRow="0" w:firstColumn="0" w:lastColumn="0" w:oddVBand="0" w:evenVBand="0" w:oddHBand="0" w:evenHBand="0" w:firstRowFirstColumn="0" w:firstRowLastColumn="0" w:lastRowFirstColumn="0" w:lastRowLastColumn="0"/>
               <w:rPr>
@@ -1864,7 +1828,7 @@
         </w:tc>
         <w:tc>
           <w:tcPr>
-            <w:tcW w:w="5432" w:type="dxa"/>
+            <w:tcW w:w="5433" w:type="dxa"/>
             <w:tcBorders>
               <w:bottom w:val="nil"/>
             </w:tcBorders>
@@ -1873,7 +1837,8 @@
           <w:p>
             <w:pPr>
               <w:pStyle w:val="Tabellen"/>
-              <w:widowControl/>
+              <w:widowControl w:val="false"/>
+              <w:suppressAutoHyphens w:val="true"/>
               <w:spacing w:lineRule="auto" w:line="240" w:before="60" w:after="60"/>
               <w:cnfStyle w:val="100000000000" w:firstRow="1" w:lastRow="0" w:firstColumn="0" w:lastColumn="0" w:oddVBand="0" w:evenVBand="0" w:oddHBand="0" w:evenHBand="0" w:firstRowFirstColumn="0" w:firstRowLastColumn="0" w:lastRowFirstColumn="0" w:lastRowLastColumn="0"/>
               <w:rPr>
@@ -1896,7 +1861,7 @@
         <w:trPr/>
         <w:tc>
           <w:tcPr>
-            <w:tcW w:w="2018" w:type="dxa"/>
+            <w:tcW w:w="2017" w:type="dxa"/>
             <w:cnfStyle w:val="001000000000" w:firstRow="0" w:lastRow="0" w:firstColumn="1" w:lastColumn="0" w:oddVBand="0" w:evenVBand="0" w:oddHBand="0" w:evenHBand="0" w:firstRowFirstColumn="0" w:firstRowLastColumn="0" w:lastRowFirstColumn="0" w:lastRowLastColumn="0"/>
             <w:tcBorders>
               <w:top w:val="nil"/>
@@ -1906,7 +1871,8 @@
           <w:p>
             <w:pPr>
               <w:pStyle w:val="Normal"/>
-              <w:widowControl/>
+              <w:widowControl w:val="false"/>
+              <w:suppressAutoHyphens w:val="true"/>
               <w:spacing w:lineRule="auto" w:line="240" w:before="60" w:after="60"/>
               <w:rPr>
                 <w:rFonts w:eastAsia="" w:cs=""/>
@@ -1935,7 +1901,8 @@
           <w:p>
             <w:pPr>
               <w:pStyle w:val="Normal"/>
-              <w:widowControl/>
+              <w:widowControl w:val="false"/>
+              <w:suppressAutoHyphens w:val="true"/>
               <w:spacing w:lineRule="auto" w:line="240" w:before="60" w:after="60"/>
               <w:cnfStyle w:val="000000000000" w:firstRow="0" w:lastRow="0" w:firstColumn="0" w:lastColumn="0" w:oddVBand="0" w:evenVBand="0" w:oddHBand="0" w:evenHBand="0" w:firstRowFirstColumn="0" w:firstRowLastColumn="0" w:lastRowFirstColumn="0" w:lastRowLastColumn="0"/>
               <w:rPr>
@@ -1956,16 +1923,17 @@
         </w:tc>
         <w:tc>
           <w:tcPr>
-            <w:tcW w:w="5432" w:type="dxa"/>
-            <w:tcBorders>
-              <w:top w:val="nil"/>
-              <w:bottom w:val="nil"/>
-            </w:tcBorders>
-          </w:tcPr>
-          <w:p>
-            <w:pPr>
-              <w:pStyle w:val="Normal"/>
-              <w:widowControl/>
+            <w:tcW w:w="5433" w:type="dxa"/>
+            <w:tcBorders>
+              <w:top w:val="nil"/>
+              <w:bottom w:val="nil"/>
+            </w:tcBorders>
+          </w:tcPr>
+          <w:p>
+            <w:pPr>
+              <w:pStyle w:val="Normal"/>
+              <w:widowControl w:val="false"/>
+              <w:suppressAutoHyphens w:val="true"/>
               <w:spacing w:lineRule="auto" w:line="240" w:before="60" w:after="60"/>
               <w:cnfStyle w:val="000000000000" w:firstRow="0" w:lastRow="0" w:firstColumn="0" w:lastColumn="0" w:oddVBand="0" w:evenVBand="0" w:oddHBand="0" w:evenHBand="0" w:firstRowFirstColumn="0" w:firstRowLastColumn="0" w:lastRowFirstColumn="0" w:lastRowLastColumn="0"/>
               <w:rPr>
@@ -1991,7 +1959,7 @@
         </w:trPr>
         <w:tc>
           <w:tcPr>
-            <w:tcW w:w="2018" w:type="dxa"/>
+            <w:tcW w:w="2017" w:type="dxa"/>
             <w:cnfStyle w:val="001000000000" w:firstRow="0" w:lastRow="0" w:firstColumn="1" w:lastColumn="0" w:oddVBand="0" w:evenVBand="0" w:oddHBand="0" w:evenHBand="0" w:firstRowFirstColumn="0" w:firstRowLastColumn="0" w:lastRowFirstColumn="0" w:lastRowLastColumn="0"/>
             <w:tcBorders>
               <w:top w:val="nil"/>
@@ -2002,7 +1970,8 @@
           <w:p>
             <w:pPr>
               <w:pStyle w:val="Normal"/>
-              <w:widowControl/>
+              <w:widowControl w:val="false"/>
+              <w:suppressAutoHyphens w:val="true"/>
               <w:spacing w:lineRule="auto" w:line="240" w:before="60" w:after="60"/>
               <w:rPr>
                 <w:rFonts w:eastAsia="" w:cs=""/>
@@ -2032,7 +2001,8 @@
           <w:p>
             <w:pPr>
               <w:pStyle w:val="Normal"/>
-              <w:widowControl/>
+              <w:widowControl w:val="false"/>
+              <w:suppressAutoHyphens w:val="true"/>
               <w:spacing w:lineRule="auto" w:line="240" w:before="60" w:after="60"/>
               <w:cnfStyle w:val="000000010000" w:firstRow="0" w:lastRow="0" w:firstColumn="0" w:lastColumn="0" w:oddVBand="0" w:evenVBand="0" w:oddHBand="0" w:evenHBand="1" w:firstRowFirstColumn="0" w:firstRowLastColumn="0" w:lastRowFirstColumn="0" w:lastRowLastColumn="0"/>
               <w:rPr>
@@ -2053,7 +2023,7 @@
         </w:tc>
         <w:tc>
           <w:tcPr>
-            <w:tcW w:w="5432" w:type="dxa"/>
+            <w:tcW w:w="5433" w:type="dxa"/>
             <w:tcBorders>
               <w:top w:val="nil"/>
               <w:bottom w:val="nil"/>
@@ -2063,7 +2033,8 @@
           <w:p>
             <w:pPr>
               <w:pStyle w:val="Normal"/>
-              <w:widowControl/>
+              <w:widowControl w:val="false"/>
+              <w:suppressAutoHyphens w:val="true"/>
               <w:spacing w:lineRule="auto" w:line="240" w:before="60" w:after="60"/>
               <w:cnfStyle w:val="000000010000" w:firstRow="0" w:lastRow="0" w:firstColumn="0" w:lastColumn="0" w:oddVBand="0" w:evenVBand="0" w:oddHBand="0" w:evenHBand="1" w:firstRowFirstColumn="0" w:firstRowLastColumn="0" w:lastRowFirstColumn="0" w:lastRowLastColumn="0"/>
               <w:rPr>
@@ -2087,7 +2058,7 @@
         <w:trPr/>
         <w:tc>
           <w:tcPr>
-            <w:tcW w:w="2018" w:type="dxa"/>
+            <w:tcW w:w="2017" w:type="dxa"/>
             <w:cnfStyle w:val="001000000000" w:firstRow="0" w:lastRow="0" w:firstColumn="1" w:lastColumn="0" w:oddVBand="0" w:evenVBand="0" w:oddHBand="0" w:evenHBand="0" w:firstRowFirstColumn="0" w:firstRowLastColumn="0" w:lastRowFirstColumn="0" w:lastRowLastColumn="0"/>
             <w:tcBorders>
               <w:top w:val="nil"/>
@@ -2097,7 +2068,8 @@
           <w:p>
             <w:pPr>
               <w:pStyle w:val="Normal"/>
-              <w:widowControl/>
+              <w:widowControl w:val="false"/>
+              <w:suppressAutoHyphens w:val="true"/>
               <w:spacing w:lineRule="auto" w:line="240" w:before="60" w:after="60"/>
               <w:rPr>
                 <w:rFonts w:eastAsia="" w:cs=""/>
@@ -2128,7 +2100,8 @@
           <w:p>
             <w:pPr>
               <w:pStyle w:val="Normal"/>
-              <w:widowControl/>
+              <w:widowControl w:val="false"/>
+              <w:suppressAutoHyphens w:val="true"/>
               <w:spacing w:lineRule="auto" w:line="240" w:before="60" w:after="60"/>
               <w:cnfStyle w:val="000000000000" w:firstRow="0" w:lastRow="0" w:firstColumn="0" w:lastColumn="0" w:oddVBand="0" w:evenVBand="0" w:oddHBand="0" w:evenHBand="0" w:firstRowFirstColumn="0" w:firstRowLastColumn="0" w:lastRowFirstColumn="0" w:lastRowLastColumn="0"/>
               <w:rPr>
@@ -2149,16 +2122,17 @@
         </w:tc>
         <w:tc>
           <w:tcPr>
-            <w:tcW w:w="5432" w:type="dxa"/>
-            <w:tcBorders>
-              <w:top w:val="nil"/>
-              <w:bottom w:val="nil"/>
-            </w:tcBorders>
-          </w:tcPr>
-          <w:p>
-            <w:pPr>
-              <w:pStyle w:val="Normal"/>
-              <w:widowControl/>
+            <w:tcW w:w="5433" w:type="dxa"/>
+            <w:tcBorders>
+              <w:top w:val="nil"/>
+              <w:bottom w:val="nil"/>
+            </w:tcBorders>
+          </w:tcPr>
+          <w:p>
+            <w:pPr>
+              <w:pStyle w:val="Normal"/>
+              <w:widowControl w:val="false"/>
+              <w:suppressAutoHyphens w:val="true"/>
               <w:spacing w:lineRule="auto" w:line="240" w:before="60" w:after="60"/>
               <w:cnfStyle w:val="000000000000" w:firstRow="0" w:lastRow="0" w:firstColumn="0" w:lastColumn="0" w:oddVBand="0" w:evenVBand="0" w:oddHBand="0" w:evenHBand="0" w:firstRowFirstColumn="0" w:firstRowLastColumn="0" w:lastRowFirstColumn="0" w:lastRowLastColumn="0"/>
               <w:rPr>
@@ -2184,7 +2158,7 @@
         </w:trPr>
         <w:tc>
           <w:tcPr>
-            <w:tcW w:w="2018" w:type="dxa"/>
+            <w:tcW w:w="2017" w:type="dxa"/>
             <w:cnfStyle w:val="001000000000" w:firstRow="0" w:lastRow="0" w:firstColumn="1" w:lastColumn="0" w:oddVBand="0" w:evenVBand="0" w:oddHBand="0" w:evenHBand="0" w:firstRowFirstColumn="0" w:firstRowLastColumn="0" w:lastRowFirstColumn="0" w:lastRowLastColumn="0"/>
             <w:tcBorders>
               <w:top w:val="nil"/>
@@ -2195,7 +2169,8 @@
           <w:p>
             <w:pPr>
               <w:pStyle w:val="Normal"/>
-              <w:widowControl/>
+              <w:widowControl w:val="false"/>
+              <w:suppressAutoHyphens w:val="true"/>
               <w:spacing w:lineRule="auto" w:line="240" w:before="60" w:after="60"/>
               <w:rPr>
                 <w:rFonts w:eastAsia="" w:cs=""/>
@@ -2225,7 +2200,8 @@
           <w:p>
             <w:pPr>
               <w:pStyle w:val="Normal"/>
-              <w:widowControl/>
+              <w:widowControl w:val="false"/>
+              <w:suppressAutoHyphens w:val="true"/>
               <w:spacing w:lineRule="auto" w:line="240" w:before="60" w:after="60"/>
               <w:cnfStyle w:val="000000010000" w:firstRow="0" w:lastRow="0" w:firstColumn="0" w:lastColumn="0" w:oddVBand="0" w:evenVBand="0" w:oddHBand="0" w:evenHBand="1" w:firstRowFirstColumn="0" w:firstRowLastColumn="0" w:lastRowFirstColumn="0" w:lastRowLastColumn="0"/>
               <w:rPr>
@@ -2246,7 +2222,7 @@
         </w:tc>
         <w:tc>
           <w:tcPr>
-            <w:tcW w:w="5432" w:type="dxa"/>
+            <w:tcW w:w="5433" w:type="dxa"/>
             <w:tcBorders>
               <w:top w:val="nil"/>
               <w:bottom w:val="nil"/>
@@ -2256,7 +2232,8 @@
           <w:p>
             <w:pPr>
               <w:pStyle w:val="Normal"/>
-              <w:widowControl/>
+              <w:widowControl w:val="false"/>
+              <w:suppressAutoHyphens w:val="true"/>
               <w:spacing w:lineRule="auto" w:line="240" w:before="60" w:after="60"/>
               <w:cnfStyle w:val="000000010000" w:firstRow="0" w:lastRow="0" w:firstColumn="0" w:lastColumn="0" w:oddVBand="0" w:evenVBand="0" w:oddHBand="0" w:evenHBand="1" w:firstRowFirstColumn="0" w:firstRowLastColumn="0" w:lastRowFirstColumn="0" w:lastRowLastColumn="0"/>
               <w:rPr>
@@ -2280,7 +2257,7 @@
         <w:trPr/>
         <w:tc>
           <w:tcPr>
-            <w:tcW w:w="2018" w:type="dxa"/>
+            <w:tcW w:w="2017" w:type="dxa"/>
             <w:cnfStyle w:val="001000000000" w:firstRow="0" w:lastRow="0" w:firstColumn="1" w:lastColumn="0" w:oddVBand="0" w:evenVBand="0" w:oddHBand="0" w:evenHBand="0" w:firstRowFirstColumn="0" w:firstRowLastColumn="0" w:lastRowFirstColumn="0" w:lastRowLastColumn="0"/>
             <w:tcBorders>
               <w:top w:val="nil"/>
@@ -2290,7 +2267,8 @@
           <w:p>
             <w:pPr>
               <w:pStyle w:val="Normal"/>
-              <w:widowControl/>
+              <w:widowControl w:val="false"/>
+              <w:suppressAutoHyphens w:val="true"/>
               <w:spacing w:lineRule="auto" w:line="240" w:before="60" w:after="60"/>
               <w:rPr>
                 <w:rFonts w:eastAsia="" w:cs=""/>
@@ -2319,7 +2297,8 @@
           <w:p>
             <w:pPr>
               <w:pStyle w:val="Normal"/>
-              <w:widowControl/>
+              <w:widowControl w:val="false"/>
+              <w:suppressAutoHyphens w:val="true"/>
               <w:spacing w:lineRule="auto" w:line="240" w:before="60" w:after="60"/>
               <w:cnfStyle w:val="000000000000" w:firstRow="0" w:lastRow="0" w:firstColumn="0" w:lastColumn="0" w:oddVBand="0" w:evenVBand="0" w:oddHBand="0" w:evenHBand="0" w:firstRowFirstColumn="0" w:firstRowLastColumn="0" w:lastRowFirstColumn="0" w:lastRowLastColumn="0"/>
               <w:rPr>
@@ -2340,16 +2319,17 @@
         </w:tc>
         <w:tc>
           <w:tcPr>
-            <w:tcW w:w="5432" w:type="dxa"/>
-            <w:tcBorders>
-              <w:top w:val="nil"/>
-              <w:bottom w:val="nil"/>
-            </w:tcBorders>
-          </w:tcPr>
-          <w:p>
-            <w:pPr>
-              <w:pStyle w:val="Normal"/>
-              <w:widowControl/>
+            <w:tcW w:w="5433" w:type="dxa"/>
+            <w:tcBorders>
+              <w:top w:val="nil"/>
+              <w:bottom w:val="nil"/>
+            </w:tcBorders>
+          </w:tcPr>
+          <w:p>
+            <w:pPr>
+              <w:pStyle w:val="Normal"/>
+              <w:widowControl w:val="false"/>
+              <w:suppressAutoHyphens w:val="true"/>
               <w:spacing w:lineRule="auto" w:line="240" w:before="60" w:after="60"/>
               <w:cnfStyle w:val="000000000000" w:firstRow="0" w:lastRow="0" w:firstColumn="0" w:lastColumn="0" w:oddVBand="0" w:evenVBand="0" w:oddHBand="0" w:evenHBand="0" w:firstRowFirstColumn="0" w:firstRowLastColumn="0" w:lastRowFirstColumn="0" w:lastRowLastColumn="0"/>
               <w:rPr>
@@ -2375,7 +2355,7 @@
         </w:trPr>
         <w:tc>
           <w:tcPr>
-            <w:tcW w:w="2018" w:type="dxa"/>
+            <w:tcW w:w="2017" w:type="dxa"/>
             <w:cnfStyle w:val="001000000000" w:firstRow="0" w:lastRow="0" w:firstColumn="1" w:lastColumn="0" w:oddVBand="0" w:evenVBand="0" w:oddHBand="0" w:evenHBand="0" w:firstRowFirstColumn="0" w:firstRowLastColumn="0" w:lastRowFirstColumn="0" w:lastRowLastColumn="0"/>
             <w:tcBorders>
               <w:top w:val="nil"/>
@@ -2386,7 +2366,8 @@
           <w:p>
             <w:pPr>
               <w:pStyle w:val="Normal"/>
-              <w:widowControl/>
+              <w:widowControl w:val="false"/>
+              <w:suppressAutoHyphens w:val="true"/>
               <w:spacing w:lineRule="auto" w:line="240" w:before="60" w:after="60"/>
               <w:rPr>
                 <w:rFonts w:eastAsia="" w:cs=""/>
@@ -2416,7 +2397,8 @@
           <w:p>
             <w:pPr>
               <w:pStyle w:val="Normal"/>
-              <w:widowControl/>
+              <w:widowControl w:val="false"/>
+              <w:suppressAutoHyphens w:val="true"/>
               <w:spacing w:lineRule="auto" w:line="240" w:before="60" w:after="60"/>
               <w:cnfStyle w:val="000000010000" w:firstRow="0" w:lastRow="0" w:firstColumn="0" w:lastColumn="0" w:oddVBand="0" w:evenVBand="0" w:oddHBand="0" w:evenHBand="1" w:firstRowFirstColumn="0" w:firstRowLastColumn="0" w:lastRowFirstColumn="0" w:lastRowLastColumn="0"/>
               <w:rPr>
@@ -2437,7 +2419,7 @@
         </w:tc>
         <w:tc>
           <w:tcPr>
-            <w:tcW w:w="5432" w:type="dxa"/>
+            <w:tcW w:w="5433" w:type="dxa"/>
             <w:tcBorders>
               <w:top w:val="nil"/>
               <w:bottom w:val="nil"/>
@@ -2447,7 +2429,8 @@
           <w:p>
             <w:pPr>
               <w:pStyle w:val="Normal"/>
-              <w:widowControl/>
+              <w:widowControl w:val="false"/>
+              <w:suppressAutoHyphens w:val="true"/>
               <w:spacing w:lineRule="auto" w:line="240" w:before="60" w:after="60"/>
               <w:cnfStyle w:val="000000010000" w:firstRow="0" w:lastRow="0" w:firstColumn="0" w:lastColumn="0" w:oddVBand="0" w:evenVBand="0" w:oddHBand="0" w:evenHBand="1" w:firstRowFirstColumn="0" w:firstRowLastColumn="0" w:lastRowFirstColumn="0" w:lastRowLastColumn="0"/>
               <w:rPr>
@@ -2471,7 +2454,7 @@
         <w:trPr/>
         <w:tc>
           <w:tcPr>
-            <w:tcW w:w="2018" w:type="dxa"/>
+            <w:tcW w:w="2017" w:type="dxa"/>
             <w:cnfStyle w:val="001000000000" w:firstRow="0" w:lastRow="0" w:firstColumn="1" w:lastColumn="0" w:oddVBand="0" w:evenVBand="0" w:oddHBand="0" w:evenHBand="0" w:firstRowFirstColumn="0" w:firstRowLastColumn="0" w:lastRowFirstColumn="0" w:lastRowLastColumn="0"/>
             <w:tcBorders>
               <w:top w:val="nil"/>
@@ -2481,7 +2464,8 @@
           <w:p>
             <w:pPr>
               <w:pStyle w:val="Normal"/>
-              <w:widowControl/>
+              <w:widowControl w:val="false"/>
+              <w:suppressAutoHyphens w:val="true"/>
               <w:spacing w:lineRule="auto" w:line="240" w:before="60" w:after="60"/>
               <w:rPr>
                 <w:rFonts w:eastAsia="" w:cs=""/>
@@ -2510,7 +2494,8 @@
           <w:p>
             <w:pPr>
               <w:pStyle w:val="Normal"/>
-              <w:widowControl/>
+              <w:widowControl w:val="false"/>
+              <w:suppressAutoHyphens w:val="true"/>
               <w:spacing w:lineRule="auto" w:line="240" w:before="60" w:after="60"/>
               <w:cnfStyle w:val="000000000000" w:firstRow="0" w:lastRow="0" w:firstColumn="0" w:lastColumn="0" w:oddVBand="0" w:evenVBand="0" w:oddHBand="0" w:evenHBand="0" w:firstRowFirstColumn="0" w:firstRowLastColumn="0" w:lastRowFirstColumn="0" w:lastRowLastColumn="0"/>
               <w:rPr>
@@ -2531,16 +2516,17 @@
         </w:tc>
         <w:tc>
           <w:tcPr>
-            <w:tcW w:w="5432" w:type="dxa"/>
-            <w:tcBorders>
-              <w:top w:val="nil"/>
-              <w:bottom w:val="nil"/>
-            </w:tcBorders>
-          </w:tcPr>
-          <w:p>
-            <w:pPr>
-              <w:pStyle w:val="Normal"/>
-              <w:widowControl/>
+            <w:tcW w:w="5433" w:type="dxa"/>
+            <w:tcBorders>
+              <w:top w:val="nil"/>
+              <w:bottom w:val="nil"/>
+            </w:tcBorders>
+          </w:tcPr>
+          <w:p>
+            <w:pPr>
+              <w:pStyle w:val="Normal"/>
+              <w:widowControl w:val="false"/>
+              <w:suppressAutoHyphens w:val="true"/>
               <w:spacing w:lineRule="auto" w:line="240" w:before="60" w:after="60"/>
               <w:cnfStyle w:val="000000000000" w:firstRow="0" w:lastRow="0" w:firstColumn="0" w:lastColumn="0" w:oddVBand="0" w:evenVBand="0" w:oddHBand="0" w:evenHBand="0" w:firstRowFirstColumn="0" w:firstRowLastColumn="0" w:lastRowFirstColumn="0" w:lastRowLastColumn="0"/>
               <w:rPr>
@@ -2566,7 +2552,7 @@
         </w:trPr>
         <w:tc>
           <w:tcPr>
-            <w:tcW w:w="2018" w:type="dxa"/>
+            <w:tcW w:w="2017" w:type="dxa"/>
             <w:cnfStyle w:val="001000000000" w:firstRow="0" w:lastRow="0" w:firstColumn="1" w:lastColumn="0" w:oddVBand="0" w:evenVBand="0" w:oddHBand="0" w:evenHBand="0" w:firstRowFirstColumn="0" w:firstRowLastColumn="0" w:lastRowFirstColumn="0" w:lastRowLastColumn="0"/>
             <w:tcBorders>
               <w:top w:val="nil"/>
@@ -2577,7 +2563,8 @@
           <w:p>
             <w:pPr>
               <w:pStyle w:val="Normal"/>
-              <w:widowControl/>
+              <w:widowControl w:val="false"/>
+              <w:suppressAutoHyphens w:val="true"/>
               <w:spacing w:lineRule="auto" w:line="240" w:before="60" w:after="60"/>
               <w:rPr>
                 <w:rFonts w:eastAsia="" w:cs=""/>
@@ -2607,7 +2594,8 @@
           <w:p>
             <w:pPr>
               <w:pStyle w:val="Normal"/>
-              <w:widowControl/>
+              <w:widowControl w:val="false"/>
+              <w:suppressAutoHyphens w:val="true"/>
               <w:spacing w:lineRule="auto" w:line="240" w:before="60" w:after="60"/>
               <w:cnfStyle w:val="000000010000" w:firstRow="0" w:lastRow="0" w:firstColumn="0" w:lastColumn="0" w:oddVBand="0" w:evenVBand="0" w:oddHBand="0" w:evenHBand="1" w:firstRowFirstColumn="0" w:firstRowLastColumn="0" w:lastRowFirstColumn="0" w:lastRowLastColumn="0"/>
               <w:rPr>
@@ -2628,7 +2616,7 @@
         </w:tc>
         <w:tc>
           <w:tcPr>
-            <w:tcW w:w="5432" w:type="dxa"/>
+            <w:tcW w:w="5433" w:type="dxa"/>
             <w:tcBorders>
               <w:top w:val="nil"/>
               <w:bottom w:val="nil"/>
@@ -2638,7 +2626,8 @@
           <w:p>
             <w:pPr>
               <w:pStyle w:val="Normal"/>
-              <w:widowControl/>
+              <w:widowControl w:val="false"/>
+              <w:suppressAutoHyphens w:val="true"/>
               <w:spacing w:lineRule="auto" w:line="240" w:before="60" w:after="60"/>
               <w:cnfStyle w:val="000000010000" w:firstRow="0" w:lastRow="0" w:firstColumn="0" w:lastColumn="0" w:oddVBand="0" w:evenVBand="0" w:oddHBand="0" w:evenHBand="1" w:firstRowFirstColumn="0" w:firstRowLastColumn="0" w:lastRowFirstColumn="0" w:lastRowLastColumn="0"/>
               <w:rPr>
@@ -2662,7 +2651,7 @@
         <w:trPr/>
         <w:tc>
           <w:tcPr>
-            <w:tcW w:w="2018" w:type="dxa"/>
+            <w:tcW w:w="2017" w:type="dxa"/>
             <w:cnfStyle w:val="001000000000" w:firstRow="0" w:lastRow="0" w:firstColumn="1" w:lastColumn="0" w:oddVBand="0" w:evenVBand="0" w:oddHBand="0" w:evenHBand="0" w:firstRowFirstColumn="0" w:firstRowLastColumn="0" w:lastRowFirstColumn="0" w:lastRowLastColumn="0"/>
             <w:tcBorders>
               <w:top w:val="nil"/>
@@ -2672,7 +2661,8 @@
           <w:p>
             <w:pPr>
               <w:pStyle w:val="Normal"/>
-              <w:widowControl/>
+              <w:widowControl w:val="false"/>
+              <w:suppressAutoHyphens w:val="true"/>
               <w:spacing w:lineRule="auto" w:line="240" w:before="60" w:after="60"/>
               <w:rPr>
                 <w:rFonts w:eastAsia="" w:cs=""/>
@@ -2701,7 +2691,8 @@
           <w:p>
             <w:pPr>
               <w:pStyle w:val="Normal"/>
-              <w:widowControl/>
+              <w:widowControl w:val="false"/>
+              <w:suppressAutoHyphens w:val="true"/>
               <w:spacing w:lineRule="auto" w:line="240" w:before="60" w:after="60"/>
               <w:cnfStyle w:val="000000000000" w:firstRow="0" w:lastRow="0" w:firstColumn="0" w:lastColumn="0" w:oddVBand="0" w:evenVBand="0" w:oddHBand="0" w:evenHBand="0" w:firstRowFirstColumn="0" w:firstRowLastColumn="0" w:lastRowFirstColumn="0" w:lastRowLastColumn="0"/>
               <w:rPr>
@@ -2722,16 +2713,17 @@
         </w:tc>
         <w:tc>
           <w:tcPr>
-            <w:tcW w:w="5432" w:type="dxa"/>
-            <w:tcBorders>
-              <w:top w:val="nil"/>
-              <w:bottom w:val="nil"/>
-            </w:tcBorders>
-          </w:tcPr>
-          <w:p>
-            <w:pPr>
-              <w:pStyle w:val="Normal"/>
-              <w:widowControl/>
+            <w:tcW w:w="5433" w:type="dxa"/>
+            <w:tcBorders>
+              <w:top w:val="nil"/>
+              <w:bottom w:val="nil"/>
+            </w:tcBorders>
+          </w:tcPr>
+          <w:p>
+            <w:pPr>
+              <w:pStyle w:val="Normal"/>
+              <w:widowControl w:val="false"/>
+              <w:suppressAutoHyphens w:val="true"/>
               <w:spacing w:lineRule="auto" w:line="240" w:before="60" w:after="60"/>
               <w:cnfStyle w:val="000000000000" w:firstRow="0" w:lastRow="0" w:firstColumn="0" w:lastColumn="0" w:oddVBand="0" w:evenVBand="0" w:oddHBand="0" w:evenHBand="0" w:firstRowFirstColumn="0" w:firstRowLastColumn="0" w:lastRowFirstColumn="0" w:lastRowLastColumn="0"/>
               <w:rPr>
@@ -2747,6 +2739,129 @@
                 <w:lang w:eastAsia="ja-JP" w:bidi="ar-SA"/>
               </w:rPr>
               <w:t>Legt den öffentlichen Zugangspunkt für PDF-AS Web fest. (optional)</w:t>
+            </w:r>
+          </w:p>
+        </w:tc>
+      </w:tr>
+      <w:tr>
+        <w:trPr/>
+        <w:tc>
+          <w:tcPr>
+            <w:tcW w:w="2017" w:type="dxa"/>
+            <w:cnfStyle w:val="001000000000" w:firstRow="0" w:lastRow="0" w:firstColumn="1" w:lastColumn="0" w:oddVBand="0" w:evenVBand="0" w:oddHBand="0" w:evenHBand="0" w:firstRowFirstColumn="0" w:firstRowLastColumn="0" w:lastRowFirstColumn="0" w:lastRowLastColumn="0"/>
+            <w:tcBorders>
+              <w:top w:val="nil"/>
+              <w:bottom w:val="nil"/>
+            </w:tcBorders>
+          </w:tcPr>
+          <w:p>
+            <w:pPr>
+              <w:pStyle w:val="Normal"/>
+              <w:widowControl w:val="false"/>
+              <w:suppressAutoHyphens w:val="true"/>
+              <w:spacing w:lineRule="auto" w:line="240" w:before="60" w:after="60"/>
+              <w:rPr>
+                <w:rFonts w:ascii="Century Gothic" w:hAnsi="Century Gothic" w:eastAsia="" w:cs="" w:asciiTheme="majorHAnsi" w:hAnsiTheme="majorHAnsi"/>
+                <w:color w:val="000000" w:themeColor="text1"/>
+                <w:kern w:val="0"/>
+                <w:sz w:val="22"/>
+                <w:szCs w:val="22"/>
+                <w:lang w:val="de-DE" w:eastAsia="ja-JP" w:bidi="ar-SA"/>
+              </w:rPr>
+            </w:pPr>
+            <w:r>
+              <w:rPr>
+                <w:rFonts w:eastAsia="" w:cs=""/>
+                <w:color w:val="000000" w:themeColor="text1"/>
+                <w:kern w:val="0"/>
+                <w:sz w:val="22"/>
+                <w:szCs w:val="22"/>
+                <w:shd w:fill="E8F2FE" w:val="clear"/>
+                <w:lang w:val="de-DE" w:eastAsia="ja-JP" w:bidi="ar-SA"/>
+              </w:rPr>
+              <w:t>public.data.url</w:t>
+            </w:r>
+          </w:p>
+        </w:tc>
+        <w:tc>
+          <w:tcPr>
+            <w:tcW w:w="2909" w:type="dxa"/>
+            <w:tcBorders>
+              <w:top w:val="nil"/>
+              <w:bottom w:val="nil"/>
+            </w:tcBorders>
+          </w:tcPr>
+          <w:p>
+            <w:pPr>
+              <w:pStyle w:val="Normal"/>
+              <w:widowControl w:val="false"/>
+              <w:suppressAutoHyphens w:val="true"/>
+              <w:spacing w:lineRule="auto" w:line="240" w:before="60" w:after="60"/>
+              <w:cnfStyle w:val="000000000000" w:firstRow="0" w:lastRow="0" w:firstColumn="0" w:lastColumn="0" w:oddVBand="0" w:evenVBand="0" w:oddHBand="0" w:evenHBand="0" w:firstRowFirstColumn="0" w:firstRowLastColumn="0" w:lastRowFirstColumn="0" w:lastRowLastColumn="0"/>
+              <w:rPr>
+                <w:i/>
+                <w:i/>
+              </w:rPr>
+            </w:pPr>
+            <w:r>
+              <w:rPr>
+                <w:rFonts w:eastAsia="" w:cs=""/>
+                <w:i/>
+                <w:kern w:val="0"/>
+                <w:lang w:eastAsia="ja-JP" w:bidi="ar-SA"/>
+              </w:rPr>
+              <w:t>URL</w:t>
+            </w:r>
+          </w:p>
+        </w:tc>
+        <w:tc>
+          <w:tcPr>
+            <w:tcW w:w="5433" w:type="dxa"/>
+            <w:tcBorders>
+              <w:top w:val="nil"/>
+              <w:bottom w:val="nil"/>
+            </w:tcBorders>
+          </w:tcPr>
+          <w:p>
+            <w:pPr>
+              <w:pStyle w:val="Normal"/>
+              <w:widowControl w:val="false"/>
+              <w:suppressAutoHyphens w:val="true"/>
+              <w:spacing w:lineRule="auto" w:line="240" w:before="60" w:after="60"/>
+              <w:cnfStyle w:val="000000000000" w:firstRow="0" w:lastRow="0" w:firstColumn="0" w:lastColumn="0" w:oddVBand="0" w:evenVBand="0" w:oddHBand="0" w:evenHBand="0" w:firstRowFirstColumn="0" w:firstRowLastColumn="0" w:lastRowFirstColumn="0" w:lastRowLastColumn="0"/>
+              <w:rPr>
+                <w:rFonts w:eastAsia="" w:cs=""/>
+                <w:kern w:val="0"/>
+                <w:lang w:eastAsia="ja-JP" w:bidi="ar-SA"/>
+              </w:rPr>
+            </w:pPr>
+            <w:r>
+              <w:rPr>
+                <w:rFonts w:eastAsia="" w:cs=""/>
+                <w:kern w:val="0"/>
+                <w:lang w:eastAsia="ja-JP" w:bidi="ar-SA"/>
+              </w:rPr>
+              <w:t xml:space="preserve">Legt einen spezifischen Zugangspunkt für die DataURL für die Kommunikation via Security-Layer fest. (option) </w:t>
+              <w:br/>
+              <w:t>Dieser Zugangspunkt wird ausschließlich für die DataURL verwendet und überschreibt die globale Konfiguration des öffentlichen Zugangspunkts (</w:t>
+            </w:r>
+            <w:r>
+              <w:rPr>
+                <w:rFonts w:eastAsia="" w:cs=""/>
+                <w:i/>
+                <w:iCs/>
+                <w:kern w:val="0"/>
+                <w:lang w:eastAsia="ja-JP" w:bidi="ar-SA"/>
+              </w:rPr>
+              <w:t>public.url</w:t>
+            </w:r>
+            <w:r>
+              <w:rPr>
+                <w:rFonts w:eastAsia="" w:cs=""/>
+                <w:kern w:val="0"/>
+                <w:lang w:eastAsia="ja-JP" w:bidi="ar-SA"/>
+              </w:rPr>
+              <w:t>)</w:t>
             </w:r>
           </w:p>
         </w:tc>
@@ -2757,7 +2872,7 @@
         </w:trPr>
         <w:tc>
           <w:tcPr>
-            <w:tcW w:w="2018" w:type="dxa"/>
+            <w:tcW w:w="2017" w:type="dxa"/>
             <w:cnfStyle w:val="001000000000" w:firstRow="0" w:lastRow="0" w:firstColumn="1" w:lastColumn="0" w:oddVBand="0" w:evenVBand="0" w:oddHBand="0" w:evenHBand="0" w:firstRowFirstColumn="0" w:firstRowLastColumn="0" w:lastRowFirstColumn="0" w:lastRowLastColumn="0"/>
             <w:tcBorders>
               <w:top w:val="nil"/>
@@ -2768,7 +2883,8 @@
           <w:p>
             <w:pPr>
               <w:pStyle w:val="Normal"/>
-              <w:widowControl/>
+              <w:widowControl w:val="false"/>
+              <w:suppressAutoHyphens w:val="true"/>
               <w:spacing w:lineRule="auto" w:line="240" w:before="60" w:after="60"/>
               <w:rPr>
                 <w:rFonts w:eastAsia="" w:cs=""/>
@@ -2798,7 +2914,8 @@
           <w:p>
             <w:pPr>
               <w:pStyle w:val="Normal"/>
-              <w:widowControl/>
+              <w:widowControl w:val="false"/>
+              <w:suppressAutoHyphens w:val="true"/>
               <w:spacing w:lineRule="auto" w:line="240" w:before="60" w:after="60"/>
               <w:cnfStyle w:val="000000010000" w:firstRow="0" w:lastRow="0" w:firstColumn="0" w:lastColumn="0" w:oddVBand="0" w:evenVBand="0" w:oddHBand="0" w:evenHBand="1" w:firstRowFirstColumn="0" w:firstRowLastColumn="0" w:lastRowFirstColumn="0" w:lastRowLastColumn="0"/>
               <w:rPr>
@@ -2819,7 +2936,7 @@
         </w:tc>
         <w:tc>
           <w:tcPr>
-            <w:tcW w:w="5432" w:type="dxa"/>
+            <w:tcW w:w="5433" w:type="dxa"/>
             <w:tcBorders>
               <w:top w:val="nil"/>
               <w:bottom w:val="nil"/>
@@ -2829,7 +2946,8 @@
           <w:p>
             <w:pPr>
               <w:pStyle w:val="Normal"/>
-              <w:widowControl/>
+              <w:widowControl w:val="false"/>
+              <w:suppressAutoHyphens w:val="true"/>
               <w:spacing w:lineRule="auto" w:line="240" w:before="60" w:after="60"/>
               <w:cnfStyle w:val="000000010000" w:firstRow="0" w:lastRow="0" w:firstColumn="0" w:lastColumn="0" w:oddVBand="0" w:evenVBand="0" w:oddHBand="0" w:evenHBand="1" w:firstRowFirstColumn="0" w:firstRowLastColumn="0" w:lastRowFirstColumn="0" w:lastRowLastColumn="0"/>
               <w:rPr>
@@ -2853,7 +2971,7 @@
         <w:trPr/>
         <w:tc>
           <w:tcPr>
-            <w:tcW w:w="2018" w:type="dxa"/>
+            <w:tcW w:w="2017" w:type="dxa"/>
             <w:cnfStyle w:val="001000000000" w:firstRow="0" w:lastRow="0" w:firstColumn="1" w:lastColumn="0" w:oddVBand="0" w:evenVBand="0" w:oddHBand="0" w:evenHBand="0" w:firstRowFirstColumn="0" w:firstRowLastColumn="0" w:lastRowFirstColumn="0" w:lastRowLastColumn="0"/>
             <w:tcBorders>
               <w:top w:val="nil"/>
@@ -2863,7 +2981,8 @@
           <w:p>
             <w:pPr>
               <w:pStyle w:val="Normal"/>
-              <w:widowControl/>
+              <w:widowControl w:val="false"/>
+              <w:suppressAutoHyphens w:val="true"/>
               <w:spacing w:lineRule="auto" w:line="240" w:before="60" w:after="60"/>
               <w:rPr>
                 <w:rFonts w:eastAsia="" w:cs=""/>
@@ -2892,7 +3011,8 @@
           <w:p>
             <w:pPr>
               <w:pStyle w:val="Normal"/>
-              <w:widowControl/>
+              <w:widowControl w:val="false"/>
+              <w:suppressAutoHyphens w:val="true"/>
               <w:spacing w:lineRule="auto" w:line="240" w:before="60" w:after="60"/>
               <w:cnfStyle w:val="000000000000" w:firstRow="0" w:lastRow="0" w:firstColumn="0" w:lastColumn="0" w:oddVBand="0" w:evenVBand="0" w:oddHBand="0" w:evenHBand="0" w:firstRowFirstColumn="0" w:firstRowLastColumn="0" w:lastRowFirstColumn="0" w:lastRowLastColumn="0"/>
               <w:rPr>
@@ -2913,16 +3033,17 @@
         </w:tc>
         <w:tc>
           <w:tcPr>
-            <w:tcW w:w="5432" w:type="dxa"/>
-            <w:tcBorders>
-              <w:top w:val="nil"/>
-              <w:bottom w:val="nil"/>
-            </w:tcBorders>
-          </w:tcPr>
-          <w:p>
-            <w:pPr>
-              <w:pStyle w:val="Normal"/>
-              <w:widowControl/>
+            <w:tcW w:w="5433" w:type="dxa"/>
+            <w:tcBorders>
+              <w:top w:val="nil"/>
+              <w:bottom w:val="nil"/>
+            </w:tcBorders>
+          </w:tcPr>
+          <w:p>
+            <w:pPr>
+              <w:pStyle w:val="Normal"/>
+              <w:widowControl w:val="false"/>
+              <w:suppressAutoHyphens w:val="true"/>
               <w:spacing w:lineRule="auto" w:line="240" w:before="60" w:after="60"/>
               <w:cnfStyle w:val="000000000000" w:firstRow="0" w:lastRow="0" w:firstColumn="0" w:lastColumn="0" w:oddVBand="0" w:evenVBand="0" w:oddHBand="0" w:evenHBand="0" w:firstRowFirstColumn="0" w:firstRowLastColumn="0" w:lastRowFirstColumn="0" w:lastRowLastColumn="0"/>
               <w:rPr>
@@ -2948,7 +3069,7 @@
         </w:trPr>
         <w:tc>
           <w:tcPr>
-            <w:tcW w:w="2018" w:type="dxa"/>
+            <w:tcW w:w="2017" w:type="dxa"/>
             <w:cnfStyle w:val="001000000000" w:firstRow="0" w:lastRow="0" w:firstColumn="1" w:lastColumn="0" w:oddVBand="0" w:evenVBand="0" w:oddHBand="0" w:evenHBand="0" w:firstRowFirstColumn="0" w:firstRowLastColumn="0" w:lastRowFirstColumn="0" w:lastRowLastColumn="0"/>
             <w:tcBorders>
               <w:top w:val="nil"/>
@@ -2959,7 +3080,8 @@
           <w:p>
             <w:pPr>
               <w:pStyle w:val="Normal"/>
-              <w:widowControl/>
+              <w:widowControl w:val="false"/>
+              <w:suppressAutoHyphens w:val="true"/>
               <w:spacing w:lineRule="auto" w:line="240" w:before="60" w:after="60"/>
               <w:rPr>
                 <w:rFonts w:eastAsia="" w:cs=""/>
@@ -2989,7 +3111,8 @@
           <w:p>
             <w:pPr>
               <w:pStyle w:val="Normal"/>
-              <w:widowControl/>
+              <w:widowControl w:val="false"/>
+              <w:suppressAutoHyphens w:val="true"/>
               <w:spacing w:lineRule="auto" w:line="240" w:before="60" w:after="60"/>
               <w:cnfStyle w:val="000000010000" w:firstRow="0" w:lastRow="0" w:firstColumn="0" w:lastColumn="0" w:oddVBand="0" w:evenVBand="0" w:oddHBand="0" w:evenHBand="1" w:firstRowFirstColumn="0" w:firstRowLastColumn="0" w:lastRowFirstColumn="0" w:lastRowLastColumn="0"/>
               <w:rPr>
@@ -3010,7 +3133,7 @@
         </w:tc>
         <w:tc>
           <w:tcPr>
-            <w:tcW w:w="5432" w:type="dxa"/>
+            <w:tcW w:w="5433" w:type="dxa"/>
             <w:tcBorders>
               <w:top w:val="nil"/>
               <w:bottom w:val="nil"/>
@@ -3020,7 +3143,8 @@
           <w:p>
             <w:pPr>
               <w:pStyle w:val="Normal"/>
-              <w:widowControl/>
+              <w:widowControl w:val="false"/>
+              <w:suppressAutoHyphens w:val="true"/>
               <w:spacing w:lineRule="auto" w:line="240" w:before="60" w:after="60"/>
               <w:cnfStyle w:val="000000010000" w:firstRow="0" w:lastRow="0" w:firstColumn="0" w:lastColumn="0" w:oddVBand="0" w:evenVBand="0" w:oddHBand="0" w:evenHBand="1" w:firstRowFirstColumn="0" w:firstRowLastColumn="0" w:lastRowFirstColumn="0" w:lastRowLastColumn="0"/>
               <w:rPr>
@@ -3044,7 +3168,7 @@
         <w:trPr/>
         <w:tc>
           <w:tcPr>
-            <w:tcW w:w="2018" w:type="dxa"/>
+            <w:tcW w:w="2017" w:type="dxa"/>
             <w:cnfStyle w:val="001000000000" w:firstRow="0" w:lastRow="0" w:firstColumn="1" w:lastColumn="0" w:oddVBand="0" w:evenVBand="0" w:oddHBand="0" w:evenHBand="0" w:firstRowFirstColumn="0" w:firstRowLastColumn="0" w:lastRowFirstColumn="0" w:lastRowLastColumn="0"/>
             <w:tcBorders>
               <w:top w:val="nil"/>
@@ -3054,7 +3178,8 @@
           <w:p>
             <w:pPr>
               <w:pStyle w:val="Normal"/>
-              <w:widowControl/>
+              <w:widowControl w:val="false"/>
+              <w:suppressAutoHyphens w:val="true"/>
               <w:spacing w:lineRule="auto" w:line="240" w:before="60" w:after="60"/>
               <w:rPr>
                 <w:rFonts w:eastAsia="" w:cs=""/>
@@ -3083,7 +3208,8 @@
           <w:p>
             <w:pPr>
               <w:pStyle w:val="Normal"/>
-              <w:widowControl/>
+              <w:widowControl w:val="false"/>
+              <w:suppressAutoHyphens w:val="true"/>
               <w:spacing w:lineRule="auto" w:line="240" w:before="60" w:after="60"/>
               <w:cnfStyle w:val="000000000000" w:firstRow="0" w:lastRow="0" w:firstColumn="0" w:lastColumn="0" w:oddVBand="0" w:evenVBand="0" w:oddHBand="0" w:evenHBand="0" w:firstRowFirstColumn="0" w:firstRowLastColumn="0" w:lastRowFirstColumn="0" w:lastRowLastColumn="0"/>
               <w:rPr>
@@ -3104,16 +3230,17 @@
         </w:tc>
         <w:tc>
           <w:tcPr>
-            <w:tcW w:w="5432" w:type="dxa"/>
-            <w:tcBorders>
-              <w:top w:val="nil"/>
-              <w:bottom w:val="nil"/>
-            </w:tcBorders>
-          </w:tcPr>
-          <w:p>
-            <w:pPr>
-              <w:pStyle w:val="Normal"/>
-              <w:widowControl/>
+            <w:tcW w:w="5433" w:type="dxa"/>
+            <w:tcBorders>
+              <w:top w:val="nil"/>
+              <w:bottom w:val="nil"/>
+            </w:tcBorders>
+          </w:tcPr>
+          <w:p>
+            <w:pPr>
+              <w:pStyle w:val="Normal"/>
+              <w:widowControl w:val="false"/>
+              <w:suppressAutoHyphens w:val="true"/>
               <w:spacing w:lineRule="auto" w:line="240" w:before="60" w:after="60"/>
               <w:cnfStyle w:val="000000000000" w:firstRow="0" w:lastRow="0" w:firstColumn="0" w:lastColumn="0" w:oddVBand="0" w:evenVBand="0" w:oddHBand="0" w:evenHBand="0" w:firstRowFirstColumn="0" w:firstRowLastColumn="0" w:lastRowFirstColumn="0" w:lastRowLastColumn="0"/>
               <w:rPr>
@@ -3139,7 +3266,7 @@
         </w:trPr>
         <w:tc>
           <w:tcPr>
-            <w:tcW w:w="2018" w:type="dxa"/>
+            <w:tcW w:w="2017" w:type="dxa"/>
             <w:cnfStyle w:val="001000000000" w:firstRow="0" w:lastRow="0" w:firstColumn="1" w:lastColumn="0" w:oddVBand="0" w:evenVBand="0" w:oddHBand="0" w:evenHBand="0" w:firstRowFirstColumn="0" w:firstRowLastColumn="0" w:lastRowFirstColumn="0" w:lastRowLastColumn="0"/>
             <w:tcBorders>
               <w:top w:val="nil"/>
@@ -3150,7 +3277,8 @@
           <w:p>
             <w:pPr>
               <w:pStyle w:val="Normal"/>
-              <w:widowControl/>
+              <w:widowControl w:val="false"/>
+              <w:suppressAutoHyphens w:val="true"/>
               <w:spacing w:lineRule="auto" w:line="240" w:before="60" w:after="60"/>
               <w:rPr>
                 <w:rFonts w:eastAsia="" w:cs=""/>
@@ -3180,7 +3308,8 @@
           <w:p>
             <w:pPr>
               <w:pStyle w:val="Normal"/>
-              <w:widowControl/>
+              <w:widowControl w:val="false"/>
+              <w:suppressAutoHyphens w:val="true"/>
               <w:spacing w:lineRule="auto" w:line="240" w:before="60" w:after="60"/>
               <w:cnfStyle w:val="000000010000" w:firstRow="0" w:lastRow="0" w:firstColumn="0" w:lastColumn="0" w:oddVBand="0" w:evenVBand="0" w:oddHBand="0" w:evenHBand="1" w:firstRowFirstColumn="0" w:firstRowLastColumn="0" w:lastRowFirstColumn="0" w:lastRowLastColumn="0"/>
               <w:rPr>
@@ -3201,7 +3330,7 @@
         </w:tc>
         <w:tc>
           <w:tcPr>
-            <w:tcW w:w="5432" w:type="dxa"/>
+            <w:tcW w:w="5433" w:type="dxa"/>
             <w:tcBorders>
               <w:top w:val="nil"/>
               <w:bottom w:val="nil"/>
@@ -3211,7 +3340,8 @@
           <w:p>
             <w:pPr>
               <w:pStyle w:val="Normal"/>
-              <w:widowControl/>
+              <w:widowControl w:val="false"/>
+              <w:suppressAutoHyphens w:val="true"/>
               <w:spacing w:lineRule="auto" w:line="240" w:before="60" w:after="60"/>
               <w:cnfStyle w:val="000000010000" w:firstRow="0" w:lastRow="0" w:firstColumn="0" w:lastColumn="0" w:oddVBand="0" w:evenVBand="0" w:oddHBand="0" w:evenHBand="1" w:firstRowFirstColumn="0" w:firstRowLastColumn="0" w:lastRowFirstColumn="0" w:lastRowLastColumn="0"/>
               <w:rPr>
@@ -3235,7 +3365,7 @@
         <w:trPr/>
         <w:tc>
           <w:tcPr>
-            <w:tcW w:w="2018" w:type="dxa"/>
+            <w:tcW w:w="2017" w:type="dxa"/>
             <w:cnfStyle w:val="001000000000" w:firstRow="0" w:lastRow="0" w:firstColumn="1" w:lastColumn="0" w:oddVBand="0" w:evenVBand="0" w:oddHBand="0" w:evenHBand="0" w:firstRowFirstColumn="0" w:firstRowLastColumn="0" w:lastRowFirstColumn="0" w:lastRowLastColumn="0"/>
             <w:tcBorders>
               <w:top w:val="nil"/>
@@ -3245,7 +3375,8 @@
           <w:p>
             <w:pPr>
               <w:pStyle w:val="Normal"/>
-              <w:widowControl/>
+              <w:widowControl w:val="false"/>
+              <w:suppressAutoHyphens w:val="true"/>
               <w:spacing w:lineRule="auto" w:line="240" w:before="60" w:after="60"/>
               <w:rPr>
                 <w:rFonts w:eastAsia="" w:cs=""/>
@@ -3274,7 +3405,8 @@
           <w:p>
             <w:pPr>
               <w:pStyle w:val="Normal"/>
-              <w:widowControl/>
+              <w:widowControl w:val="false"/>
+              <w:suppressAutoHyphens w:val="true"/>
               <w:spacing w:lineRule="auto" w:line="240" w:before="60" w:after="60"/>
               <w:cnfStyle w:val="000000000000" w:firstRow="0" w:lastRow="0" w:firstColumn="0" w:lastColumn="0" w:oddVBand="0" w:evenVBand="0" w:oddHBand="0" w:evenHBand="0" w:firstRowFirstColumn="0" w:firstRowLastColumn="0" w:lastRowFirstColumn="0" w:lastRowLastColumn="0"/>
               <w:rPr>
@@ -3284,26 +3416,24 @@
             </w:pPr>
             <w:r>
               <w:rPr>
-                <w:rFonts w:eastAsia="" w:cs=""/>
-                <w:i/>
-                <w:kern w:val="0"/>
-                <w:lang w:eastAsia="ja-JP" w:bidi="ar-SA"/>
-              </w:rPr>
-            </w:r>
-          </w:p>
-        </w:tc>
-        <w:tc>
-          <w:tcPr>
-            <w:tcW w:w="5432" w:type="dxa"/>
-            <w:tcBorders>
-              <w:top w:val="nil"/>
-              <w:bottom w:val="nil"/>
-            </w:tcBorders>
-          </w:tcPr>
-          <w:p>
-            <w:pPr>
-              <w:pStyle w:val="Normal"/>
-              <w:widowControl/>
+                <w:i/>
+              </w:rPr>
+            </w:r>
+          </w:p>
+        </w:tc>
+        <w:tc>
+          <w:tcPr>
+            <w:tcW w:w="5433" w:type="dxa"/>
+            <w:tcBorders>
+              <w:top w:val="nil"/>
+              <w:bottom w:val="nil"/>
+            </w:tcBorders>
+          </w:tcPr>
+          <w:p>
+            <w:pPr>
+              <w:pStyle w:val="Normal"/>
+              <w:widowControl w:val="false"/>
+              <w:suppressAutoHyphens w:val="true"/>
               <w:spacing w:lineRule="auto" w:line="240" w:before="60" w:after="60"/>
               <w:cnfStyle w:val="000000000000" w:firstRow="0" w:lastRow="0" w:firstColumn="0" w:lastColumn="0" w:oddVBand="0" w:evenVBand="0" w:oddHBand="0" w:evenHBand="0" w:firstRowFirstColumn="0" w:firstRowLastColumn="0" w:lastRowFirstColumn="0" w:lastRowLastColumn="0"/>
               <w:rPr>
@@ -3329,7 +3459,7 @@
         </w:trPr>
         <w:tc>
           <w:tcPr>
-            <w:tcW w:w="2018" w:type="dxa"/>
+            <w:tcW w:w="2017" w:type="dxa"/>
             <w:cnfStyle w:val="001000000000" w:firstRow="0" w:lastRow="0" w:firstColumn="1" w:lastColumn="0" w:oddVBand="0" w:evenVBand="0" w:oddHBand="0" w:evenHBand="0" w:firstRowFirstColumn="0" w:firstRowLastColumn="0" w:lastRowFirstColumn="0" w:lastRowLastColumn="0"/>
             <w:tcBorders>
               <w:top w:val="nil"/>
@@ -3340,7 +3470,8 @@
           <w:p>
             <w:pPr>
               <w:pStyle w:val="Normal"/>
-              <w:widowControl/>
+              <w:widowControl w:val="false"/>
+              <w:suppressAutoHyphens w:val="true"/>
               <w:spacing w:lineRule="auto" w:line="240" w:before="60" w:after="60"/>
               <w:rPr>
                 <w:rFonts w:eastAsia="" w:cs=""/>
@@ -3370,7 +3501,8 @@
           <w:p>
             <w:pPr>
               <w:pStyle w:val="Normal"/>
-              <w:widowControl/>
+              <w:widowControl w:val="false"/>
+              <w:suppressAutoHyphens w:val="true"/>
               <w:spacing w:lineRule="auto" w:line="240" w:before="60" w:after="60"/>
               <w:cnfStyle w:val="000000010000" w:firstRow="0" w:lastRow="0" w:firstColumn="0" w:lastColumn="0" w:oddVBand="0" w:evenVBand="0" w:oddHBand="0" w:evenHBand="1" w:firstRowFirstColumn="0" w:firstRowLastColumn="0" w:lastRowFirstColumn="0" w:lastRowLastColumn="0"/>
               <w:rPr>
@@ -3391,7 +3523,7 @@
         </w:tc>
         <w:tc>
           <w:tcPr>
-            <w:tcW w:w="5432" w:type="dxa"/>
+            <w:tcW w:w="5433" w:type="dxa"/>
             <w:tcBorders>
               <w:top w:val="nil"/>
               <w:bottom w:val="nil"/>
@@ -3401,7 +3533,8 @@
           <w:p>
             <w:pPr>
               <w:pStyle w:val="Normal"/>
-              <w:widowControl/>
+              <w:widowControl w:val="false"/>
+              <w:suppressAutoHyphens w:val="true"/>
               <w:spacing w:lineRule="auto" w:line="240" w:before="60" w:after="60"/>
               <w:cnfStyle w:val="000000010000" w:firstRow="0" w:lastRow="0" w:firstColumn="0" w:lastColumn="0" w:oddVBand="0" w:evenVBand="0" w:oddHBand="0" w:evenHBand="1" w:firstRowFirstColumn="0" w:firstRowLastColumn="0" w:lastRowFirstColumn="0" w:lastRowLastColumn="0"/>
               <w:rPr>
@@ -3425,7 +3558,7 @@
         <w:trPr/>
         <w:tc>
           <w:tcPr>
-            <w:tcW w:w="2018" w:type="dxa"/>
+            <w:tcW w:w="2017" w:type="dxa"/>
             <w:cnfStyle w:val="001000000000" w:firstRow="0" w:lastRow="0" w:firstColumn="1" w:lastColumn="0" w:oddVBand="0" w:evenVBand="0" w:oddHBand="0" w:evenHBand="0" w:firstRowFirstColumn="0" w:firstRowLastColumn="0" w:lastRowFirstColumn="0" w:lastRowLastColumn="0"/>
             <w:tcBorders>
               <w:top w:val="nil"/>
@@ -3435,7 +3568,8 @@
           <w:p>
             <w:pPr>
               <w:pStyle w:val="Normal"/>
-              <w:widowControl/>
+              <w:widowControl w:val="false"/>
+              <w:suppressAutoHyphens w:val="true"/>
               <w:spacing w:lineRule="auto" w:line="240" w:before="60" w:after="60"/>
               <w:rPr>
                 <w:rFonts w:eastAsia="" w:cs=""/>
@@ -3464,7 +3598,8 @@
           <w:p>
             <w:pPr>
               <w:pStyle w:val="Normal"/>
-              <w:widowControl/>
+              <w:widowControl w:val="false"/>
+              <w:suppressAutoHyphens w:val="true"/>
               <w:spacing w:lineRule="auto" w:line="240" w:before="60" w:after="60"/>
               <w:cnfStyle w:val="000000000000" w:firstRow="0" w:lastRow="0" w:firstColumn="0" w:lastColumn="0" w:oddVBand="0" w:evenVBand="0" w:oddHBand="0" w:evenHBand="0" w:firstRowFirstColumn="0" w:firstRowLastColumn="0" w:lastRowFirstColumn="0" w:lastRowLastColumn="0"/>
               <w:rPr>
@@ -3474,26 +3609,24 @@
             </w:pPr>
             <w:r>
               <w:rPr>
-                <w:rFonts w:eastAsia="" w:cs=""/>
-                <w:i/>
-                <w:kern w:val="0"/>
-                <w:lang w:eastAsia="ja-JP" w:bidi="ar-SA"/>
-              </w:rPr>
-            </w:r>
-          </w:p>
-        </w:tc>
-        <w:tc>
-          <w:tcPr>
-            <w:tcW w:w="5432" w:type="dxa"/>
-            <w:tcBorders>
-              <w:top w:val="nil"/>
-              <w:bottom w:val="nil"/>
-            </w:tcBorders>
-          </w:tcPr>
-          <w:p>
-            <w:pPr>
-              <w:pStyle w:val="Normal"/>
-              <w:widowControl/>
+                <w:i/>
+              </w:rPr>
+            </w:r>
+          </w:p>
+        </w:tc>
+        <w:tc>
+          <w:tcPr>
+            <w:tcW w:w="5433" w:type="dxa"/>
+            <w:tcBorders>
+              <w:top w:val="nil"/>
+              <w:bottom w:val="nil"/>
+            </w:tcBorders>
+          </w:tcPr>
+          <w:p>
+            <w:pPr>
+              <w:pStyle w:val="Normal"/>
+              <w:widowControl w:val="false"/>
+              <w:suppressAutoHyphens w:val="true"/>
               <w:spacing w:lineRule="auto" w:line="240" w:before="60" w:after="60"/>
               <w:cnfStyle w:val="000000000000" w:firstRow="0" w:lastRow="0" w:firstColumn="0" w:lastColumn="0" w:oddVBand="0" w:evenVBand="0" w:oddHBand="0" w:evenHBand="0" w:firstRowFirstColumn="0" w:firstRowLastColumn="0" w:lastRowFirstColumn="0" w:lastRowLastColumn="0"/>
               <w:rPr>
@@ -3519,7 +3652,7 @@
         </w:trPr>
         <w:tc>
           <w:tcPr>
-            <w:tcW w:w="2018" w:type="dxa"/>
+            <w:tcW w:w="2017" w:type="dxa"/>
             <w:cnfStyle w:val="001000000000" w:firstRow="0" w:lastRow="0" w:firstColumn="1" w:lastColumn="0" w:oddVBand="0" w:evenVBand="0" w:oddHBand="0" w:evenHBand="0" w:firstRowFirstColumn="0" w:firstRowLastColumn="0" w:lastRowFirstColumn="0" w:lastRowLastColumn="0"/>
             <w:tcBorders>
               <w:top w:val="nil"/>
@@ -3530,7 +3663,8 @@
           <w:p>
             <w:pPr>
               <w:pStyle w:val="Normal"/>
-              <w:widowControl/>
+              <w:widowControl w:val="false"/>
+              <w:suppressAutoHyphens w:val="true"/>
               <w:spacing w:lineRule="auto" w:line="240" w:before="60" w:after="60"/>
               <w:rPr>
                 <w:rFonts w:eastAsia="" w:cs=""/>
@@ -3560,7 +3694,8 @@
           <w:p>
             <w:pPr>
               <w:pStyle w:val="Normal"/>
-              <w:widowControl/>
+              <w:widowControl w:val="false"/>
+              <w:suppressAutoHyphens w:val="true"/>
               <w:spacing w:lineRule="auto" w:line="240" w:before="60" w:after="60"/>
               <w:cnfStyle w:val="000000010000" w:firstRow="0" w:lastRow="0" w:firstColumn="0" w:lastColumn="0" w:oddVBand="0" w:evenVBand="0" w:oddHBand="0" w:evenHBand="1" w:firstRowFirstColumn="0" w:firstRowLastColumn="0" w:lastRowFirstColumn="0" w:lastRowLastColumn="0"/>
               <w:rPr>
@@ -3570,17 +3705,14 @@
             </w:pPr>
             <w:r>
               <w:rPr>
-                <w:rFonts w:eastAsia="" w:cs=""/>
-                <w:i/>
-                <w:kern w:val="0"/>
-                <w:lang w:eastAsia="ja-JP" w:bidi="ar-SA"/>
-              </w:rPr>
-            </w:r>
-          </w:p>
-        </w:tc>
-        <w:tc>
-          <w:tcPr>
-            <w:tcW w:w="5432" w:type="dxa"/>
+                <w:i/>
+              </w:rPr>
+            </w:r>
+          </w:p>
+        </w:tc>
+        <w:tc>
+          <w:tcPr>
+            <w:tcW w:w="5433" w:type="dxa"/>
             <w:tcBorders>
               <w:top w:val="nil"/>
               <w:bottom w:val="nil"/>
@@ -3590,7 +3722,8 @@
           <w:p>
             <w:pPr>
               <w:pStyle w:val="Normal"/>
-              <w:widowControl/>
+              <w:widowControl w:val="false"/>
+              <w:suppressAutoHyphens w:val="true"/>
               <w:spacing w:lineRule="auto" w:line="240" w:before="60" w:after="60"/>
               <w:cnfStyle w:val="000000010000" w:firstRow="0" w:lastRow="0" w:firstColumn="0" w:lastColumn="0" w:oddVBand="0" w:evenVBand="0" w:oddHBand="0" w:evenHBand="1" w:firstRowFirstColumn="0" w:firstRowLastColumn="0" w:lastRowFirstColumn="0" w:lastRowLastColumn="0"/>
               <w:rPr>
@@ -3614,7 +3747,7 @@
         <w:trPr/>
         <w:tc>
           <w:tcPr>
-            <w:tcW w:w="2018" w:type="dxa"/>
+            <w:tcW w:w="2017" w:type="dxa"/>
             <w:cnfStyle w:val="001000000000" w:firstRow="0" w:lastRow="0" w:firstColumn="1" w:lastColumn="0" w:oddVBand="0" w:evenVBand="0" w:oddHBand="0" w:evenHBand="0" w:firstRowFirstColumn="0" w:firstRowLastColumn="0" w:lastRowFirstColumn="0" w:lastRowLastColumn="0"/>
             <w:tcBorders>
               <w:top w:val="nil"/>
@@ -3624,7 +3757,8 @@
           <w:p>
             <w:pPr>
               <w:pStyle w:val="Normal"/>
-              <w:widowControl/>
+              <w:widowControl w:val="false"/>
+              <w:suppressAutoHyphens w:val="true"/>
               <w:spacing w:lineRule="auto" w:line="240" w:before="60" w:after="60"/>
               <w:rPr>
                 <w:rFonts w:eastAsia="" w:cs=""/>
@@ -3653,7 +3787,8 @@
           <w:p>
             <w:pPr>
               <w:pStyle w:val="Normal"/>
-              <w:widowControl/>
+              <w:widowControl w:val="false"/>
+              <w:suppressAutoHyphens w:val="true"/>
               <w:spacing w:lineRule="auto" w:line="240" w:before="60" w:after="60"/>
               <w:cnfStyle w:val="000000000000" w:firstRow="0" w:lastRow="0" w:firstColumn="0" w:lastColumn="0" w:oddVBand="0" w:evenVBand="0" w:oddHBand="0" w:evenHBand="0" w:firstRowFirstColumn="0" w:firstRowLastColumn="0" w:lastRowFirstColumn="0" w:lastRowLastColumn="0"/>
               <w:rPr>
@@ -3674,16 +3809,17 @@
         </w:tc>
         <w:tc>
           <w:tcPr>
-            <w:tcW w:w="5432" w:type="dxa"/>
-            <w:tcBorders>
-              <w:top w:val="nil"/>
-              <w:bottom w:val="nil"/>
-            </w:tcBorders>
-          </w:tcPr>
-          <w:p>
-            <w:pPr>
-              <w:pStyle w:val="Normal"/>
-              <w:widowControl/>
+            <w:tcW w:w="5433" w:type="dxa"/>
+            <w:tcBorders>
+              <w:top w:val="nil"/>
+              <w:bottom w:val="nil"/>
+            </w:tcBorders>
+          </w:tcPr>
+          <w:p>
+            <w:pPr>
+              <w:pStyle w:val="Normal"/>
+              <w:widowControl w:val="false"/>
+              <w:suppressAutoHyphens w:val="true"/>
               <w:spacing w:lineRule="auto" w:line="240" w:before="60" w:after="60"/>
               <w:cnfStyle w:val="000000000000" w:firstRow="0" w:lastRow="0" w:firstColumn="0" w:lastColumn="0" w:oddVBand="0" w:evenVBand="0" w:oddHBand="0" w:evenHBand="0" w:firstRowFirstColumn="0" w:firstRowLastColumn="0" w:lastRowFirstColumn="0" w:lastRowLastColumn="0"/>
               <w:rPr>
@@ -3709,7 +3845,7 @@
         </w:trPr>
         <w:tc>
           <w:tcPr>
-            <w:tcW w:w="2018" w:type="dxa"/>
+            <w:tcW w:w="2017" w:type="dxa"/>
             <w:cnfStyle w:val="001000000000" w:firstRow="0" w:lastRow="0" w:firstColumn="1" w:lastColumn="0" w:oddVBand="0" w:evenVBand="0" w:oddHBand="0" w:evenHBand="0" w:firstRowFirstColumn="0" w:firstRowLastColumn="0" w:lastRowFirstColumn="0" w:lastRowLastColumn="0"/>
             <w:tcBorders>
               <w:top w:val="nil"/>
@@ -3720,7 +3856,8 @@
           <w:p>
             <w:pPr>
               <w:pStyle w:val="Normal"/>
-              <w:widowControl/>
+              <w:widowControl w:val="false"/>
+              <w:suppressAutoHyphens w:val="true"/>
               <w:spacing w:lineRule="auto" w:line="240" w:before="60" w:after="60"/>
               <w:rPr>
                 <w:rFonts w:eastAsia="" w:cs=""/>
@@ -3750,7 +3887,8 @@
           <w:p>
             <w:pPr>
               <w:pStyle w:val="Normal"/>
-              <w:widowControl/>
+              <w:widowControl w:val="false"/>
+              <w:suppressAutoHyphens w:val="true"/>
               <w:spacing w:lineRule="auto" w:line="240" w:before="60" w:after="60"/>
               <w:cnfStyle w:val="000000010000" w:firstRow="0" w:lastRow="0" w:firstColumn="0" w:lastColumn="0" w:oddVBand="0" w:evenVBand="0" w:oddHBand="0" w:evenHBand="1" w:firstRowFirstColumn="0" w:firstRowLastColumn="0" w:lastRowFirstColumn="0" w:lastRowLastColumn="0"/>
               <w:rPr>
@@ -3771,7 +3909,7 @@
         </w:tc>
         <w:tc>
           <w:tcPr>
-            <w:tcW w:w="5432" w:type="dxa"/>
+            <w:tcW w:w="5433" w:type="dxa"/>
             <w:tcBorders>
               <w:top w:val="nil"/>
               <w:bottom w:val="nil"/>
@@ -3781,7 +3919,8 @@
           <w:p>
             <w:pPr>
               <w:pStyle w:val="Normal"/>
-              <w:widowControl/>
+              <w:widowControl w:val="false"/>
+              <w:suppressAutoHyphens w:val="true"/>
               <w:spacing w:lineRule="auto" w:line="240" w:before="60" w:after="60"/>
               <w:cnfStyle w:val="000000010000" w:firstRow="0" w:lastRow="0" w:firstColumn="0" w:lastColumn="0" w:oddVBand="0" w:evenVBand="0" w:oddHBand="0" w:evenHBand="1" w:firstRowFirstColumn="0" w:firstRowLastColumn="0" w:lastRowFirstColumn="0" w:lastRowLastColumn="0"/>
               <w:rPr>
@@ -3805,7 +3944,7 @@
         <w:trPr/>
         <w:tc>
           <w:tcPr>
-            <w:tcW w:w="2018" w:type="dxa"/>
+            <w:tcW w:w="2017" w:type="dxa"/>
             <w:cnfStyle w:val="001000000000" w:firstRow="0" w:lastRow="0" w:firstColumn="1" w:lastColumn="0" w:oddVBand="0" w:evenVBand="0" w:oddHBand="0" w:evenHBand="0" w:firstRowFirstColumn="0" w:firstRowLastColumn="0" w:lastRowFirstColumn="0" w:lastRowLastColumn="0"/>
             <w:tcBorders>
               <w:top w:val="nil"/>
@@ -3815,7 +3954,8 @@
           <w:p>
             <w:pPr>
               <w:pStyle w:val="Normal"/>
-              <w:widowControl/>
+              <w:widowControl w:val="false"/>
+              <w:suppressAutoHyphens w:val="true"/>
               <w:spacing w:lineRule="auto" w:line="240" w:before="60" w:after="60"/>
               <w:rPr>
                 <w:rFonts w:eastAsia="" w:cs=""/>
@@ -3844,7 +3984,8 @@
           <w:p>
             <w:pPr>
               <w:pStyle w:val="Normal"/>
-              <w:widowControl/>
+              <w:widowControl w:val="false"/>
+              <w:suppressAutoHyphens w:val="true"/>
               <w:spacing w:lineRule="auto" w:line="240" w:before="60" w:after="60"/>
               <w:cnfStyle w:val="000000000000" w:firstRow="0" w:lastRow="0" w:firstColumn="0" w:lastColumn="0" w:oddVBand="0" w:evenVBand="0" w:oddHBand="0" w:evenHBand="0" w:firstRowFirstColumn="0" w:firstRowLastColumn="0" w:lastRowFirstColumn="0" w:lastRowLastColumn="0"/>
               <w:rPr>
@@ -3865,16 +4006,17 @@
         </w:tc>
         <w:tc>
           <w:tcPr>
-            <w:tcW w:w="5432" w:type="dxa"/>
-            <w:tcBorders>
-              <w:top w:val="nil"/>
-              <w:bottom w:val="nil"/>
-            </w:tcBorders>
-          </w:tcPr>
-          <w:p>
-            <w:pPr>
-              <w:pStyle w:val="Normal"/>
-              <w:widowControl/>
+            <w:tcW w:w="5433" w:type="dxa"/>
+            <w:tcBorders>
+              <w:top w:val="nil"/>
+              <w:bottom w:val="nil"/>
+            </w:tcBorders>
+          </w:tcPr>
+          <w:p>
+            <w:pPr>
+              <w:pStyle w:val="Normal"/>
+              <w:widowControl w:val="false"/>
+              <w:suppressAutoHyphens w:val="true"/>
               <w:spacing w:lineRule="auto" w:line="240" w:before="60" w:after="60"/>
               <w:cnfStyle w:val="000000000000" w:firstRow="0" w:lastRow="0" w:firstColumn="0" w:lastColumn="0" w:oddVBand="0" w:evenVBand="0" w:oddHBand="0" w:evenHBand="0" w:firstRowFirstColumn="0" w:firstRowLastColumn="0" w:lastRowFirstColumn="0" w:lastRowLastColumn="0"/>
               <w:rPr>
@@ -3900,7 +4042,7 @@
         </w:trPr>
         <w:tc>
           <w:tcPr>
-            <w:tcW w:w="2018" w:type="dxa"/>
+            <w:tcW w:w="2017" w:type="dxa"/>
             <w:cnfStyle w:val="001000000000" w:firstRow="0" w:lastRow="0" w:firstColumn="1" w:lastColumn="0" w:oddVBand="0" w:evenVBand="0" w:oddHBand="0" w:evenHBand="0" w:firstRowFirstColumn="0" w:firstRowLastColumn="0" w:lastRowFirstColumn="0" w:lastRowLastColumn="0"/>
             <w:tcBorders>
               <w:top w:val="nil"/>
@@ -3911,7 +4053,8 @@
           <w:p>
             <w:pPr>
               <w:pStyle w:val="Normal"/>
-              <w:widowControl/>
+              <w:widowControl w:val="false"/>
+              <w:suppressAutoHyphens w:val="true"/>
               <w:spacing w:lineRule="auto" w:line="240" w:before="60" w:after="60"/>
               <w:rPr>
                 <w:rFonts w:eastAsia="" w:cs=""/>
@@ -3941,7 +4084,8 @@
           <w:p>
             <w:pPr>
               <w:pStyle w:val="Normal"/>
-              <w:widowControl/>
+              <w:widowControl w:val="false"/>
+              <w:suppressAutoHyphens w:val="true"/>
               <w:spacing w:lineRule="auto" w:line="240" w:before="60" w:after="60"/>
               <w:cnfStyle w:val="000000010000" w:firstRow="0" w:lastRow="0" w:firstColumn="0" w:lastColumn="0" w:oddVBand="0" w:evenVBand="0" w:oddHBand="0" w:evenHBand="1" w:firstRowFirstColumn="0" w:firstRowLastColumn="0" w:lastRowFirstColumn="0" w:lastRowLastColumn="0"/>
               <w:rPr>
@@ -3962,7 +4106,7 @@
         </w:tc>
         <w:tc>
           <w:tcPr>
-            <w:tcW w:w="5432" w:type="dxa"/>
+            <w:tcW w:w="5433" w:type="dxa"/>
             <w:tcBorders>
               <w:top w:val="nil"/>
               <w:bottom w:val="nil"/>
@@ -3972,7 +4116,8 @@
           <w:p>
             <w:pPr>
               <w:pStyle w:val="Normal"/>
-              <w:widowControl/>
+              <w:widowControl w:val="false"/>
+              <w:suppressAutoHyphens w:val="true"/>
               <w:spacing w:lineRule="auto" w:line="240" w:before="60" w:after="60"/>
               <w:cnfStyle w:val="000000010000" w:firstRow="0" w:lastRow="0" w:firstColumn="0" w:lastColumn="0" w:oddVBand="0" w:evenVBand="0" w:oddHBand="0" w:evenHBand="1" w:firstRowFirstColumn="0" w:firstRowLastColumn="0" w:lastRowFirstColumn="0" w:lastRowLastColumn="0"/>
               <w:rPr>
@@ -3996,7 +4141,7 @@
         <w:trPr/>
         <w:tc>
           <w:tcPr>
-            <w:tcW w:w="2018" w:type="dxa"/>
+            <w:tcW w:w="2017" w:type="dxa"/>
             <w:cnfStyle w:val="001000000000" w:firstRow="0" w:lastRow="0" w:firstColumn="1" w:lastColumn="0" w:oddVBand="0" w:evenVBand="0" w:oddHBand="0" w:evenHBand="0" w:firstRowFirstColumn="0" w:firstRowLastColumn="0" w:lastRowFirstColumn="0" w:lastRowLastColumn="0"/>
             <w:tcBorders>
               <w:top w:val="nil"/>
@@ -4006,7 +4151,8 @@
           <w:p>
             <w:pPr>
               <w:pStyle w:val="Normal"/>
-              <w:widowControl/>
+              <w:widowControl w:val="false"/>
+              <w:suppressAutoHyphens w:val="true"/>
               <w:spacing w:lineRule="auto" w:line="240" w:before="60" w:after="60"/>
               <w:rPr>
                 <w:rFonts w:eastAsia="" w:cs=""/>
@@ -4035,7 +4181,8 @@
           <w:p>
             <w:pPr>
               <w:pStyle w:val="Normal"/>
-              <w:widowControl/>
+              <w:widowControl w:val="false"/>
+              <w:suppressAutoHyphens w:val="true"/>
               <w:spacing w:lineRule="auto" w:line="240" w:before="60" w:after="60"/>
               <w:cnfStyle w:val="000000000000" w:firstRow="0" w:lastRow="0" w:firstColumn="0" w:lastColumn="0" w:oddVBand="0" w:evenVBand="0" w:oddHBand="0" w:evenHBand="0" w:firstRowFirstColumn="0" w:firstRowLastColumn="0" w:lastRowFirstColumn="0" w:lastRowLastColumn="0"/>
               <w:rPr>
@@ -4056,16 +4203,17 @@
         </w:tc>
         <w:tc>
           <w:tcPr>
-            <w:tcW w:w="5432" w:type="dxa"/>
-            <w:tcBorders>
-              <w:top w:val="nil"/>
-              <w:bottom w:val="nil"/>
-            </w:tcBorders>
-          </w:tcPr>
-          <w:p>
-            <w:pPr>
-              <w:pStyle w:val="Normal"/>
-              <w:widowControl/>
+            <w:tcW w:w="5433" w:type="dxa"/>
+            <w:tcBorders>
+              <w:top w:val="nil"/>
+              <w:bottom w:val="nil"/>
+            </w:tcBorders>
+          </w:tcPr>
+          <w:p>
+            <w:pPr>
+              <w:pStyle w:val="Normal"/>
+              <w:widowControl w:val="false"/>
+              <w:suppressAutoHyphens w:val="true"/>
               <w:spacing w:lineRule="auto" w:line="240" w:before="60" w:after="60"/>
               <w:cnfStyle w:val="000000000000" w:firstRow="0" w:lastRow="0" w:firstColumn="0" w:lastColumn="0" w:oddVBand="0" w:evenVBand="0" w:oddHBand="0" w:evenHBand="0" w:firstRowFirstColumn="0" w:firstRowLastColumn="0" w:lastRowFirstColumn="0" w:lastRowLastColumn="0"/>
               <w:rPr>
@@ -4091,7 +4239,7 @@
         </w:trPr>
         <w:tc>
           <w:tcPr>
-            <w:tcW w:w="2018" w:type="dxa"/>
+            <w:tcW w:w="2017" w:type="dxa"/>
             <w:cnfStyle w:val="001000000000" w:firstRow="0" w:lastRow="0" w:firstColumn="1" w:lastColumn="0" w:oddVBand="0" w:evenVBand="0" w:oddHBand="0" w:evenHBand="0" w:firstRowFirstColumn="0" w:firstRowLastColumn="0" w:lastRowFirstColumn="0" w:lastRowLastColumn="0"/>
             <w:tcBorders>
               <w:top w:val="nil"/>
@@ -4102,7 +4250,8 @@
           <w:p>
             <w:pPr>
               <w:pStyle w:val="Normal"/>
-              <w:widowControl/>
+              <w:widowControl w:val="false"/>
+              <w:suppressAutoHyphens w:val="true"/>
               <w:spacing w:lineRule="auto" w:line="240" w:before="60" w:after="60"/>
               <w:rPr>
                 <w:rFonts w:eastAsia="" w:cs=""/>
@@ -4132,7 +4281,8 @@
           <w:p>
             <w:pPr>
               <w:pStyle w:val="Normal"/>
-              <w:widowControl/>
+              <w:widowControl w:val="false"/>
+              <w:suppressAutoHyphens w:val="true"/>
               <w:spacing w:lineRule="auto" w:line="240" w:before="60" w:after="60"/>
               <w:cnfStyle w:val="000000010000" w:firstRow="0" w:lastRow="0" w:firstColumn="0" w:lastColumn="0" w:oddVBand="0" w:evenVBand="0" w:oddHBand="0" w:evenHBand="1" w:firstRowFirstColumn="0" w:firstRowLastColumn="0" w:lastRowFirstColumn="0" w:lastRowLastColumn="0"/>
               <w:rPr>
@@ -4153,7 +4303,7 @@
         </w:tc>
         <w:tc>
           <w:tcPr>
-            <w:tcW w:w="5432" w:type="dxa"/>
+            <w:tcW w:w="5433" w:type="dxa"/>
             <w:tcBorders>
               <w:top w:val="nil"/>
               <w:bottom w:val="nil"/>
@@ -4163,7 +4313,8 @@
           <w:p>
             <w:pPr>
               <w:pStyle w:val="Normal"/>
-              <w:widowControl/>
+              <w:widowControl w:val="false"/>
+              <w:suppressAutoHyphens w:val="true"/>
               <w:spacing w:lineRule="auto" w:line="240" w:before="60" w:after="60"/>
               <w:cnfStyle w:val="000000010000" w:firstRow="0" w:lastRow="0" w:firstColumn="0" w:lastColumn="0" w:oddVBand="0" w:evenVBand="0" w:oddHBand="0" w:evenHBand="1" w:firstRowFirstColumn="0" w:firstRowLastColumn="0" w:lastRowFirstColumn="0" w:lastRowLastColumn="0"/>
               <w:rPr>
@@ -4187,7 +4338,7 @@
         <w:trPr/>
         <w:tc>
           <w:tcPr>
-            <w:tcW w:w="2018" w:type="dxa"/>
+            <w:tcW w:w="2017" w:type="dxa"/>
             <w:cnfStyle w:val="001000000000" w:firstRow="0" w:lastRow="0" w:firstColumn="1" w:lastColumn="0" w:oddVBand="0" w:evenVBand="0" w:oddHBand="0" w:evenHBand="0" w:firstRowFirstColumn="0" w:firstRowLastColumn="0" w:lastRowFirstColumn="0" w:lastRowLastColumn="0"/>
             <w:tcBorders>
               <w:top w:val="nil"/>
@@ -4197,7 +4348,8 @@
           <w:p>
             <w:pPr>
               <w:pStyle w:val="Normal"/>
-              <w:widowControl/>
+              <w:widowControl w:val="false"/>
+              <w:suppressAutoHyphens w:val="true"/>
               <w:spacing w:lineRule="auto" w:line="240" w:before="60" w:after="60"/>
               <w:rPr>
                 <w:rFonts w:eastAsia="" w:cs=""/>
@@ -4226,7 +4378,8 @@
           <w:p>
             <w:pPr>
               <w:pStyle w:val="Normal"/>
-              <w:widowControl/>
+              <w:widowControl w:val="false"/>
+              <w:suppressAutoHyphens w:val="true"/>
               <w:spacing w:lineRule="auto" w:line="240" w:before="60" w:after="60"/>
               <w:cnfStyle w:val="000000000000" w:firstRow="0" w:lastRow="0" w:firstColumn="0" w:lastColumn="0" w:oddVBand="0" w:evenVBand="0" w:oddHBand="0" w:evenHBand="0" w:firstRowFirstColumn="0" w:firstRowLastColumn="0" w:lastRowFirstColumn="0" w:lastRowLastColumn="0"/>
               <w:rPr>
@@ -4247,16 +4400,17 @@
         </w:tc>
         <w:tc>
           <w:tcPr>
-            <w:tcW w:w="5432" w:type="dxa"/>
-            <w:tcBorders>
-              <w:top w:val="nil"/>
-              <w:bottom w:val="nil"/>
-            </w:tcBorders>
-          </w:tcPr>
-          <w:p>
-            <w:pPr>
-              <w:pStyle w:val="Normal"/>
-              <w:widowControl/>
+            <w:tcW w:w="5433" w:type="dxa"/>
+            <w:tcBorders>
+              <w:top w:val="nil"/>
+              <w:bottom w:val="nil"/>
+            </w:tcBorders>
+          </w:tcPr>
+          <w:p>
+            <w:pPr>
+              <w:pStyle w:val="Normal"/>
+              <w:widowControl w:val="false"/>
+              <w:suppressAutoHyphens w:val="true"/>
               <w:spacing w:lineRule="auto" w:line="240" w:before="60" w:after="60"/>
               <w:cnfStyle w:val="000000000000" w:firstRow="0" w:lastRow="0" w:firstColumn="0" w:lastColumn="0" w:oddVBand="0" w:evenVBand="0" w:oddHBand="0" w:evenHBand="0" w:firstRowFirstColumn="0" w:firstRowLastColumn="0" w:lastRowFirstColumn="0" w:lastRowLastColumn="0"/>
               <w:rPr>
@@ -4282,7 +4436,7 @@
         </w:trPr>
         <w:tc>
           <w:tcPr>
-            <w:tcW w:w="2018" w:type="dxa"/>
+            <w:tcW w:w="2017" w:type="dxa"/>
             <w:cnfStyle w:val="001000000000" w:firstRow="0" w:lastRow="0" w:firstColumn="1" w:lastColumn="0" w:oddVBand="0" w:evenVBand="0" w:oddHBand="0" w:evenHBand="0" w:firstRowFirstColumn="0" w:firstRowLastColumn="0" w:lastRowFirstColumn="0" w:lastRowLastColumn="0"/>
             <w:tcBorders>
               <w:top w:val="nil"/>
@@ -4293,7 +4447,8 @@
           <w:p>
             <w:pPr>
               <w:pStyle w:val="Normal"/>
-              <w:widowControl/>
+              <w:widowControl w:val="false"/>
+              <w:suppressAutoHyphens w:val="true"/>
               <w:spacing w:lineRule="auto" w:line="240" w:before="60" w:after="60"/>
               <w:rPr>
                 <w:rFonts w:eastAsia="" w:cs=""/>
@@ -4323,7 +4478,8 @@
           <w:p>
             <w:pPr>
               <w:pStyle w:val="Normal"/>
-              <w:widowControl/>
+              <w:widowControl w:val="false"/>
+              <w:suppressAutoHyphens w:val="true"/>
               <w:spacing w:lineRule="auto" w:line="240" w:before="60" w:after="60"/>
               <w:cnfStyle w:val="000000010000" w:firstRow="0" w:lastRow="0" w:firstColumn="0" w:lastColumn="0" w:oddVBand="0" w:evenVBand="0" w:oddHBand="0" w:evenHBand="1" w:firstRowFirstColumn="0" w:firstRowLastColumn="0" w:lastRowFirstColumn="0" w:lastRowLastColumn="0"/>
               <w:rPr>
@@ -4344,7 +4500,7 @@
         </w:tc>
         <w:tc>
           <w:tcPr>
-            <w:tcW w:w="5432" w:type="dxa"/>
+            <w:tcW w:w="5433" w:type="dxa"/>
             <w:tcBorders>
               <w:top w:val="nil"/>
               <w:bottom w:val="nil"/>
@@ -4354,7 +4510,8 @@
           <w:p>
             <w:pPr>
               <w:pStyle w:val="Normal"/>
-              <w:widowControl/>
+              <w:widowControl w:val="false"/>
+              <w:suppressAutoHyphens w:val="true"/>
               <w:spacing w:lineRule="auto" w:line="240" w:before="60" w:after="60"/>
               <w:cnfStyle w:val="000000010000" w:firstRow="0" w:lastRow="0" w:firstColumn="0" w:lastColumn="0" w:oddVBand="0" w:evenVBand="0" w:oddHBand="0" w:evenHBand="1" w:firstRowFirstColumn="0" w:firstRowLastColumn="0" w:lastRowFirstColumn="0" w:lastRowLastColumn="0"/>
               <w:rPr>
@@ -4378,7 +4535,7 @@
         <w:trPr/>
         <w:tc>
           <w:tcPr>
-            <w:tcW w:w="2018" w:type="dxa"/>
+            <w:tcW w:w="2017" w:type="dxa"/>
             <w:cnfStyle w:val="001000000000" w:firstRow="0" w:lastRow="0" w:firstColumn="1" w:lastColumn="0" w:oddVBand="0" w:evenVBand="0" w:oddHBand="0" w:evenHBand="0" w:firstRowFirstColumn="0" w:firstRowLastColumn="0" w:lastRowFirstColumn="0" w:lastRowLastColumn="0"/>
             <w:tcBorders>
               <w:top w:val="nil"/>
@@ -4388,7 +4545,8 @@
           <w:p>
             <w:pPr>
               <w:pStyle w:val="Normal"/>
-              <w:widowControl/>
+              <w:widowControl w:val="false"/>
+              <w:suppressAutoHyphens w:val="true"/>
               <w:spacing w:lineRule="auto" w:line="240" w:before="60" w:after="60"/>
               <w:rPr>
                 <w:rFonts w:eastAsia="" w:cs=""/>
@@ -4417,7 +4575,8 @@
           <w:p>
             <w:pPr>
               <w:pStyle w:val="Normal"/>
-              <w:widowControl/>
+              <w:widowControl w:val="false"/>
+              <w:suppressAutoHyphens w:val="true"/>
               <w:spacing w:lineRule="auto" w:line="240" w:before="60" w:after="60"/>
               <w:cnfStyle w:val="000000000000" w:firstRow="0" w:lastRow="0" w:firstColumn="0" w:lastColumn="0" w:oddVBand="0" w:evenVBand="0" w:oddHBand="0" w:evenHBand="0" w:firstRowFirstColumn="0" w:firstRowLastColumn="0" w:lastRowFirstColumn="0" w:lastRowLastColumn="0"/>
               <w:rPr>
@@ -4438,16 +4597,17 @@
         </w:tc>
         <w:tc>
           <w:tcPr>
-            <w:tcW w:w="5432" w:type="dxa"/>
-            <w:tcBorders>
-              <w:top w:val="nil"/>
-              <w:bottom w:val="nil"/>
-            </w:tcBorders>
-          </w:tcPr>
-          <w:p>
-            <w:pPr>
-              <w:pStyle w:val="Normal"/>
-              <w:widowControl/>
+            <w:tcW w:w="5433" w:type="dxa"/>
+            <w:tcBorders>
+              <w:top w:val="nil"/>
+              <w:bottom w:val="nil"/>
+            </w:tcBorders>
+          </w:tcPr>
+          <w:p>
+            <w:pPr>
+              <w:pStyle w:val="Normal"/>
+              <w:widowControl w:val="false"/>
+              <w:suppressAutoHyphens w:val="true"/>
               <w:spacing w:lineRule="auto" w:line="240" w:before="60" w:after="60"/>
               <w:cnfStyle w:val="000000000000" w:firstRow="0" w:lastRow="0" w:firstColumn="0" w:lastColumn="0" w:oddVBand="0" w:evenVBand="0" w:oddHBand="0" w:evenHBand="0" w:firstRowFirstColumn="0" w:firstRowLastColumn="0" w:lastRowFirstColumn="0" w:lastRowLastColumn="0"/>
               <w:rPr>
@@ -4473,7 +4633,7 @@
         </w:trPr>
         <w:tc>
           <w:tcPr>
-            <w:tcW w:w="2018" w:type="dxa"/>
+            <w:tcW w:w="2017" w:type="dxa"/>
             <w:cnfStyle w:val="001000000000" w:firstRow="0" w:lastRow="0" w:firstColumn="1" w:lastColumn="0" w:oddVBand="0" w:evenVBand="0" w:oddHBand="0" w:evenHBand="0" w:firstRowFirstColumn="0" w:firstRowLastColumn="0" w:lastRowFirstColumn="0" w:lastRowLastColumn="0"/>
             <w:tcBorders>
               <w:top w:val="nil"/>
@@ -4484,7 +4644,8 @@
           <w:p>
             <w:pPr>
               <w:pStyle w:val="Normal"/>
-              <w:widowControl/>
+              <w:widowControl w:val="false"/>
+              <w:suppressAutoHyphens w:val="true"/>
               <w:spacing w:lineRule="auto" w:line="240" w:before="60" w:after="60"/>
               <w:rPr>
                 <w:rFonts w:eastAsia="" w:cs=""/>
@@ -4514,7 +4675,8 @@
           <w:p>
             <w:pPr>
               <w:pStyle w:val="Normal"/>
-              <w:widowControl/>
+              <w:widowControl w:val="false"/>
+              <w:suppressAutoHyphens w:val="true"/>
               <w:spacing w:lineRule="auto" w:line="240" w:before="60" w:after="60"/>
               <w:cnfStyle w:val="000000010000" w:firstRow="0" w:lastRow="0" w:firstColumn="0" w:lastColumn="0" w:oddVBand="0" w:evenVBand="0" w:oddHBand="0" w:evenHBand="1" w:firstRowFirstColumn="0" w:firstRowLastColumn="0" w:lastRowFirstColumn="0" w:lastRowLastColumn="0"/>
               <w:rPr>
@@ -4535,7 +4697,7 @@
         </w:tc>
         <w:tc>
           <w:tcPr>
-            <w:tcW w:w="5432" w:type="dxa"/>
+            <w:tcW w:w="5433" w:type="dxa"/>
             <w:tcBorders>
               <w:top w:val="nil"/>
               <w:bottom w:val="nil"/>
@@ -4545,7 +4707,8 @@
           <w:p>
             <w:pPr>
               <w:pStyle w:val="Normal"/>
-              <w:widowControl/>
+              <w:widowControl w:val="false"/>
+              <w:suppressAutoHyphens w:val="true"/>
               <w:spacing w:lineRule="auto" w:line="240" w:before="60" w:after="60"/>
               <w:cnfStyle w:val="000000010000" w:firstRow="0" w:lastRow="0" w:firstColumn="0" w:lastColumn="0" w:oddVBand="0" w:evenVBand="0" w:oddHBand="0" w:evenHBand="1" w:firstRowFirstColumn="0" w:firstRowLastColumn="0" w:lastRowFirstColumn="0" w:lastRowLastColumn="0"/>
               <w:rPr>
@@ -4586,7 +4749,7 @@
         <w:trPr/>
         <w:tc>
           <w:tcPr>
-            <w:tcW w:w="2018" w:type="dxa"/>
+            <w:tcW w:w="2017" w:type="dxa"/>
             <w:cnfStyle w:val="001000000000" w:firstRow="0" w:lastRow="0" w:firstColumn="1" w:lastColumn="0" w:oddVBand="0" w:evenVBand="0" w:oddHBand="0" w:evenHBand="0" w:firstRowFirstColumn="0" w:firstRowLastColumn="0" w:lastRowFirstColumn="0" w:lastRowLastColumn="0"/>
             <w:tcBorders>
               <w:top w:val="nil"/>
@@ -4596,7 +4759,8 @@
           <w:p>
             <w:pPr>
               <w:pStyle w:val="Normal"/>
-              <w:widowControl/>
+              <w:widowControl w:val="false"/>
+              <w:suppressAutoHyphens w:val="true"/>
               <w:spacing w:lineRule="auto" w:line="240" w:before="60" w:after="60"/>
               <w:rPr>
                 <w:rFonts w:eastAsia="" w:cs=""/>
@@ -4625,7 +4789,8 @@
           <w:p>
             <w:pPr>
               <w:pStyle w:val="Normal"/>
-              <w:widowControl/>
+              <w:widowControl w:val="false"/>
+              <w:suppressAutoHyphens w:val="true"/>
               <w:spacing w:lineRule="auto" w:line="240" w:before="60" w:after="60"/>
               <w:cnfStyle w:val="000000000000" w:firstRow="0" w:lastRow="0" w:firstColumn="0" w:lastColumn="0" w:oddVBand="0" w:evenVBand="0" w:oddHBand="0" w:evenHBand="0" w:firstRowFirstColumn="0" w:firstRowLastColumn="0" w:lastRowFirstColumn="0" w:lastRowLastColumn="0"/>
               <w:rPr>
@@ -4646,16 +4811,17 @@
         </w:tc>
         <w:tc>
           <w:tcPr>
-            <w:tcW w:w="5432" w:type="dxa"/>
-            <w:tcBorders>
-              <w:top w:val="nil"/>
-              <w:bottom w:val="nil"/>
-            </w:tcBorders>
-          </w:tcPr>
-          <w:p>
-            <w:pPr>
-              <w:pStyle w:val="Normal"/>
-              <w:widowControl/>
+            <w:tcW w:w="5433" w:type="dxa"/>
+            <w:tcBorders>
+              <w:top w:val="nil"/>
+              <w:bottom w:val="nil"/>
+            </w:tcBorders>
+          </w:tcPr>
+          <w:p>
+            <w:pPr>
+              <w:pStyle w:val="Normal"/>
+              <w:widowControl w:val="false"/>
+              <w:suppressAutoHyphens w:val="true"/>
               <w:spacing w:lineRule="auto" w:line="240" w:before="60" w:after="60"/>
               <w:cnfStyle w:val="000000000000" w:firstRow="0" w:lastRow="0" w:firstColumn="0" w:lastColumn="0" w:oddVBand="0" w:evenVBand="0" w:oddHBand="0" w:evenHBand="0" w:firstRowFirstColumn="0" w:firstRowLastColumn="0" w:lastRowFirstColumn="0" w:lastRowLastColumn="0"/>
               <w:rPr>
@@ -4681,7 +4847,7 @@
         </w:trPr>
         <w:tc>
           <w:tcPr>
-            <w:tcW w:w="2018" w:type="dxa"/>
+            <w:tcW w:w="2017" w:type="dxa"/>
             <w:cnfStyle w:val="001000000000" w:firstRow="0" w:lastRow="0" w:firstColumn="1" w:lastColumn="0" w:oddVBand="0" w:evenVBand="0" w:oddHBand="0" w:evenHBand="0" w:firstRowFirstColumn="0" w:firstRowLastColumn="0" w:lastRowFirstColumn="0" w:lastRowLastColumn="0"/>
             <w:tcBorders>
               <w:top w:val="nil"/>
@@ -4692,7 +4858,8 @@
           <w:p>
             <w:pPr>
               <w:pStyle w:val="Normal"/>
-              <w:widowControl/>
+              <w:widowControl w:val="false"/>
+              <w:suppressAutoHyphens w:val="true"/>
               <w:spacing w:lineRule="auto" w:line="240" w:before="60" w:after="60"/>
               <w:rPr>
                 <w:rFonts w:eastAsia="" w:cs=""/>
@@ -4712,7 +4879,8 @@
           <w:p>
             <w:pPr>
               <w:pStyle w:val="Normal"/>
-              <w:widowControl/>
+              <w:widowControl w:val="false"/>
+              <w:suppressAutoHyphens w:val="true"/>
               <w:spacing w:lineRule="auto" w:line="240" w:before="60" w:after="60"/>
               <w:rPr>
                 <w:rFonts w:eastAsia="" w:cs=""/>
@@ -4741,7 +4909,8 @@
           <w:p>
             <w:pPr>
               <w:pStyle w:val="Normal"/>
-              <w:widowControl/>
+              <w:widowControl w:val="false"/>
+              <w:suppressAutoHyphens w:val="true"/>
               <w:spacing w:lineRule="auto" w:line="240" w:before="60" w:after="60"/>
               <w:cnfStyle w:val="000000010000" w:firstRow="0" w:lastRow="0" w:firstColumn="0" w:lastColumn="0" w:oddVBand="0" w:evenVBand="0" w:oddHBand="0" w:evenHBand="1" w:firstRowFirstColumn="0" w:firstRowLastColumn="0" w:lastRowFirstColumn="0" w:lastRowLastColumn="0"/>
               <w:rPr>
@@ -4762,7 +4931,7 @@
         </w:tc>
         <w:tc>
           <w:tcPr>
-            <w:tcW w:w="5432" w:type="dxa"/>
+            <w:tcW w:w="5433" w:type="dxa"/>
             <w:tcBorders>
               <w:top w:val="nil"/>
               <w:bottom w:val="nil"/>
@@ -4772,7 +4941,8 @@
           <w:p>
             <w:pPr>
               <w:pStyle w:val="Normal"/>
-              <w:widowControl/>
+              <w:widowControl w:val="false"/>
+              <w:suppressAutoHyphens w:val="true"/>
               <w:spacing w:lineRule="auto" w:line="240" w:before="60" w:after="60"/>
               <w:cnfStyle w:val="000000010000" w:firstRow="0" w:lastRow="0" w:firstColumn="0" w:lastColumn="0" w:oddVBand="0" w:evenVBand="0" w:oddHBand="0" w:evenHBand="1" w:firstRowFirstColumn="0" w:firstRowLastColumn="0" w:lastRowFirstColumn="0" w:lastRowLastColumn="0"/>
               <w:rPr>
@@ -4796,7 +4966,7 @@
         <w:trPr/>
         <w:tc>
           <w:tcPr>
-            <w:tcW w:w="2018" w:type="dxa"/>
+            <w:tcW w:w="2017" w:type="dxa"/>
             <w:cnfStyle w:val="001000000000" w:firstRow="0" w:lastRow="0" w:firstColumn="1" w:lastColumn="0" w:oddVBand="0" w:evenVBand="0" w:oddHBand="0" w:evenHBand="0" w:firstRowFirstColumn="0" w:firstRowLastColumn="0" w:lastRowFirstColumn="0" w:lastRowLastColumn="0"/>
             <w:tcBorders>
               <w:top w:val="nil"/>
@@ -4806,7 +4976,8 @@
           <w:p>
             <w:pPr>
               <w:pStyle w:val="Normal"/>
-              <w:widowControl/>
+              <w:widowControl w:val="false"/>
+              <w:suppressAutoHyphens w:val="true"/>
               <w:spacing w:lineRule="auto" w:line="240" w:before="60" w:after="60"/>
               <w:rPr>
                 <w:color w:val="auto"/>
@@ -4825,7 +4996,8 @@
           <w:p>
             <w:pPr>
               <w:pStyle w:val="Normal"/>
-              <w:widowControl/>
+              <w:widowControl w:val="false"/>
+              <w:suppressAutoHyphens w:val="true"/>
               <w:spacing w:lineRule="auto" w:line="240" w:before="60" w:after="60"/>
               <w:rPr>
                 <w:color w:val="auto"/>
@@ -4833,10 +5005,7 @@
             </w:pPr>
             <w:r>
               <w:rPr>
-                <w:rFonts w:eastAsia="" w:cs=""/>
                 <w:color w:val="auto"/>
-                <w:kern w:val="0"/>
-                <w:lang w:eastAsia="ja-JP" w:bidi="ar-SA"/>
               </w:rPr>
             </w:r>
           </w:p>
@@ -4852,7 +5021,8 @@
           <w:p>
             <w:pPr>
               <w:pStyle w:val="Normal"/>
-              <w:widowControl/>
+              <w:widowControl w:val="false"/>
+              <w:suppressAutoHyphens w:val="true"/>
               <w:spacing w:lineRule="auto" w:line="240" w:before="60" w:after="60"/>
               <w:cnfStyle w:val="000000000000" w:firstRow="0" w:lastRow="0" w:firstColumn="0" w:lastColumn="0" w:oddVBand="0" w:evenVBand="0" w:oddHBand="0" w:evenHBand="0" w:firstRowFirstColumn="0" w:firstRowLastColumn="0" w:lastRowFirstColumn="0" w:lastRowLastColumn="0"/>
               <w:rPr>
@@ -4875,16 +5045,17 @@
         </w:tc>
         <w:tc>
           <w:tcPr>
-            <w:tcW w:w="5432" w:type="dxa"/>
-            <w:tcBorders>
-              <w:top w:val="nil"/>
-              <w:bottom w:val="nil"/>
-            </w:tcBorders>
-          </w:tcPr>
-          <w:p>
-            <w:pPr>
-              <w:pStyle w:val="Normal"/>
-              <w:widowControl/>
+            <w:tcW w:w="5433" w:type="dxa"/>
+            <w:tcBorders>
+              <w:top w:val="nil"/>
+              <w:bottom w:val="nil"/>
+            </w:tcBorders>
+          </w:tcPr>
+          <w:p>
+            <w:pPr>
+              <w:pStyle w:val="Normal"/>
+              <w:widowControl w:val="false"/>
+              <w:suppressAutoHyphens w:val="true"/>
               <w:spacing w:lineRule="auto" w:line="240" w:before="60" w:after="60"/>
               <w:cnfStyle w:val="000000000000" w:firstRow="0" w:lastRow="0" w:firstColumn="0" w:lastColumn="0" w:oddVBand="0" w:evenVBand="0" w:oddHBand="0" w:evenHBand="0" w:firstRowFirstColumn="0" w:firstRowLastColumn="0" w:lastRowFirstColumn="0" w:lastRowLastColumn="0"/>
               <w:rPr>
@@ -4909,7 +5080,7 @@
         </w:trPr>
         <w:tc>
           <w:tcPr>
-            <w:tcW w:w="2018" w:type="dxa"/>
+            <w:tcW w:w="2017" w:type="dxa"/>
             <w:cnfStyle w:val="001000000000" w:firstRow="0" w:lastRow="0" w:firstColumn="1" w:lastColumn="0" w:oddVBand="0" w:evenVBand="0" w:oddHBand="0" w:evenHBand="0" w:firstRowFirstColumn="0" w:firstRowLastColumn="0" w:lastRowFirstColumn="0" w:lastRowLastColumn="0"/>
             <w:tcBorders>
               <w:top w:val="nil"/>
@@ -4920,7 +5091,8 @@
           <w:p>
             <w:pPr>
               <w:pStyle w:val="Normal"/>
-              <w:widowControl/>
+              <w:widowControl w:val="false"/>
+              <w:suppressAutoHyphens w:val="true"/>
               <w:spacing w:lineRule="auto" w:line="240" w:before="60" w:after="60"/>
               <w:rPr>
                 <w:color w:val="auto"/>
@@ -4949,7 +5121,8 @@
           <w:p>
             <w:pPr>
               <w:pStyle w:val="Normal"/>
-              <w:widowControl/>
+              <w:widowControl w:val="false"/>
+              <w:suppressAutoHyphens w:val="true"/>
               <w:spacing w:lineRule="auto" w:line="240" w:before="60" w:after="60"/>
               <w:cnfStyle w:val="000000010000" w:firstRow="0" w:lastRow="0" w:firstColumn="0" w:lastColumn="0" w:oddVBand="0" w:evenVBand="0" w:oddHBand="0" w:evenHBand="1" w:firstRowFirstColumn="0" w:firstRowLastColumn="0" w:lastRowFirstColumn="0" w:lastRowLastColumn="0"/>
               <w:rPr>
@@ -4972,7 +5145,7 @@
         </w:tc>
         <w:tc>
           <w:tcPr>
-            <w:tcW w:w="5432" w:type="dxa"/>
+            <w:tcW w:w="5433" w:type="dxa"/>
             <w:tcBorders>
               <w:top w:val="nil"/>
               <w:bottom w:val="nil"/>
@@ -4982,7 +5155,8 @@
           <w:p>
             <w:pPr>
               <w:pStyle w:val="Normal"/>
-              <w:widowControl/>
+              <w:widowControl w:val="false"/>
+              <w:suppressAutoHyphens w:val="true"/>
               <w:spacing w:lineRule="auto" w:line="240" w:before="60" w:after="60"/>
               <w:cnfStyle w:val="000000010000" w:firstRow="0" w:lastRow="0" w:firstColumn="0" w:lastColumn="0" w:oddVBand="0" w:evenVBand="0" w:oddHBand="0" w:evenHBand="1" w:firstRowFirstColumn="0" w:firstRowLastColumn="0" w:lastRowFirstColumn="0" w:lastRowLastColumn="0"/>
               <w:rPr>
@@ -5006,7 +5180,7 @@
         <w:trPr/>
         <w:tc>
           <w:tcPr>
-            <w:tcW w:w="2018" w:type="dxa"/>
+            <w:tcW w:w="2017" w:type="dxa"/>
             <w:cnfStyle w:val="001000000000" w:firstRow="0" w:lastRow="0" w:firstColumn="1" w:lastColumn="0" w:oddVBand="0" w:evenVBand="0" w:oddHBand="0" w:evenHBand="0" w:firstRowFirstColumn="0" w:firstRowLastColumn="0" w:lastRowFirstColumn="0" w:lastRowLastColumn="0"/>
             <w:tcBorders>
               <w:top w:val="nil"/>
@@ -5016,7 +5190,8 @@
           <w:p>
             <w:pPr>
               <w:pStyle w:val="Normal"/>
-              <w:widowControl/>
+              <w:widowControl w:val="false"/>
+              <w:suppressAutoHyphens w:val="true"/>
               <w:spacing w:lineRule="auto" w:line="240" w:before="60" w:after="60"/>
               <w:rPr>
                 <w:color w:val="auto"/>
@@ -5044,7 +5219,8 @@
           <w:p>
             <w:pPr>
               <w:pStyle w:val="Normal"/>
-              <w:widowControl/>
+              <w:widowControl w:val="false"/>
+              <w:suppressAutoHyphens w:val="true"/>
               <w:spacing w:lineRule="auto" w:line="240" w:before="60" w:after="60"/>
               <w:cnfStyle w:val="000000000000" w:firstRow="0" w:lastRow="0" w:firstColumn="0" w:lastColumn="0" w:oddVBand="0" w:evenVBand="0" w:oddHBand="0" w:evenHBand="0" w:firstRowFirstColumn="0" w:firstRowLastColumn="0" w:lastRowFirstColumn="0" w:lastRowLastColumn="0"/>
               <w:rPr>
@@ -5067,16 +5243,17 @@
         </w:tc>
         <w:tc>
           <w:tcPr>
-            <w:tcW w:w="5432" w:type="dxa"/>
-            <w:tcBorders>
-              <w:top w:val="nil"/>
-              <w:bottom w:val="nil"/>
-            </w:tcBorders>
-          </w:tcPr>
-          <w:p>
-            <w:pPr>
-              <w:pStyle w:val="Normal"/>
-              <w:widowControl/>
+            <w:tcW w:w="5433" w:type="dxa"/>
+            <w:tcBorders>
+              <w:top w:val="nil"/>
+              <w:bottom w:val="nil"/>
+            </w:tcBorders>
+          </w:tcPr>
+          <w:p>
+            <w:pPr>
+              <w:pStyle w:val="Normal"/>
+              <w:widowControl w:val="false"/>
+              <w:suppressAutoHyphens w:val="true"/>
               <w:spacing w:lineRule="auto" w:line="240" w:before="60" w:after="60"/>
               <w:cnfStyle w:val="000000000000" w:firstRow="0" w:lastRow="0" w:firstColumn="0" w:lastColumn="0" w:oddVBand="0" w:evenVBand="0" w:oddHBand="0" w:evenHBand="0" w:firstRowFirstColumn="0" w:firstRowLastColumn="0" w:lastRowFirstColumn="0" w:lastRowLastColumn="0"/>
               <w:rPr>
@@ -5101,7 +5278,7 @@
         </w:trPr>
         <w:tc>
           <w:tcPr>
-            <w:tcW w:w="2018" w:type="dxa"/>
+            <w:tcW w:w="2017" w:type="dxa"/>
             <w:cnfStyle w:val="001000000000" w:firstRow="0" w:lastRow="0" w:firstColumn="1" w:lastColumn="0" w:oddVBand="0" w:evenVBand="0" w:oddHBand="0" w:evenHBand="0" w:firstRowFirstColumn="0" w:firstRowLastColumn="0" w:lastRowFirstColumn="0" w:lastRowLastColumn="0"/>
             <w:tcBorders>
               <w:top w:val="nil"/>
@@ -5112,7 +5289,8 @@
           <w:p>
             <w:pPr>
               <w:pStyle w:val="Normal"/>
-              <w:widowControl/>
+              <w:widowControl w:val="false"/>
+              <w:suppressAutoHyphens w:val="true"/>
               <w:spacing w:lineRule="auto" w:line="240" w:before="60" w:after="60"/>
               <w:rPr>
                 <w:color w:val="auto"/>
@@ -5141,7 +5319,8 @@
           <w:p>
             <w:pPr>
               <w:pStyle w:val="Normal"/>
-              <w:widowControl/>
+              <w:widowControl w:val="false"/>
+              <w:suppressAutoHyphens w:val="true"/>
               <w:spacing w:lineRule="auto" w:line="240" w:before="60" w:after="60"/>
               <w:cnfStyle w:val="000000010000" w:firstRow="0" w:lastRow="0" w:firstColumn="0" w:lastColumn="0" w:oddVBand="0" w:evenVBand="0" w:oddHBand="0" w:evenHBand="1" w:firstRowFirstColumn="0" w:firstRowLastColumn="0" w:lastRowFirstColumn="0" w:lastRowLastColumn="0"/>
               <w:rPr>
@@ -5164,7 +5343,7 @@
         </w:tc>
         <w:tc>
           <w:tcPr>
-            <w:tcW w:w="5432" w:type="dxa"/>
+            <w:tcW w:w="5433" w:type="dxa"/>
             <w:tcBorders>
               <w:top w:val="nil"/>
               <w:bottom w:val="nil"/>
@@ -5174,7 +5353,8 @@
           <w:p>
             <w:pPr>
               <w:pStyle w:val="Normal"/>
-              <w:widowControl/>
+              <w:widowControl w:val="false"/>
+              <w:suppressAutoHyphens w:val="true"/>
               <w:spacing w:lineRule="auto" w:line="240" w:before="60" w:after="60"/>
               <w:cnfStyle w:val="000000010000" w:firstRow="0" w:lastRow="0" w:firstColumn="0" w:lastColumn="0" w:oddVBand="0" w:evenVBand="0" w:oddHBand="0" w:evenHBand="1" w:firstRowFirstColumn="0" w:firstRowLastColumn="0" w:lastRowFirstColumn="0" w:lastRowLastColumn="0"/>
               <w:rPr>
@@ -5197,7 +5377,7 @@
         <w:trPr/>
         <w:tc>
           <w:tcPr>
-            <w:tcW w:w="2018" w:type="dxa"/>
+            <w:tcW w:w="2017" w:type="dxa"/>
             <w:cnfStyle w:val="001000000000" w:firstRow="0" w:lastRow="0" w:firstColumn="1" w:lastColumn="0" w:oddVBand="0" w:evenVBand="0" w:oddHBand="0" w:evenHBand="0" w:firstRowFirstColumn="0" w:firstRowLastColumn="0" w:lastRowFirstColumn="0" w:lastRowLastColumn="0"/>
             <w:tcBorders>
               <w:top w:val="nil"/>
@@ -5207,7 +5387,8 @@
           <w:p>
             <w:pPr>
               <w:pStyle w:val="Normal"/>
-              <w:widowControl/>
+              <w:widowControl w:val="false"/>
+              <w:suppressAutoHyphens w:val="true"/>
               <w:spacing w:lineRule="auto" w:line="240" w:before="60" w:after="60"/>
               <w:rPr>
                 <w:color w:val="auto"/>
@@ -5235,7 +5416,8 @@
           <w:p>
             <w:pPr>
               <w:pStyle w:val="Normal"/>
-              <w:widowControl/>
+              <w:widowControl w:val="false"/>
+              <w:suppressAutoHyphens w:val="true"/>
               <w:spacing w:lineRule="auto" w:line="240" w:before="60" w:after="60"/>
               <w:cnfStyle w:val="000000000000" w:firstRow="0" w:lastRow="0" w:firstColumn="0" w:lastColumn="0" w:oddVBand="0" w:evenVBand="0" w:oddHBand="0" w:evenHBand="0" w:firstRowFirstColumn="0" w:firstRowLastColumn="0" w:lastRowFirstColumn="0" w:lastRowLastColumn="0"/>
               <w:rPr>
@@ -5258,16 +5440,17 @@
         </w:tc>
         <w:tc>
           <w:tcPr>
-            <w:tcW w:w="5432" w:type="dxa"/>
-            <w:tcBorders>
-              <w:top w:val="nil"/>
-              <w:bottom w:val="nil"/>
-            </w:tcBorders>
-          </w:tcPr>
-          <w:p>
-            <w:pPr>
-              <w:pStyle w:val="Normal"/>
-              <w:widowControl/>
+            <w:tcW w:w="5433" w:type="dxa"/>
+            <w:tcBorders>
+              <w:top w:val="nil"/>
+              <w:bottom w:val="nil"/>
+            </w:tcBorders>
+          </w:tcPr>
+          <w:p>
+            <w:pPr>
+              <w:pStyle w:val="Normal"/>
+              <w:widowControl w:val="false"/>
+              <w:suppressAutoHyphens w:val="true"/>
               <w:spacing w:lineRule="auto" w:line="240" w:before="60" w:after="60"/>
               <w:cnfStyle w:val="000000000000" w:firstRow="0" w:lastRow="0" w:firstColumn="0" w:lastColumn="0" w:oddVBand="0" w:evenVBand="0" w:oddHBand="0" w:evenHBand="0" w:firstRowFirstColumn="0" w:firstRowLastColumn="0" w:lastRowFirstColumn="0" w:lastRowLastColumn="0"/>
               <w:rPr>
@@ -5292,7 +5475,7 @@
         </w:trPr>
         <w:tc>
           <w:tcPr>
-            <w:tcW w:w="2018" w:type="dxa"/>
+            <w:tcW w:w="2017" w:type="dxa"/>
             <w:cnfStyle w:val="001000000000" w:firstRow="0" w:lastRow="0" w:firstColumn="1" w:lastColumn="0" w:oddVBand="0" w:evenVBand="0" w:oddHBand="0" w:evenHBand="0" w:firstRowFirstColumn="0" w:firstRowLastColumn="0" w:lastRowFirstColumn="0" w:lastRowLastColumn="0"/>
             <w:tcBorders>
               <w:top w:val="nil"/>
@@ -5303,7 +5486,8 @@
           <w:p>
             <w:pPr>
               <w:pStyle w:val="Normal"/>
-              <w:widowControl/>
+              <w:widowControl w:val="false"/>
+              <w:suppressAutoHyphens w:val="true"/>
               <w:spacing w:lineRule="auto" w:line="240" w:before="60" w:after="60"/>
               <w:rPr>
                 <w:color w:val="auto"/>
@@ -5323,7 +5507,8 @@
           <w:p>
             <w:pPr>
               <w:pStyle w:val="Normal"/>
-              <w:widowControl/>
+              <w:widowControl w:val="false"/>
+              <w:suppressAutoHyphens w:val="true"/>
               <w:spacing w:lineRule="auto" w:line="240" w:before="60" w:after="60"/>
               <w:rPr>
                 <w:color w:val="auto"/>
@@ -5332,50 +5517,47 @@
             </w:pPr>
             <w:r>
               <w:rPr>
-                <w:rFonts w:eastAsia="" w:cs=""/>
-                <w:color w:val="auto"/>
-                <w:kern w:val="0"/>
-                <w:lang w:val="en-US" w:eastAsia="ja-JP" w:bidi="ar-SA"/>
-              </w:rPr>
-            </w:r>
-          </w:p>
-        </w:tc>
-        <w:tc>
-          <w:tcPr>
-            <w:tcW w:w="2909" w:type="dxa"/>
-            <w:tcBorders>
-              <w:top w:val="nil"/>
-              <w:bottom w:val="nil"/>
-            </w:tcBorders>
-            <w:shd w:color="auto" w:fill="DDDBD5" w:themeFill="text2" w:themeFillTint="33" w:val="clear"/>
-          </w:tcPr>
-          <w:p>
-            <w:pPr>
-              <w:pStyle w:val="Normal"/>
-              <w:widowControl/>
-              <w:spacing w:lineRule="auto" w:line="240" w:before="60" w:after="60"/>
-              <w:cnfStyle w:val="000000010000" w:firstRow="0" w:lastRow="0" w:firstColumn="0" w:lastColumn="0" w:oddVBand="0" w:evenVBand="0" w:oddHBand="0" w:evenHBand="1" w:firstRowFirstColumn="0" w:firstRowLastColumn="0" w:lastRowFirstColumn="0" w:lastRowLastColumn="0"/>
-              <w:rPr>
-                <w:i/>
-                <w:i/>
                 <w:color w:val="auto"/>
                 <w:lang w:val="en-US"/>
               </w:rPr>
-            </w:pPr>
-            <w:r>
-              <w:rPr>
-                <w:rFonts w:eastAsia="" w:cs=""/>
+            </w:r>
+          </w:p>
+        </w:tc>
+        <w:tc>
+          <w:tcPr>
+            <w:tcW w:w="2909" w:type="dxa"/>
+            <w:tcBorders>
+              <w:top w:val="nil"/>
+              <w:bottom w:val="nil"/>
+            </w:tcBorders>
+            <w:shd w:color="auto" w:fill="DDDBD5" w:themeFill="text2" w:themeFillTint="33" w:val="clear"/>
+          </w:tcPr>
+          <w:p>
+            <w:pPr>
+              <w:pStyle w:val="Normal"/>
+              <w:widowControl w:val="false"/>
+              <w:suppressAutoHyphens w:val="true"/>
+              <w:spacing w:lineRule="auto" w:line="240" w:before="60" w:after="60"/>
+              <w:cnfStyle w:val="000000010000" w:firstRow="0" w:lastRow="0" w:firstColumn="0" w:lastColumn="0" w:oddVBand="0" w:evenVBand="0" w:oddHBand="0" w:evenHBand="1" w:firstRowFirstColumn="0" w:firstRowLastColumn="0" w:lastRowFirstColumn="0" w:lastRowLastColumn="0"/>
+              <w:rPr>
+                <w:i/>
                 <w:i/>
                 <w:color w:val="auto"/>
-                <w:kern w:val="0"/>
-                <w:lang w:val="en-US" w:eastAsia="ja-JP" w:bidi="ar-SA"/>
-              </w:rPr>
-            </w:r>
-          </w:p>
-        </w:tc>
-        <w:tc>
-          <w:tcPr>
-            <w:tcW w:w="5432" w:type="dxa"/>
+                <w:lang w:val="en-US"/>
+              </w:rPr>
+            </w:pPr>
+            <w:r>
+              <w:rPr>
+                <w:i/>
+                <w:color w:val="auto"/>
+                <w:lang w:val="en-US"/>
+              </w:rPr>
+            </w:r>
+          </w:p>
+        </w:tc>
+        <w:tc>
+          <w:tcPr>
+            <w:tcW w:w="5433" w:type="dxa"/>
             <w:tcBorders>
               <w:top w:val="nil"/>
               <w:bottom w:val="nil"/>
@@ -5385,7 +5567,8 @@
           <w:p>
             <w:pPr>
               <w:pStyle w:val="Normal"/>
-              <w:widowControl/>
+              <w:widowControl w:val="false"/>
+              <w:suppressAutoHyphens w:val="true"/>
               <w:spacing w:lineRule="auto" w:line="240" w:before="60" w:after="60"/>
               <w:cnfStyle w:val="000000010000" w:firstRow="0" w:lastRow="0" w:firstColumn="0" w:lastColumn="0" w:oddVBand="0" w:evenVBand="0" w:oddHBand="0" w:evenHBand="1" w:firstRowFirstColumn="0" w:firstRowLastColumn="0" w:lastRowFirstColumn="0" w:lastRowLastColumn="0"/>
               <w:rPr>
@@ -5408,7 +5591,7 @@
         <w:trPr/>
         <w:tc>
           <w:tcPr>
-            <w:tcW w:w="2018" w:type="dxa"/>
+            <w:tcW w:w="2017" w:type="dxa"/>
             <w:cnfStyle w:val="001000000000" w:firstRow="0" w:lastRow="0" w:firstColumn="1" w:lastColumn="0" w:oddVBand="0" w:evenVBand="0" w:oddHBand="0" w:evenHBand="0" w:firstRowFirstColumn="0" w:firstRowLastColumn="0" w:lastRowFirstColumn="0" w:lastRowLastColumn="0"/>
             <w:tcBorders>
               <w:top w:val="nil"/>
@@ -5418,7 +5601,8 @@
           <w:p>
             <w:pPr>
               <w:pStyle w:val="Normal"/>
-              <w:widowControl/>
+              <w:widowControl w:val="false"/>
+              <w:suppressAutoHyphens w:val="true"/>
               <w:spacing w:lineRule="auto" w:line="240" w:before="60" w:after="60"/>
               <w:rPr>
                 <w:color w:val="auto"/>
@@ -5447,7 +5631,8 @@
           <w:p>
             <w:pPr>
               <w:pStyle w:val="Normal"/>
-              <w:widowControl/>
+              <w:widowControl w:val="false"/>
+              <w:suppressAutoHyphens w:val="true"/>
               <w:spacing w:lineRule="auto" w:line="240" w:before="60" w:after="60"/>
               <w:cnfStyle w:val="000000000000" w:firstRow="0" w:lastRow="0" w:firstColumn="0" w:lastColumn="0" w:oddVBand="0" w:evenVBand="0" w:oddHBand="0" w:evenHBand="0" w:firstRowFirstColumn="0" w:firstRowLastColumn="0" w:lastRowFirstColumn="0" w:lastRowLastColumn="0"/>
               <w:rPr>
@@ -5471,16 +5656,17 @@
         </w:tc>
         <w:tc>
           <w:tcPr>
-            <w:tcW w:w="5432" w:type="dxa"/>
-            <w:tcBorders>
-              <w:top w:val="nil"/>
-              <w:bottom w:val="nil"/>
-            </w:tcBorders>
-          </w:tcPr>
-          <w:p>
-            <w:pPr>
-              <w:pStyle w:val="Normal"/>
-              <w:widowControl/>
+            <w:tcW w:w="5433" w:type="dxa"/>
+            <w:tcBorders>
+              <w:top w:val="nil"/>
+              <w:bottom w:val="nil"/>
+            </w:tcBorders>
+          </w:tcPr>
+          <w:p>
+            <w:pPr>
+              <w:pStyle w:val="Normal"/>
+              <w:widowControl w:val="false"/>
+              <w:suppressAutoHyphens w:val="true"/>
               <w:spacing w:lineRule="auto" w:line="240" w:before="60" w:after="60"/>
               <w:cnfStyle w:val="000000000000" w:firstRow="0" w:lastRow="0" w:firstColumn="0" w:lastColumn="0" w:oddVBand="0" w:evenVBand="0" w:oddHBand="0" w:evenHBand="0" w:firstRowFirstColumn="0" w:firstRowLastColumn="0" w:lastRowFirstColumn="0" w:lastRowLastColumn="0"/>
               <w:rPr>
@@ -5505,7 +5691,7 @@
         </w:trPr>
         <w:tc>
           <w:tcPr>
-            <w:tcW w:w="2018" w:type="dxa"/>
+            <w:tcW w:w="2017" w:type="dxa"/>
             <w:cnfStyle w:val="001000000000" w:firstRow="0" w:lastRow="0" w:firstColumn="1" w:lastColumn="0" w:oddVBand="0" w:evenVBand="0" w:oddHBand="0" w:evenHBand="0" w:firstRowFirstColumn="0" w:firstRowLastColumn="0" w:lastRowFirstColumn="0" w:lastRowLastColumn="0"/>
             <w:tcBorders>
               <w:top w:val="nil"/>
@@ -5516,7 +5702,8 @@
           <w:p>
             <w:pPr>
               <w:pStyle w:val="Normal"/>
-              <w:widowControl/>
+              <w:widowControl w:val="false"/>
+              <w:suppressAutoHyphens w:val="true"/>
               <w:spacing w:lineRule="auto" w:line="240" w:before="60" w:after="60"/>
               <w:rPr>
                 <w:color w:val="auto"/>
@@ -5536,7 +5723,8 @@
           <w:p>
             <w:pPr>
               <w:pStyle w:val="Normal"/>
-              <w:widowControl/>
+              <w:widowControl w:val="false"/>
+              <w:suppressAutoHyphens w:val="true"/>
               <w:spacing w:lineRule="auto" w:line="240" w:before="60" w:after="60"/>
               <w:rPr>
                 <w:color w:val="auto"/>
@@ -5545,50 +5733,47 @@
             </w:pPr>
             <w:r>
               <w:rPr>
-                <w:rFonts w:eastAsia="" w:cs=""/>
-                <w:color w:val="auto"/>
-                <w:kern w:val="0"/>
-                <w:lang w:val="en-US" w:eastAsia="ja-JP" w:bidi="ar-SA"/>
-              </w:rPr>
-            </w:r>
-          </w:p>
-        </w:tc>
-        <w:tc>
-          <w:tcPr>
-            <w:tcW w:w="2909" w:type="dxa"/>
-            <w:tcBorders>
-              <w:top w:val="nil"/>
-              <w:bottom w:val="nil"/>
-            </w:tcBorders>
-            <w:shd w:color="auto" w:fill="DDDBD5" w:themeFill="text2" w:themeFillTint="33" w:val="clear"/>
-          </w:tcPr>
-          <w:p>
-            <w:pPr>
-              <w:pStyle w:val="Normal"/>
-              <w:widowControl/>
-              <w:spacing w:lineRule="auto" w:line="240" w:before="60" w:after="60"/>
-              <w:cnfStyle w:val="000000010000" w:firstRow="0" w:lastRow="0" w:firstColumn="0" w:lastColumn="0" w:oddVBand="0" w:evenVBand="0" w:oddHBand="0" w:evenHBand="1" w:firstRowFirstColumn="0" w:firstRowLastColumn="0" w:lastRowFirstColumn="0" w:lastRowLastColumn="0"/>
-              <w:rPr>
-                <w:i/>
-                <w:i/>
                 <w:color w:val="auto"/>
                 <w:lang w:val="en-US"/>
               </w:rPr>
-            </w:pPr>
-            <w:r>
-              <w:rPr>
-                <w:rFonts w:eastAsia="" w:cs=""/>
+            </w:r>
+          </w:p>
+        </w:tc>
+        <w:tc>
+          <w:tcPr>
+            <w:tcW w:w="2909" w:type="dxa"/>
+            <w:tcBorders>
+              <w:top w:val="nil"/>
+              <w:bottom w:val="nil"/>
+            </w:tcBorders>
+            <w:shd w:color="auto" w:fill="DDDBD5" w:themeFill="text2" w:themeFillTint="33" w:val="clear"/>
+          </w:tcPr>
+          <w:p>
+            <w:pPr>
+              <w:pStyle w:val="Normal"/>
+              <w:widowControl w:val="false"/>
+              <w:suppressAutoHyphens w:val="true"/>
+              <w:spacing w:lineRule="auto" w:line="240" w:before="60" w:after="60"/>
+              <w:cnfStyle w:val="000000010000" w:firstRow="0" w:lastRow="0" w:firstColumn="0" w:lastColumn="0" w:oddVBand="0" w:evenVBand="0" w:oddHBand="0" w:evenHBand="1" w:firstRowFirstColumn="0" w:firstRowLastColumn="0" w:lastRowFirstColumn="0" w:lastRowLastColumn="0"/>
+              <w:rPr>
+                <w:i/>
                 <w:i/>
                 <w:color w:val="auto"/>
-                <w:kern w:val="0"/>
-                <w:lang w:val="en-US" w:eastAsia="ja-JP" w:bidi="ar-SA"/>
-              </w:rPr>
-            </w:r>
-          </w:p>
-        </w:tc>
-        <w:tc>
-          <w:tcPr>
-            <w:tcW w:w="5432" w:type="dxa"/>
+                <w:lang w:val="en-US"/>
+              </w:rPr>
+            </w:pPr>
+            <w:r>
+              <w:rPr>
+                <w:i/>
+                <w:color w:val="auto"/>
+                <w:lang w:val="en-US"/>
+              </w:rPr>
+            </w:r>
+          </w:p>
+        </w:tc>
+        <w:tc>
+          <w:tcPr>
+            <w:tcW w:w="5433" w:type="dxa"/>
             <w:tcBorders>
               <w:top w:val="nil"/>
               <w:bottom w:val="nil"/>
@@ -5598,7 +5783,8 @@
           <w:p>
             <w:pPr>
               <w:pStyle w:val="Normal"/>
-              <w:widowControl/>
+              <w:widowControl w:val="false"/>
+              <w:suppressAutoHyphens w:val="true"/>
               <w:spacing w:lineRule="auto" w:line="240" w:before="60" w:after="60"/>
               <w:cnfStyle w:val="000000010000" w:firstRow="0" w:lastRow="0" w:firstColumn="0" w:lastColumn="0" w:oddVBand="0" w:evenVBand="0" w:oddHBand="0" w:evenHBand="1" w:firstRowFirstColumn="0" w:firstRowLastColumn="0" w:lastRowFirstColumn="0" w:lastRowLastColumn="0"/>
               <w:rPr>
@@ -5640,7 +5826,7 @@
         <w:trPr/>
         <w:tc>
           <w:tcPr>
-            <w:tcW w:w="2018" w:type="dxa"/>
+            <w:tcW w:w="2017" w:type="dxa"/>
             <w:cnfStyle w:val="001000000000" w:firstRow="0" w:lastRow="0" w:firstColumn="1" w:lastColumn="0" w:oddVBand="0" w:evenVBand="0" w:oddHBand="0" w:evenHBand="0" w:firstRowFirstColumn="0" w:firstRowLastColumn="0" w:lastRowFirstColumn="0" w:lastRowLastColumn="0"/>
             <w:tcBorders>
               <w:top w:val="nil"/>
@@ -5650,7 +5836,8 @@
           <w:p>
             <w:pPr>
               <w:pStyle w:val="Normal"/>
-              <w:widowControl/>
+              <w:widowControl w:val="false"/>
+              <w:suppressAutoHyphens w:val="true"/>
               <w:spacing w:lineRule="auto" w:line="240" w:before="60" w:after="60"/>
               <w:rPr>
                 <w:color w:val="auto"/>
@@ -5679,7 +5866,8 @@
           <w:p>
             <w:pPr>
               <w:pStyle w:val="Normal"/>
-              <w:widowControl/>
+              <w:widowControl w:val="false"/>
+              <w:suppressAutoHyphens w:val="true"/>
               <w:spacing w:lineRule="auto" w:line="240" w:before="60" w:after="60"/>
               <w:cnfStyle w:val="000000000000" w:firstRow="0" w:lastRow="0" w:firstColumn="0" w:lastColumn="0" w:oddVBand="0" w:evenVBand="0" w:oddHBand="0" w:evenHBand="0" w:firstRowFirstColumn="0" w:firstRowLastColumn="0" w:lastRowFirstColumn="0" w:lastRowLastColumn="0"/>
               <w:rPr>
@@ -5703,16 +5891,17 @@
         </w:tc>
         <w:tc>
           <w:tcPr>
-            <w:tcW w:w="5432" w:type="dxa"/>
-            <w:tcBorders>
-              <w:top w:val="nil"/>
-              <w:bottom w:val="nil"/>
-            </w:tcBorders>
-          </w:tcPr>
-          <w:p>
-            <w:pPr>
-              <w:pStyle w:val="Normal"/>
-              <w:widowControl/>
+            <w:tcW w:w="5433" w:type="dxa"/>
+            <w:tcBorders>
+              <w:top w:val="nil"/>
+              <w:bottom w:val="nil"/>
+            </w:tcBorders>
+          </w:tcPr>
+          <w:p>
+            <w:pPr>
+              <w:pStyle w:val="Normal"/>
+              <w:widowControl w:val="false"/>
+              <w:suppressAutoHyphens w:val="true"/>
               <w:spacing w:lineRule="auto" w:line="240" w:before="60" w:after="60"/>
               <w:cnfStyle w:val="000000000000" w:firstRow="0" w:lastRow="0" w:firstColumn="0" w:lastColumn="0" w:oddVBand="0" w:evenVBand="0" w:oddHBand="0" w:evenHBand="0" w:firstRowFirstColumn="0" w:firstRowLastColumn="0" w:lastRowFirstColumn="0" w:lastRowLastColumn="0"/>
               <w:rPr>
@@ -5756,7 +5945,7 @@
         </w:trPr>
         <w:tc>
           <w:tcPr>
-            <w:tcW w:w="2018" w:type="dxa"/>
+            <w:tcW w:w="2017" w:type="dxa"/>
             <w:cnfStyle w:val="001000000000" w:firstRow="0" w:lastRow="0" w:firstColumn="1" w:lastColumn="0" w:oddVBand="0" w:evenVBand="0" w:oddHBand="0" w:evenHBand="0" w:firstRowFirstColumn="0" w:firstRowLastColumn="0" w:lastRowFirstColumn="0" w:lastRowLastColumn="0"/>
             <w:tcBorders>
               <w:top w:val="nil"/>
@@ -5767,7 +5956,8 @@
           <w:p>
             <w:pPr>
               <w:pStyle w:val="Normal"/>
-              <w:widowControl/>
+              <w:widowControl w:val="false"/>
+              <w:suppressAutoHyphens w:val="true"/>
               <w:spacing w:lineRule="auto" w:line="240" w:before="60" w:after="60"/>
               <w:rPr>
                 <w:color w:val="auto"/>
@@ -5786,7 +5976,8 @@
           <w:p>
             <w:pPr>
               <w:pStyle w:val="Normal"/>
-              <w:widowControl/>
+              <w:widowControl w:val="false"/>
+              <w:suppressAutoHyphens w:val="true"/>
               <w:spacing w:lineRule="auto" w:line="240" w:before="60" w:after="60"/>
               <w:rPr>
                 <w:color w:val="auto"/>
@@ -5794,17 +5985,15 @@
             </w:pPr>
             <w:r>
               <w:rPr>
-                <w:rFonts w:eastAsia="" w:cs=""/>
                 <w:color w:val="auto"/>
-                <w:kern w:val="0"/>
-                <w:lang w:eastAsia="ja-JP" w:bidi="ar-SA"/>
-              </w:rPr>
-            </w:r>
-          </w:p>
-          <w:p>
-            <w:pPr>
-              <w:pStyle w:val="Normal"/>
-              <w:widowControl/>
+              </w:rPr>
+            </w:r>
+          </w:p>
+          <w:p>
+            <w:pPr>
+              <w:pStyle w:val="Normal"/>
+              <w:widowControl w:val="false"/>
+              <w:suppressAutoHyphens w:val="true"/>
               <w:spacing w:lineRule="auto" w:line="240" w:before="60" w:after="60"/>
               <w:rPr>
                 <w:color w:val="auto"/>
@@ -5812,17 +6001,15 @@
             </w:pPr>
             <w:r>
               <w:rPr>
-                <w:rFonts w:eastAsia="" w:cs=""/>
                 <w:color w:val="auto"/>
-                <w:kern w:val="0"/>
-                <w:lang w:eastAsia="ja-JP" w:bidi="ar-SA"/>
-              </w:rPr>
-            </w:r>
-          </w:p>
-          <w:p>
-            <w:pPr>
-              <w:pStyle w:val="Normal"/>
-              <w:widowControl/>
+              </w:rPr>
+            </w:r>
+          </w:p>
+          <w:p>
+            <w:pPr>
+              <w:pStyle w:val="Normal"/>
+              <w:widowControl w:val="false"/>
+              <w:suppressAutoHyphens w:val="true"/>
               <w:spacing w:lineRule="auto" w:line="240" w:before="60" w:after="60"/>
               <w:rPr>
                 <w:color w:val="auto"/>
@@ -5830,10 +6017,7 @@
             </w:pPr>
             <w:r>
               <w:rPr>
-                <w:rFonts w:eastAsia="" w:cs=""/>
                 <w:color w:val="auto"/>
-                <w:kern w:val="0"/>
-                <w:lang w:eastAsia="ja-JP" w:bidi="ar-SA"/>
               </w:rPr>
             </w:r>
           </w:p>
@@ -5850,7 +6034,8 @@
           <w:p>
             <w:pPr>
               <w:pStyle w:val="Normal"/>
-              <w:widowControl/>
+              <w:widowControl w:val="false"/>
+              <w:suppressAutoHyphens w:val="true"/>
               <w:spacing w:lineRule="auto" w:line="240" w:before="60" w:after="60"/>
               <w:cnfStyle w:val="000000010000" w:firstRow="0" w:lastRow="0" w:firstColumn="0" w:lastColumn="0" w:oddVBand="0" w:evenVBand="0" w:oddHBand="0" w:evenHBand="1" w:firstRowFirstColumn="0" w:firstRowLastColumn="0" w:lastRowFirstColumn="0" w:lastRowLastColumn="0"/>
               <w:rPr>
@@ -5874,7 +6059,7 @@
         </w:tc>
         <w:tc>
           <w:tcPr>
-            <w:tcW w:w="5432" w:type="dxa"/>
+            <w:tcW w:w="5433" w:type="dxa"/>
             <w:tcBorders>
               <w:top w:val="nil"/>
               <w:bottom w:val="nil"/>
@@ -5884,7 +6069,8 @@
           <w:p>
             <w:pPr>
               <w:pStyle w:val="NormalWeb"/>
-              <w:widowControl/>
+              <w:widowControl w:val="false"/>
+              <w:suppressAutoHyphens w:val="true"/>
               <w:spacing w:before="0" w:after="280"/>
               <w:cnfStyle w:val="000000010000" w:firstRow="0" w:lastRow="0" w:firstColumn="0" w:lastColumn="0" w:oddVBand="0" w:evenVBand="0" w:oddHBand="0" w:evenHBand="1" w:firstRowFirstColumn="0" w:firstRowLastColumn="0" w:lastRowFirstColumn="0" w:lastRowLastColumn="0"/>
               <w:rPr>
@@ -5920,7 +6106,8 @@
           <w:p>
             <w:pPr>
               <w:pStyle w:val="NormalWeb"/>
-              <w:widowControl/>
+              <w:widowControl w:val="false"/>
+              <w:suppressAutoHyphens w:val="true"/>
               <w:spacing w:before="280" w:after="280"/>
               <w:cnfStyle w:val="000000010000" w:firstRow="0" w:lastRow="0" w:firstColumn="0" w:lastColumn="0" w:oddVBand="0" w:evenVBand="0" w:oddHBand="0" w:evenHBand="1" w:firstRowFirstColumn="0" w:firstRowLastColumn="0" w:lastRowFirstColumn="0" w:lastRowLastColumn="0"/>
               <w:rPr>
@@ -5933,17 +6120,17 @@
             <w:r>
               <w:rPr>
                 <w:rFonts w:ascii="Century Gothic" w:hAnsi="Century Gothic"/>
-                <w:kern w:val="0"/>
                 <w:sz w:val="22"/>
                 <w:szCs w:val="22"/>
-                <w:lang w:val="de-DE" w:bidi="ar-SA"/>
+                <w:lang w:val="de-DE"/>
               </w:rPr>
             </w:r>
           </w:p>
           <w:p>
             <w:pPr>
               <w:pStyle w:val="NormalWeb"/>
-              <w:widowControl/>
+              <w:widowControl w:val="false"/>
+              <w:suppressAutoHyphens w:val="true"/>
               <w:spacing w:before="280" w:after="280"/>
               <w:cnfStyle w:val="000000010000" w:firstRow="0" w:lastRow="0" w:firstColumn="0" w:lastColumn="0" w:oddVBand="0" w:evenVBand="0" w:oddHBand="0" w:evenHBand="1" w:firstRowFirstColumn="0" w:firstRowLastColumn="0" w:lastRowFirstColumn="0" w:lastRowLastColumn="0"/>
               <w:rPr>
@@ -5956,17 +6143,17 @@
             <w:r>
               <w:rPr>
                 <w:rFonts w:ascii="Century Gothic" w:hAnsi="Century Gothic"/>
-                <w:kern w:val="0"/>
                 <w:sz w:val="22"/>
                 <w:szCs w:val="22"/>
-                <w:lang w:val="de-DE" w:bidi="ar-SA"/>
+                <w:lang w:val="de-DE"/>
               </w:rPr>
             </w:r>
           </w:p>
           <w:p>
             <w:pPr>
               <w:pStyle w:val="NormalWeb"/>
-              <w:widowControl/>
+              <w:widowControl w:val="false"/>
+              <w:suppressAutoHyphens w:val="true"/>
               <w:spacing w:before="280" w:after="0"/>
               <w:cnfStyle w:val="000000010000" w:firstRow="0" w:lastRow="0" w:firstColumn="0" w:lastColumn="0" w:oddVBand="0" w:evenVBand="0" w:oddHBand="0" w:evenHBand="1" w:firstRowFirstColumn="0" w:firstRowLastColumn="0" w:lastRowFirstColumn="0" w:lastRowLastColumn="0"/>
               <w:rPr>
@@ -5979,10 +6166,9 @@
             <w:r>
               <w:rPr>
                 <w:rFonts w:ascii="Century Gothic" w:hAnsi="Century Gothic"/>
-                <w:kern w:val="0"/>
                 <w:sz w:val="22"/>
                 <w:szCs w:val="22"/>
-                <w:lang w:val="de-DE" w:bidi="ar-SA"/>
+                <w:lang w:val="de-DE"/>
               </w:rPr>
             </w:r>
           </w:p>
@@ -5992,7 +6178,7 @@
         <w:trPr/>
         <w:tc>
           <w:tcPr>
-            <w:tcW w:w="2018" w:type="dxa"/>
+            <w:tcW w:w="2017" w:type="dxa"/>
             <w:cnfStyle w:val="001000000000" w:firstRow="0" w:lastRow="0" w:firstColumn="1" w:lastColumn="0" w:oddVBand="0" w:evenVBand="0" w:oddHBand="0" w:evenHBand="0" w:firstRowFirstColumn="0" w:firstRowLastColumn="0" w:lastRowFirstColumn="0" w:lastRowLastColumn="0"/>
             <w:tcBorders>
               <w:top w:val="nil"/>
@@ -6002,7 +6188,8 @@
           <w:p>
             <w:pPr>
               <w:pStyle w:val="Normal"/>
-              <w:widowControl/>
+              <w:widowControl w:val="false"/>
+              <w:suppressAutoHyphens w:val="true"/>
               <w:spacing w:lineRule="auto" w:line="240" w:before="60" w:after="60"/>
               <w:rPr>
                 <w:color w:val="auto"/>
@@ -6022,7 +6209,8 @@
           <w:p>
             <w:pPr>
               <w:pStyle w:val="Normal"/>
-              <w:widowControl/>
+              <w:widowControl w:val="false"/>
+              <w:suppressAutoHyphens w:val="true"/>
               <w:spacing w:lineRule="auto" w:line="240" w:before="60" w:after="60"/>
               <w:rPr>
                 <w:color w:val="auto"/>
@@ -6031,40 +6219,39 @@
             </w:pPr>
             <w:r>
               <w:rPr>
-                <w:rFonts w:eastAsia="" w:cs=""/>
-                <w:color w:val="auto"/>
-                <w:kern w:val="0"/>
-                <w:lang w:val="en-US" w:eastAsia="ja-JP" w:bidi="ar-SA"/>
-              </w:rPr>
-            </w:r>
-          </w:p>
-        </w:tc>
-        <w:tc>
-          <w:tcPr>
-            <w:tcW w:w="2909" w:type="dxa"/>
-            <w:tcBorders>
-              <w:top w:val="nil"/>
-              <w:bottom w:val="nil"/>
-            </w:tcBorders>
-          </w:tcPr>
-          <w:p>
-            <w:pPr>
-              <w:pStyle w:val="Normal"/>
-              <w:widowControl/>
-              <w:spacing w:lineRule="auto" w:line="240" w:before="60" w:after="60"/>
-              <w:cnfStyle w:val="000000000000" w:firstRow="0" w:lastRow="0" w:firstColumn="0" w:lastColumn="0" w:oddVBand="0" w:evenVBand="0" w:oddHBand="0" w:evenHBand="0" w:firstRowFirstColumn="0" w:firstRowLastColumn="0" w:lastRowFirstColumn="0" w:lastRowLastColumn="0"/>
-              <w:rPr>
-                <w:i/>
-                <w:i/>
                 <w:color w:val="auto"/>
                 <w:lang w:val="en-US"/>
               </w:rPr>
-            </w:pPr>
-            <w:r>
-              <w:rPr>
-                <w:rFonts w:eastAsia="" w:cs=""/>
+            </w:r>
+          </w:p>
+        </w:tc>
+        <w:tc>
+          <w:tcPr>
+            <w:tcW w:w="2909" w:type="dxa"/>
+            <w:tcBorders>
+              <w:top w:val="nil"/>
+              <w:bottom w:val="nil"/>
+            </w:tcBorders>
+          </w:tcPr>
+          <w:p>
+            <w:pPr>
+              <w:pStyle w:val="Normal"/>
+              <w:widowControl w:val="false"/>
+              <w:suppressAutoHyphens w:val="true"/>
+              <w:spacing w:lineRule="auto" w:line="240" w:before="60" w:after="60"/>
+              <w:cnfStyle w:val="000000000000" w:firstRow="0" w:lastRow="0" w:firstColumn="0" w:lastColumn="0" w:oddVBand="0" w:evenVBand="0" w:oddHBand="0" w:evenHBand="0" w:firstRowFirstColumn="0" w:firstRowLastColumn="0" w:lastRowFirstColumn="0" w:lastRowLastColumn="0"/>
+              <w:rPr>
+                <w:i/>
                 <w:i/>
                 <w:color w:val="auto"/>
+                <w:lang w:val="en-US"/>
+              </w:rPr>
+            </w:pPr>
+            <w:r>
+              <w:rPr>
+                <w:rFonts w:eastAsia="" w:cs=""/>
+                <w:i/>
+                <w:color w:val="auto"/>
                 <w:kern w:val="0"/>
                 <w:lang w:val="en-US" w:eastAsia="ja-JP" w:bidi="ar-SA"/>
               </w:rPr>
@@ -6074,16 +6261,17 @@
         </w:tc>
         <w:tc>
           <w:tcPr>
-            <w:tcW w:w="5432" w:type="dxa"/>
-            <w:tcBorders>
-              <w:top w:val="nil"/>
-              <w:bottom w:val="nil"/>
-            </w:tcBorders>
-          </w:tcPr>
-          <w:p>
-            <w:pPr>
-              <w:pStyle w:val="Normal"/>
-              <w:widowControl/>
+            <w:tcW w:w="5433" w:type="dxa"/>
+            <w:tcBorders>
+              <w:top w:val="nil"/>
+              <w:bottom w:val="nil"/>
+            </w:tcBorders>
+          </w:tcPr>
+          <w:p>
+            <w:pPr>
+              <w:pStyle w:val="Normal"/>
+              <w:widowControl w:val="false"/>
+              <w:suppressAutoHyphens w:val="true"/>
               <w:spacing w:lineRule="auto" w:line="240" w:before="60" w:after="60"/>
               <w:cnfStyle w:val="000000000000" w:firstRow="0" w:lastRow="0" w:firstColumn="0" w:lastColumn="0" w:oddVBand="0" w:evenVBand="0" w:oddHBand="0" w:evenHBand="0" w:firstRowFirstColumn="0" w:firstRowLastColumn="0" w:lastRowFirstColumn="0" w:lastRowLastColumn="0"/>
               <w:rPr>
@@ -6103,7 +6291,8 @@
           <w:p>
             <w:pPr>
               <w:pStyle w:val="Normal"/>
-              <w:widowControl/>
+              <w:widowControl w:val="false"/>
+              <w:suppressAutoHyphens w:val="true"/>
               <w:spacing w:lineRule="auto" w:line="240" w:before="60" w:after="60"/>
               <w:cnfStyle w:val="000000000000" w:firstRow="0" w:lastRow="0" w:firstColumn="0" w:lastColumn="0" w:oddVBand="0" w:evenVBand="0" w:oddHBand="0" w:evenHBand="0" w:firstRowFirstColumn="0" w:firstRowLastColumn="0" w:lastRowFirstColumn="0" w:lastRowLastColumn="0"/>
               <w:rPr>
@@ -6138,7 +6327,7 @@
         </w:trPr>
         <w:tc>
           <w:tcPr>
-            <w:tcW w:w="2018" w:type="dxa"/>
+            <w:tcW w:w="2017" w:type="dxa"/>
             <w:cnfStyle w:val="001000000000" w:firstRow="0" w:lastRow="0" w:firstColumn="1" w:lastColumn="0" w:oddVBand="0" w:evenVBand="0" w:oddHBand="0" w:evenHBand="0" w:firstRowFirstColumn="0" w:firstRowLastColumn="0" w:lastRowFirstColumn="0" w:lastRowLastColumn="0"/>
             <w:tcBorders>
               <w:top w:val="nil"/>
@@ -6149,7 +6338,8 @@
           <w:p>
             <w:pPr>
               <w:pStyle w:val="Normal"/>
-              <w:widowControl/>
+              <w:widowControl w:val="false"/>
+              <w:suppressAutoHyphens w:val="true"/>
               <w:spacing w:lineRule="auto" w:line="240" w:before="60" w:after="60"/>
               <w:rPr>
                 <w:color w:val="auto"/>
@@ -6169,7 +6359,8 @@
           <w:p>
             <w:pPr>
               <w:pStyle w:val="Normal"/>
-              <w:widowControl/>
+              <w:widowControl w:val="false"/>
+              <w:suppressAutoHyphens w:val="true"/>
               <w:spacing w:lineRule="auto" w:line="240" w:before="60" w:after="60"/>
               <w:rPr>
                 <w:color w:val="auto"/>
@@ -6178,41 +6369,40 @@
             </w:pPr>
             <w:r>
               <w:rPr>
-                <w:rFonts w:eastAsia="" w:cs=""/>
-                <w:color w:val="auto"/>
-                <w:kern w:val="0"/>
-                <w:lang w:val="en-US" w:eastAsia="ja-JP" w:bidi="ar-SA"/>
-              </w:rPr>
-            </w:r>
-          </w:p>
-        </w:tc>
-        <w:tc>
-          <w:tcPr>
-            <w:tcW w:w="2909" w:type="dxa"/>
-            <w:tcBorders>
-              <w:top w:val="nil"/>
-              <w:bottom w:val="nil"/>
-            </w:tcBorders>
-            <w:shd w:color="auto" w:fill="DDDBD5" w:themeFill="text2" w:themeFillTint="33" w:val="clear"/>
-          </w:tcPr>
-          <w:p>
-            <w:pPr>
-              <w:pStyle w:val="Normal"/>
-              <w:widowControl/>
-              <w:spacing w:lineRule="auto" w:line="240" w:before="60" w:after="60"/>
-              <w:cnfStyle w:val="000000010000" w:firstRow="0" w:lastRow="0" w:firstColumn="0" w:lastColumn="0" w:oddVBand="0" w:evenVBand="0" w:oddHBand="0" w:evenHBand="1" w:firstRowFirstColumn="0" w:firstRowLastColumn="0" w:lastRowFirstColumn="0" w:lastRowLastColumn="0"/>
-              <w:rPr>
-                <w:i/>
-                <w:i/>
                 <w:color w:val="auto"/>
                 <w:lang w:val="en-US"/>
               </w:rPr>
-            </w:pPr>
-            <w:r>
-              <w:rPr>
-                <w:rFonts w:eastAsia="" w:cs=""/>
+            </w:r>
+          </w:p>
+        </w:tc>
+        <w:tc>
+          <w:tcPr>
+            <w:tcW w:w="2909" w:type="dxa"/>
+            <w:tcBorders>
+              <w:top w:val="nil"/>
+              <w:bottom w:val="nil"/>
+            </w:tcBorders>
+            <w:shd w:color="auto" w:fill="DDDBD5" w:themeFill="text2" w:themeFillTint="33" w:val="clear"/>
+          </w:tcPr>
+          <w:p>
+            <w:pPr>
+              <w:pStyle w:val="Normal"/>
+              <w:widowControl w:val="false"/>
+              <w:suppressAutoHyphens w:val="true"/>
+              <w:spacing w:lineRule="auto" w:line="240" w:before="60" w:after="60"/>
+              <w:cnfStyle w:val="000000010000" w:firstRow="0" w:lastRow="0" w:firstColumn="0" w:lastColumn="0" w:oddVBand="0" w:evenVBand="0" w:oddHBand="0" w:evenHBand="1" w:firstRowFirstColumn="0" w:firstRowLastColumn="0" w:lastRowFirstColumn="0" w:lastRowLastColumn="0"/>
+              <w:rPr>
+                <w:i/>
                 <w:i/>
                 <w:color w:val="auto"/>
+                <w:lang w:val="en-US"/>
+              </w:rPr>
+            </w:pPr>
+            <w:r>
+              <w:rPr>
+                <w:rFonts w:eastAsia="" w:cs=""/>
+                <w:i/>
+                <w:color w:val="auto"/>
                 <w:kern w:val="0"/>
                 <w:lang w:val="en-US" w:eastAsia="ja-JP" w:bidi="ar-SA"/>
               </w:rPr>
@@ -6222,7 +6412,7 @@
         </w:tc>
         <w:tc>
           <w:tcPr>
-            <w:tcW w:w="5432" w:type="dxa"/>
+            <w:tcW w:w="5433" w:type="dxa"/>
             <w:tcBorders>
               <w:top w:val="nil"/>
               <w:bottom w:val="nil"/>
@@ -6232,7 +6422,8 @@
           <w:p>
             <w:pPr>
               <w:pStyle w:val="Normal"/>
-              <w:widowControl/>
+              <w:widowControl w:val="false"/>
+              <w:suppressAutoHyphens w:val="true"/>
               <w:spacing w:lineRule="auto" w:line="240" w:before="60" w:after="60"/>
               <w:cnfStyle w:val="000000010000" w:firstRow="0" w:lastRow="0" w:firstColumn="0" w:lastColumn="0" w:oddVBand="0" w:evenVBand="0" w:oddHBand="0" w:evenHBand="1" w:firstRowFirstColumn="0" w:firstRowLastColumn="0" w:lastRowFirstColumn="0" w:lastRowLastColumn="0"/>
               <w:rPr>
@@ -6252,7 +6443,8 @@
           <w:p>
             <w:pPr>
               <w:pStyle w:val="Normal"/>
-              <w:widowControl/>
+              <w:widowControl w:val="false"/>
+              <w:suppressAutoHyphens w:val="true"/>
               <w:spacing w:lineRule="auto" w:line="240" w:before="60" w:after="60"/>
               <w:cnfStyle w:val="000000010000" w:firstRow="0" w:lastRow="0" w:firstColumn="0" w:lastColumn="0" w:oddVBand="0" w:evenVBand="0" w:oddHBand="0" w:evenHBand="1" w:firstRowFirstColumn="0" w:firstRowLastColumn="0" w:lastRowFirstColumn="0" w:lastRowLastColumn="0"/>
               <w:rPr>
@@ -6285,7 +6477,7 @@
         <w:trPr/>
         <w:tc>
           <w:tcPr>
-            <w:tcW w:w="2018" w:type="dxa"/>
+            <w:tcW w:w="2017" w:type="dxa"/>
             <w:cnfStyle w:val="001000000000" w:firstRow="0" w:lastRow="0" w:firstColumn="1" w:lastColumn="0" w:oddVBand="0" w:evenVBand="0" w:oddHBand="0" w:evenHBand="0" w:firstRowFirstColumn="0" w:firstRowLastColumn="0" w:lastRowFirstColumn="0" w:lastRowLastColumn="0"/>
             <w:tcBorders>
               <w:top w:val="nil"/>
@@ -6295,7 +6487,8 @@
           <w:p>
             <w:pPr>
               <w:pStyle w:val="Normal"/>
-              <w:widowControl/>
+              <w:widowControl w:val="false"/>
+              <w:suppressAutoHyphens w:val="true"/>
               <w:spacing w:lineRule="auto" w:line="240" w:before="60" w:after="60"/>
               <w:rPr>
                 <w:color w:val="auto"/>
@@ -6323,7 +6516,8 @@
           <w:p>
             <w:pPr>
               <w:pStyle w:val="Normal"/>
-              <w:widowControl/>
+              <w:widowControl w:val="false"/>
+              <w:suppressAutoHyphens w:val="true"/>
               <w:spacing w:lineRule="auto" w:line="240" w:before="60" w:after="60"/>
               <w:rPr>
                 <w:color w:val="auto"/>
@@ -6332,40 +6526,39 @@
             </w:pPr>
             <w:r>
               <w:rPr>
-                <w:rFonts w:eastAsia="" w:cs=""/>
-                <w:color w:val="auto"/>
-                <w:kern w:val="0"/>
-                <w:lang w:val="en-US" w:eastAsia="ja-JP" w:bidi="ar-SA"/>
-              </w:rPr>
-            </w:r>
-          </w:p>
-        </w:tc>
-        <w:tc>
-          <w:tcPr>
-            <w:tcW w:w="2909" w:type="dxa"/>
-            <w:tcBorders>
-              <w:top w:val="nil"/>
-              <w:bottom w:val="nil"/>
-            </w:tcBorders>
-          </w:tcPr>
-          <w:p>
-            <w:pPr>
-              <w:pStyle w:val="Normal"/>
-              <w:widowControl/>
-              <w:spacing w:lineRule="auto" w:line="240" w:before="60" w:after="60"/>
-              <w:cnfStyle w:val="000000000000" w:firstRow="0" w:lastRow="0" w:firstColumn="0" w:lastColumn="0" w:oddVBand="0" w:evenVBand="0" w:oddHBand="0" w:evenHBand="0" w:firstRowFirstColumn="0" w:firstRowLastColumn="0" w:lastRowFirstColumn="0" w:lastRowLastColumn="0"/>
-              <w:rPr>
-                <w:i/>
-                <w:i/>
                 <w:color w:val="auto"/>
                 <w:lang w:val="en-US"/>
               </w:rPr>
-            </w:pPr>
-            <w:r>
-              <w:rPr>
-                <w:rFonts w:eastAsia="" w:cs=""/>
+            </w:r>
+          </w:p>
+        </w:tc>
+        <w:tc>
+          <w:tcPr>
+            <w:tcW w:w="2909" w:type="dxa"/>
+            <w:tcBorders>
+              <w:top w:val="nil"/>
+              <w:bottom w:val="nil"/>
+            </w:tcBorders>
+          </w:tcPr>
+          <w:p>
+            <w:pPr>
+              <w:pStyle w:val="Normal"/>
+              <w:widowControl w:val="false"/>
+              <w:suppressAutoHyphens w:val="true"/>
+              <w:spacing w:lineRule="auto" w:line="240" w:before="60" w:after="60"/>
+              <w:cnfStyle w:val="000000000000" w:firstRow="0" w:lastRow="0" w:firstColumn="0" w:lastColumn="0" w:oddVBand="0" w:evenVBand="0" w:oddHBand="0" w:evenHBand="0" w:firstRowFirstColumn="0" w:firstRowLastColumn="0" w:lastRowFirstColumn="0" w:lastRowLastColumn="0"/>
+              <w:rPr>
+                <w:i/>
                 <w:i/>
                 <w:color w:val="auto"/>
+                <w:lang w:val="en-US"/>
+              </w:rPr>
+            </w:pPr>
+            <w:r>
+              <w:rPr>
+                <w:rFonts w:eastAsia="" w:cs=""/>
+                <w:i/>
+                <w:color w:val="auto"/>
                 <w:kern w:val="0"/>
                 <w:lang w:eastAsia="ja-JP" w:bidi="ar-SA"/>
               </w:rPr>
@@ -6375,16 +6568,17 @@
         </w:tc>
         <w:tc>
           <w:tcPr>
-            <w:tcW w:w="5432" w:type="dxa"/>
-            <w:tcBorders>
-              <w:top w:val="nil"/>
-              <w:bottom w:val="nil"/>
-            </w:tcBorders>
-          </w:tcPr>
-          <w:p>
-            <w:pPr>
-              <w:pStyle w:val="Normal"/>
-              <w:widowControl/>
+            <w:tcW w:w="5433" w:type="dxa"/>
+            <w:tcBorders>
+              <w:top w:val="nil"/>
+              <w:bottom w:val="nil"/>
+            </w:tcBorders>
+          </w:tcPr>
+          <w:p>
+            <w:pPr>
+              <w:pStyle w:val="Normal"/>
+              <w:widowControl w:val="false"/>
+              <w:suppressAutoHyphens w:val="true"/>
               <w:spacing w:lineRule="auto" w:line="240" w:before="60" w:after="60"/>
               <w:cnfStyle w:val="000000000000" w:firstRow="0" w:lastRow="0" w:firstColumn="0" w:lastColumn="0" w:oddVBand="0" w:evenVBand="0" w:oddHBand="0" w:evenHBand="0" w:firstRowFirstColumn="0" w:firstRowLastColumn="0" w:lastRowFirstColumn="0" w:lastRowLastColumn="0"/>
               <w:rPr>
@@ -6406,7 +6600,8 @@
           <w:p>
             <w:pPr>
               <w:pStyle w:val="Normal"/>
-              <w:widowControl/>
+              <w:widowControl w:val="false"/>
+              <w:suppressAutoHyphens w:val="true"/>
               <w:spacing w:lineRule="auto" w:line="240" w:before="60" w:after="60"/>
               <w:cnfStyle w:val="000000000000" w:firstRow="0" w:lastRow="0" w:firstColumn="0" w:lastColumn="0" w:oddVBand="0" w:evenVBand="0" w:oddHBand="0" w:evenHBand="0" w:firstRowFirstColumn="0" w:firstRowLastColumn="0" w:lastRowFirstColumn="0" w:lastRowLastColumn="0"/>
               <w:rPr>
@@ -6441,7 +6636,7 @@
         </w:trPr>
         <w:tc>
           <w:tcPr>
-            <w:tcW w:w="2018" w:type="dxa"/>
+            <w:tcW w:w="2017" w:type="dxa"/>
             <w:cnfStyle w:val="001000000000" w:firstRow="0" w:lastRow="0" w:firstColumn="1" w:lastColumn="0" w:oddVBand="0" w:evenVBand="0" w:oddHBand="0" w:evenHBand="0" w:firstRowFirstColumn="0" w:firstRowLastColumn="0" w:lastRowFirstColumn="0" w:lastRowLastColumn="0"/>
             <w:tcBorders>
               <w:top w:val="nil"/>
@@ -6452,7 +6647,8 @@
           <w:p>
             <w:pPr>
               <w:pStyle w:val="Normal"/>
-              <w:widowControl/>
+              <w:widowControl w:val="false"/>
+              <w:suppressAutoHyphens w:val="true"/>
               <w:spacing w:lineRule="auto" w:line="240" w:before="60" w:after="60"/>
               <w:rPr>
                 <w:color w:val="auto"/>
@@ -6471,7 +6667,8 @@
           <w:p>
             <w:pPr>
               <w:pStyle w:val="Normal"/>
-              <w:widowControl/>
+              <w:widowControl w:val="false"/>
+              <w:suppressAutoHyphens w:val="true"/>
               <w:spacing w:lineRule="auto" w:line="240" w:before="60" w:after="60"/>
               <w:rPr>
                 <w:color w:val="auto"/>
@@ -6480,41 +6677,40 @@
             </w:pPr>
             <w:r>
               <w:rPr>
-                <w:rFonts w:eastAsia="" w:cs=""/>
-                <w:color w:val="auto"/>
-                <w:kern w:val="0"/>
-                <w:lang w:val="en-US" w:eastAsia="ja-JP" w:bidi="ar-SA"/>
-              </w:rPr>
-            </w:r>
-          </w:p>
-        </w:tc>
-        <w:tc>
-          <w:tcPr>
-            <w:tcW w:w="2909" w:type="dxa"/>
-            <w:tcBorders>
-              <w:top w:val="nil"/>
-              <w:bottom w:val="nil"/>
-            </w:tcBorders>
-            <w:shd w:color="auto" w:fill="DDDBD5" w:themeFill="text2" w:themeFillTint="33" w:val="clear"/>
-          </w:tcPr>
-          <w:p>
-            <w:pPr>
-              <w:pStyle w:val="Normal"/>
-              <w:widowControl/>
-              <w:spacing w:lineRule="auto" w:line="240" w:before="60" w:after="60"/>
-              <w:cnfStyle w:val="000000010000" w:firstRow="0" w:lastRow="0" w:firstColumn="0" w:lastColumn="0" w:oddVBand="0" w:evenVBand="0" w:oddHBand="0" w:evenHBand="1" w:firstRowFirstColumn="0" w:firstRowLastColumn="0" w:lastRowFirstColumn="0" w:lastRowLastColumn="0"/>
-              <w:rPr>
-                <w:i/>
-                <w:i/>
                 <w:color w:val="auto"/>
                 <w:lang w:val="en-US"/>
               </w:rPr>
-            </w:pPr>
-            <w:r>
-              <w:rPr>
-                <w:rFonts w:eastAsia="" w:cs=""/>
+            </w:r>
+          </w:p>
+        </w:tc>
+        <w:tc>
+          <w:tcPr>
+            <w:tcW w:w="2909" w:type="dxa"/>
+            <w:tcBorders>
+              <w:top w:val="nil"/>
+              <w:bottom w:val="nil"/>
+            </w:tcBorders>
+            <w:shd w:color="auto" w:fill="DDDBD5" w:themeFill="text2" w:themeFillTint="33" w:val="clear"/>
+          </w:tcPr>
+          <w:p>
+            <w:pPr>
+              <w:pStyle w:val="Normal"/>
+              <w:widowControl w:val="false"/>
+              <w:suppressAutoHyphens w:val="true"/>
+              <w:spacing w:lineRule="auto" w:line="240" w:before="60" w:after="60"/>
+              <w:cnfStyle w:val="000000010000" w:firstRow="0" w:lastRow="0" w:firstColumn="0" w:lastColumn="0" w:oddVBand="0" w:evenVBand="0" w:oddHBand="0" w:evenHBand="1" w:firstRowFirstColumn="0" w:firstRowLastColumn="0" w:lastRowFirstColumn="0" w:lastRowLastColumn="0"/>
+              <w:rPr>
+                <w:i/>
                 <w:i/>
                 <w:color w:val="auto"/>
+                <w:lang w:val="en-US"/>
+              </w:rPr>
+            </w:pPr>
+            <w:r>
+              <w:rPr>
+                <w:rFonts w:eastAsia="" w:cs=""/>
+                <w:i/>
+                <w:color w:val="auto"/>
                 <w:kern w:val="0"/>
                 <w:lang w:eastAsia="ja-JP" w:bidi="ar-SA"/>
               </w:rPr>
@@ -6524,7 +6720,7 @@
         </w:tc>
         <w:tc>
           <w:tcPr>
-            <w:tcW w:w="5432" w:type="dxa"/>
+            <w:tcW w:w="5433" w:type="dxa"/>
             <w:tcBorders>
               <w:top w:val="nil"/>
               <w:bottom w:val="nil"/>
@@ -6534,7 +6730,8 @@
           <w:p>
             <w:pPr>
               <w:pStyle w:val="Normal"/>
-              <w:widowControl/>
+              <w:widowControl w:val="false"/>
+              <w:suppressAutoHyphens w:val="true"/>
               <w:spacing w:lineRule="auto" w:line="240" w:before="60" w:after="60"/>
               <w:cnfStyle w:val="000000010000" w:firstRow="0" w:lastRow="0" w:firstColumn="0" w:lastColumn="0" w:oddVBand="0" w:evenVBand="0" w:oddHBand="0" w:evenHBand="1" w:firstRowFirstColumn="0" w:firstRowLastColumn="0" w:lastRowFirstColumn="0" w:lastRowLastColumn="0"/>
               <w:rPr>
@@ -6557,7 +6754,8 @@
           <w:p>
             <w:pPr>
               <w:pStyle w:val="Normal"/>
-              <w:widowControl/>
+              <w:widowControl w:val="false"/>
+              <w:suppressAutoHyphens w:val="true"/>
               <w:spacing w:lineRule="auto" w:line="240" w:before="60" w:after="60"/>
               <w:cnfStyle w:val="000000010000" w:firstRow="0" w:lastRow="0" w:firstColumn="0" w:lastColumn="0" w:oddVBand="0" w:evenVBand="0" w:oddHBand="0" w:evenHBand="1" w:firstRowFirstColumn="0" w:firstRowLastColumn="0" w:lastRowFirstColumn="0" w:lastRowLastColumn="0"/>
               <w:rPr>
@@ -6660,7 +6858,7 @@
         <w:rPr/>
         <w:t>PDF-AS-WEB kann statistische Informationen sammeln. Um eine möglichst gut Integration zu ermöglichen, können einfach selbstentwickelte Statistikmodule in PDF-AS-WEB integriert werden. Dazu muss die Schnittstelle at.gv.egiz.pdfas.web.stats. StatisticBackend implementiert werden. PDF-AS-WEB lädt Implementierungen dieser Schnittstelle mit Hilfe des Java Service Provider Interface. Eine einfache Implementierung dieser Schnittstelle ist bereits in PDF-AS-WEB integriert und liefert auf dem Logger „at.gv.egiz.pdfas.web.statistics“ statistische Informationen im CSV Format. Die Spalten der CSV Einträge sind wie folgt zu interpretieren:</w:t>
       </w:r>
-      <w:bookmarkStart w:id="7" w:name="_Toc396214480"/>
+      <w:bookmarkStart w:id="6" w:name="_Toc396214480"/>
     </w:p>
     <w:p>
       <w:pPr>
@@ -6829,7 +7027,7 @@
         <w:rPr/>
         <w:t>Kommunikation</w:t>
       </w:r>
-      <w:bookmarkEnd w:id="7"/>
+      <w:bookmarkEnd w:id="6"/>
     </w:p>
     <w:p>
       <w:pPr>
@@ -6971,12 +7169,12 @@
         </w:numPr>
         <w:rPr/>
       </w:pPr>
-      <w:bookmarkStart w:id="8" w:name="_Toc396214481"/>
+      <w:bookmarkStart w:id="7" w:name="_Toc396214481"/>
       <w:r>
         <w:rPr/>
         <w:t>Beispiele</w:t>
       </w:r>
-      <w:bookmarkEnd w:id="8"/>
+      <w:bookmarkEnd w:id="7"/>
     </w:p>
     <w:p>
       <w:pPr>
@@ -8398,7 +8596,7 @@
         <w:tblStyle w:val="SOWTable"/>
         <w:tblW w:w="9140" w:type="dxa"/>
         <w:jc w:val="left"/>
-        <w:tblInd w:w="0" w:type="dxa"/>
+        <w:tblInd w:w="113" w:type="dxa"/>
         <w:tblLayout w:type="fixed"/>
         <w:tblCellMar>
           <w:top w:w="0" w:type="dxa"/>
@@ -8430,7 +8628,8 @@
           <w:p>
             <w:pPr>
               <w:pStyle w:val="Tabellen"/>
-              <w:widowControl/>
+              <w:widowControl w:val="false"/>
+              <w:suppressAutoHyphens w:val="true"/>
               <w:spacing w:lineRule="auto" w:line="240" w:before="60" w:after="60"/>
               <w:rPr>
                 <w:color w:val="FFFFFF" w:themeColor="background1"/>
@@ -8458,7 +8657,8 @@
           <w:p>
             <w:pPr>
               <w:pStyle w:val="Tabellen"/>
-              <w:widowControl/>
+              <w:widowControl w:val="false"/>
+              <w:suppressAutoHyphens w:val="true"/>
               <w:spacing w:lineRule="auto" w:line="240" w:before="60" w:after="60"/>
               <w:cnfStyle w:val="100000000000" w:firstRow="1" w:lastRow="0" w:firstColumn="0" w:lastColumn="0" w:oddVBand="0" w:evenVBand="0" w:oddHBand="0" w:evenHBand="0" w:firstRowFirstColumn="0" w:firstRowLastColumn="0" w:lastRowFirstColumn="0" w:lastRowLastColumn="0"/>
               <w:rPr>
@@ -8487,7 +8687,8 @@
           <w:p>
             <w:pPr>
               <w:pStyle w:val="Tabellen"/>
-              <w:widowControl/>
+              <w:widowControl w:val="false"/>
+              <w:suppressAutoHyphens w:val="true"/>
               <w:spacing w:lineRule="auto" w:line="240" w:before="60" w:after="60"/>
               <w:cnfStyle w:val="100000000000" w:firstRow="1" w:lastRow="0" w:firstColumn="0" w:lastColumn="0" w:oddVBand="0" w:evenVBand="0" w:oddHBand="0" w:evenHBand="0" w:firstRowFirstColumn="0" w:firstRowLastColumn="0" w:lastRowFirstColumn="0" w:lastRowLastColumn="0"/>
               <w:rPr>
@@ -8516,7 +8717,8 @@
           <w:p>
             <w:pPr>
               <w:pStyle w:val="Tabellen"/>
-              <w:widowControl/>
+              <w:widowControl w:val="false"/>
+              <w:suppressAutoHyphens w:val="true"/>
               <w:spacing w:lineRule="auto" w:line="240" w:before="60" w:after="60"/>
               <w:cnfStyle w:val="100000000000" w:firstRow="1" w:lastRow="0" w:firstColumn="0" w:lastColumn="0" w:oddVBand="0" w:evenVBand="0" w:oddHBand="0" w:evenHBand="0" w:firstRowFirstColumn="0" w:firstRowLastColumn="0" w:lastRowFirstColumn="0" w:lastRowLastColumn="0"/>
               <w:rPr>
@@ -8549,7 +8751,8 @@
           <w:p>
             <w:pPr>
               <w:pStyle w:val="Normal"/>
-              <w:widowControl/>
+              <w:widowControl w:val="false"/>
+              <w:suppressAutoHyphens w:val="true"/>
               <w:spacing w:lineRule="auto" w:line="240" w:before="60" w:after="60"/>
               <w:rPr>
                 <w:rFonts w:eastAsia="" w:cs=""/>
@@ -8578,7 +8781,8 @@
           <w:p>
             <w:pPr>
               <w:pStyle w:val="Normal"/>
-              <w:widowControl/>
+              <w:widowControl w:val="false"/>
+              <w:suppressAutoHyphens w:val="true"/>
               <w:spacing w:lineRule="auto" w:line="240" w:before="60" w:after="60"/>
               <w:cnfStyle w:val="000000000000" w:firstRow="0" w:lastRow="0" w:firstColumn="0" w:lastColumn="0" w:oddVBand="0" w:evenVBand="0" w:oddHBand="0" w:evenHBand="0" w:firstRowFirstColumn="0" w:firstRowLastColumn="0" w:lastRowFirstColumn="0" w:lastRowLastColumn="0"/>
               <w:rPr>
@@ -8608,7 +8812,8 @@
           <w:p>
             <w:pPr>
               <w:pStyle w:val="Normal"/>
-              <w:widowControl/>
+              <w:widowControl w:val="false"/>
+              <w:suppressAutoHyphens w:val="true"/>
               <w:spacing w:lineRule="auto" w:line="240" w:before="60" w:after="60"/>
               <w:cnfStyle w:val="000000000000" w:firstRow="0" w:lastRow="0" w:firstColumn="0" w:lastColumn="0" w:oddVBand="0" w:evenVBand="0" w:oddHBand="0" w:evenHBand="0" w:firstRowFirstColumn="0" w:firstRowLastColumn="0" w:lastRowFirstColumn="0" w:lastRowLastColumn="0"/>
               <w:rPr>
@@ -8638,7 +8843,8 @@
           <w:p>
             <w:pPr>
               <w:pStyle w:val="Normal"/>
-              <w:widowControl/>
+              <w:widowControl w:val="false"/>
+              <w:suppressAutoHyphens w:val="true"/>
               <w:spacing w:lineRule="auto" w:line="240" w:before="60" w:after="60"/>
               <w:cnfStyle w:val="000000000000" w:firstRow="0" w:lastRow="0" w:firstColumn="0" w:lastColumn="0" w:oddVBand="0" w:evenVBand="0" w:oddHBand="0" w:evenHBand="0" w:firstRowFirstColumn="0" w:firstRowLastColumn="0" w:lastRowFirstColumn="0" w:lastRowLastColumn="0"/>
               <w:rPr>
@@ -8675,7 +8881,8 @@
           <w:p>
             <w:pPr>
               <w:pStyle w:val="Normal"/>
-              <w:widowControl/>
+              <w:widowControl w:val="false"/>
+              <w:suppressAutoHyphens w:val="true"/>
               <w:spacing w:lineRule="auto" w:line="240" w:before="60" w:after="60"/>
               <w:rPr>
                 <w:rFonts w:eastAsia="" w:cs=""/>
@@ -8705,7 +8912,8 @@
           <w:p>
             <w:pPr>
               <w:pStyle w:val="Normal"/>
-              <w:widowControl/>
+              <w:widowControl w:val="false"/>
+              <w:suppressAutoHyphens w:val="true"/>
               <w:spacing w:lineRule="auto" w:line="240" w:before="60" w:after="60"/>
               <w:cnfStyle w:val="000000010000" w:firstRow="0" w:lastRow="0" w:firstColumn="0" w:lastColumn="0" w:oddVBand="0" w:evenVBand="0" w:oddHBand="0" w:evenHBand="1" w:firstRowFirstColumn="0" w:firstRowLastColumn="0" w:lastRowFirstColumn="0" w:lastRowLastColumn="0"/>
               <w:rPr>
@@ -8736,7 +8944,8 @@
           <w:p>
             <w:pPr>
               <w:pStyle w:val="Normal"/>
-              <w:widowControl/>
+              <w:widowControl w:val="false"/>
+              <w:suppressAutoHyphens w:val="true"/>
               <w:spacing w:lineRule="auto" w:line="240" w:before="60" w:after="60"/>
               <w:cnfStyle w:val="000000010000" w:firstRow="0" w:lastRow="0" w:firstColumn="0" w:lastColumn="0" w:oddVBand="0" w:evenVBand="0" w:oddHBand="0" w:evenHBand="1" w:firstRowFirstColumn="0" w:firstRowLastColumn="0" w:lastRowFirstColumn="0" w:lastRowLastColumn="0"/>
               <w:rPr>
@@ -8767,7 +8976,8 @@
           <w:p>
             <w:pPr>
               <w:pStyle w:val="Normal"/>
-              <w:widowControl/>
+              <w:widowControl w:val="false"/>
+              <w:suppressAutoHyphens w:val="true"/>
               <w:spacing w:lineRule="auto" w:line="240" w:before="60" w:after="60"/>
               <w:cnfStyle w:val="000000010000" w:firstRow="0" w:lastRow="0" w:firstColumn="0" w:lastColumn="0" w:oddVBand="0" w:evenVBand="0" w:oddHBand="0" w:evenHBand="1" w:firstRowFirstColumn="0" w:firstRowLastColumn="0" w:lastRowFirstColumn="0" w:lastRowLastColumn="0"/>
               <w:rPr>
@@ -8801,7 +9011,8 @@
           <w:p>
             <w:pPr>
               <w:pStyle w:val="Normal"/>
-              <w:widowControl/>
+              <w:widowControl w:val="false"/>
+              <w:suppressAutoHyphens w:val="true"/>
               <w:spacing w:lineRule="auto" w:line="240" w:before="60" w:after="60"/>
               <w:rPr>
                 <w:rFonts w:eastAsia="" w:cs=""/>
@@ -8830,7 +9041,8 @@
           <w:p>
             <w:pPr>
               <w:pStyle w:val="Normal"/>
-              <w:widowControl/>
+              <w:widowControl w:val="false"/>
+              <w:suppressAutoHyphens w:val="true"/>
               <w:spacing w:lineRule="auto" w:line="240" w:before="60" w:after="60"/>
               <w:cnfStyle w:val="000000000000" w:firstRow="0" w:lastRow="0" w:firstColumn="0" w:lastColumn="0" w:oddVBand="0" w:evenVBand="0" w:oddHBand="0" w:evenHBand="0" w:firstRowFirstColumn="0" w:firstRowLastColumn="0" w:lastRowFirstColumn="0" w:lastRowLastColumn="0"/>
               <w:rPr>
@@ -8860,7 +9072,8 @@
           <w:p>
             <w:pPr>
               <w:pStyle w:val="Normal"/>
-              <w:widowControl/>
+              <w:widowControl w:val="false"/>
+              <w:suppressAutoHyphens w:val="true"/>
               <w:spacing w:lineRule="auto" w:line="240" w:before="60" w:after="60"/>
               <w:cnfStyle w:val="000000000000" w:firstRow="0" w:lastRow="0" w:firstColumn="0" w:lastColumn="0" w:oddVBand="0" w:evenVBand="0" w:oddHBand="0" w:evenHBand="0" w:firstRowFirstColumn="0" w:firstRowLastColumn="0" w:lastRowFirstColumn="0" w:lastRowLastColumn="0"/>
               <w:rPr>
@@ -8890,7 +9103,8 @@
           <w:p>
             <w:pPr>
               <w:pStyle w:val="Normal"/>
-              <w:widowControl/>
+              <w:widowControl w:val="false"/>
+              <w:suppressAutoHyphens w:val="true"/>
               <w:spacing w:lineRule="auto" w:line="240" w:before="60" w:after="60"/>
               <w:cnfStyle w:val="000000000000" w:firstRow="0" w:lastRow="0" w:firstColumn="0" w:lastColumn="0" w:oddVBand="0" w:evenVBand="0" w:oddHBand="0" w:evenHBand="0" w:firstRowFirstColumn="0" w:firstRowLastColumn="0" w:lastRowFirstColumn="0" w:lastRowLastColumn="0"/>
               <w:rPr>
@@ -8927,7 +9141,8 @@
           <w:p>
             <w:pPr>
               <w:pStyle w:val="Normal"/>
-              <w:widowControl/>
+              <w:widowControl w:val="false"/>
+              <w:suppressAutoHyphens w:val="true"/>
               <w:spacing w:lineRule="auto" w:line="240" w:before="60" w:after="60"/>
               <w:rPr>
                 <w:rFonts w:eastAsia="" w:cs=""/>
@@ -8957,7 +9172,8 @@
           <w:p>
             <w:pPr>
               <w:pStyle w:val="Normal"/>
-              <w:widowControl/>
+              <w:widowControl w:val="false"/>
+              <w:suppressAutoHyphens w:val="true"/>
               <w:spacing w:lineRule="auto" w:line="240" w:before="60" w:after="60"/>
               <w:cnfStyle w:val="000000010000" w:firstRow="0" w:lastRow="0" w:firstColumn="0" w:lastColumn="0" w:oddVBand="0" w:evenVBand="0" w:oddHBand="0" w:evenHBand="1" w:firstRowFirstColumn="0" w:firstRowLastColumn="0" w:lastRowFirstColumn="0" w:lastRowLastColumn="0"/>
               <w:rPr>
@@ -8988,7 +9204,8 @@
           <w:p>
             <w:pPr>
               <w:pStyle w:val="Normal"/>
-              <w:widowControl/>
+              <w:widowControl w:val="false"/>
+              <w:suppressAutoHyphens w:val="true"/>
               <w:spacing w:lineRule="auto" w:line="240" w:before="60" w:after="60"/>
               <w:cnfStyle w:val="000000010000" w:firstRow="0" w:lastRow="0" w:firstColumn="0" w:lastColumn="0" w:oddVBand="0" w:evenVBand="0" w:oddHBand="0" w:evenHBand="1" w:firstRowFirstColumn="0" w:firstRowLastColumn="0" w:lastRowFirstColumn="0" w:lastRowLastColumn="0"/>
               <w:rPr>
@@ -9019,7 +9236,8 @@
           <w:p>
             <w:pPr>
               <w:pStyle w:val="Normal"/>
-              <w:widowControl/>
+              <w:widowControl w:val="false"/>
+              <w:suppressAutoHyphens w:val="true"/>
               <w:spacing w:lineRule="auto" w:line="240" w:before="60" w:after="60"/>
               <w:cnfStyle w:val="000000010000" w:firstRow="0" w:lastRow="0" w:firstColumn="0" w:lastColumn="0" w:oddVBand="0" w:evenVBand="0" w:oddHBand="0" w:evenHBand="1" w:firstRowFirstColumn="0" w:firstRowLastColumn="0" w:lastRowFirstColumn="0" w:lastRowLastColumn="0"/>
               <w:rPr>
@@ -9053,7 +9271,8 @@
           <w:p>
             <w:pPr>
               <w:pStyle w:val="Normal"/>
-              <w:widowControl/>
+              <w:widowControl w:val="false"/>
+              <w:suppressAutoHyphens w:val="true"/>
               <w:spacing w:lineRule="auto" w:line="240" w:before="60" w:after="60"/>
               <w:rPr>
                 <w:rFonts w:eastAsia="" w:cs=""/>
@@ -9082,7 +9301,8 @@
           <w:p>
             <w:pPr>
               <w:pStyle w:val="Normal"/>
-              <w:widowControl/>
+              <w:widowControl w:val="false"/>
+              <w:suppressAutoHyphens w:val="true"/>
               <w:spacing w:lineRule="auto" w:line="240" w:before="60" w:after="60"/>
               <w:cnfStyle w:val="000000000000" w:firstRow="0" w:lastRow="0" w:firstColumn="0" w:lastColumn="0" w:oddVBand="0" w:evenVBand="0" w:oddHBand="0" w:evenHBand="0" w:firstRowFirstColumn="0" w:firstRowLastColumn="0" w:lastRowFirstColumn="0" w:lastRowLastColumn="0"/>
               <w:rPr>
@@ -9112,7 +9332,8 @@
           <w:p>
             <w:pPr>
               <w:pStyle w:val="Normal"/>
-              <w:widowControl/>
+              <w:widowControl w:val="false"/>
+              <w:suppressAutoHyphens w:val="true"/>
               <w:spacing w:lineRule="auto" w:line="240" w:before="60" w:after="60"/>
               <w:cnfStyle w:val="000000000000" w:firstRow="0" w:lastRow="0" w:firstColumn="0" w:lastColumn="0" w:oddVBand="0" w:evenVBand="0" w:oddHBand="0" w:evenHBand="0" w:firstRowFirstColumn="0" w:firstRowLastColumn="0" w:lastRowFirstColumn="0" w:lastRowLastColumn="0"/>
               <w:rPr>
@@ -9142,7 +9363,8 @@
           <w:p>
             <w:pPr>
               <w:pStyle w:val="Normal"/>
-              <w:widowControl/>
+              <w:widowControl w:val="false"/>
+              <w:suppressAutoHyphens w:val="true"/>
               <w:spacing w:lineRule="auto" w:line="240" w:before="60" w:after="60"/>
               <w:cnfStyle w:val="000000000000" w:firstRow="0" w:lastRow="0" w:firstColumn="0" w:lastColumn="0" w:oddVBand="0" w:evenVBand="0" w:oddHBand="0" w:evenHBand="0" w:firstRowFirstColumn="0" w:firstRowLastColumn="0" w:lastRowFirstColumn="0" w:lastRowLastColumn="0"/>
               <w:rPr>
@@ -9179,7 +9401,8 @@
           <w:p>
             <w:pPr>
               <w:pStyle w:val="Normal"/>
-              <w:widowControl/>
+              <w:widowControl w:val="false"/>
+              <w:suppressAutoHyphens w:val="true"/>
               <w:spacing w:lineRule="auto" w:line="240" w:before="60" w:after="60"/>
               <w:rPr>
                 <w:rFonts w:eastAsia="" w:cs=""/>
@@ -9209,7 +9432,8 @@
           <w:p>
             <w:pPr>
               <w:pStyle w:val="Normal"/>
-              <w:widowControl/>
+              <w:widowControl w:val="false"/>
+              <w:suppressAutoHyphens w:val="true"/>
               <w:spacing w:lineRule="auto" w:line="240" w:before="60" w:after="60"/>
               <w:cnfStyle w:val="000000010000" w:firstRow="0" w:lastRow="0" w:firstColumn="0" w:lastColumn="0" w:oddVBand="0" w:evenVBand="0" w:oddHBand="0" w:evenHBand="1" w:firstRowFirstColumn="0" w:firstRowLastColumn="0" w:lastRowFirstColumn="0" w:lastRowLastColumn="0"/>
               <w:rPr>
@@ -9240,7 +9464,8 @@
           <w:p>
             <w:pPr>
               <w:pStyle w:val="Normal"/>
-              <w:widowControl/>
+              <w:widowControl w:val="false"/>
+              <w:suppressAutoHyphens w:val="true"/>
               <w:spacing w:lineRule="auto" w:line="240" w:before="60" w:after="60"/>
               <w:cnfStyle w:val="000000010000" w:firstRow="0" w:lastRow="0" w:firstColumn="0" w:lastColumn="0" w:oddVBand="0" w:evenVBand="0" w:oddHBand="0" w:evenHBand="1" w:firstRowFirstColumn="0" w:firstRowLastColumn="0" w:lastRowFirstColumn="0" w:lastRowLastColumn="0"/>
               <w:rPr>
@@ -9271,7 +9496,8 @@
           <w:p>
             <w:pPr>
               <w:pStyle w:val="Normal"/>
-              <w:widowControl/>
+              <w:widowControl w:val="false"/>
+              <w:suppressAutoHyphens w:val="true"/>
               <w:spacing w:lineRule="auto" w:line="240" w:before="60" w:after="60"/>
               <w:cnfStyle w:val="000000010000" w:firstRow="0" w:lastRow="0" w:firstColumn="0" w:lastColumn="0" w:oddVBand="0" w:evenVBand="0" w:oddHBand="0" w:evenHBand="1" w:firstRowFirstColumn="0" w:firstRowLastColumn="0" w:lastRowFirstColumn="0" w:lastRowLastColumn="0"/>
               <w:rPr>
@@ -9305,7 +9531,8 @@
           <w:p>
             <w:pPr>
               <w:pStyle w:val="Normal"/>
-              <w:widowControl/>
+              <w:widowControl w:val="false"/>
+              <w:suppressAutoHyphens w:val="true"/>
               <w:spacing w:lineRule="auto" w:line="240" w:before="60" w:after="60"/>
               <w:rPr>
                 <w:rFonts w:eastAsia="" w:cs=""/>
@@ -9334,7 +9561,8 @@
           <w:p>
             <w:pPr>
               <w:pStyle w:val="Normal"/>
-              <w:widowControl/>
+              <w:widowControl w:val="false"/>
+              <w:suppressAutoHyphens w:val="true"/>
               <w:spacing w:lineRule="auto" w:line="240" w:before="60" w:after="60"/>
               <w:cnfStyle w:val="000000000000" w:firstRow="0" w:lastRow="0" w:firstColumn="0" w:lastColumn="0" w:oddVBand="0" w:evenVBand="0" w:oddHBand="0" w:evenHBand="0" w:firstRowFirstColumn="0" w:firstRowLastColumn="0" w:lastRowFirstColumn="0" w:lastRowLastColumn="0"/>
               <w:rPr>
@@ -9364,7 +9592,8 @@
           <w:p>
             <w:pPr>
               <w:pStyle w:val="Normal"/>
-              <w:widowControl/>
+              <w:widowControl w:val="false"/>
+              <w:suppressAutoHyphens w:val="true"/>
               <w:spacing w:lineRule="auto" w:line="240" w:before="60" w:after="60"/>
               <w:cnfStyle w:val="000000000000" w:firstRow="0" w:lastRow="0" w:firstColumn="0" w:lastColumn="0" w:oddVBand="0" w:evenVBand="0" w:oddHBand="0" w:evenHBand="0" w:firstRowFirstColumn="0" w:firstRowLastColumn="0" w:lastRowFirstColumn="0" w:lastRowLastColumn="0"/>
               <w:rPr>
@@ -9394,7 +9623,8 @@
           <w:p>
             <w:pPr>
               <w:pStyle w:val="Normal"/>
-              <w:widowControl/>
+              <w:widowControl w:val="false"/>
+              <w:suppressAutoHyphens w:val="true"/>
               <w:spacing w:lineRule="auto" w:line="240" w:before="60" w:after="60"/>
               <w:cnfStyle w:val="000000000000" w:firstRow="0" w:lastRow="0" w:firstColumn="0" w:lastColumn="0" w:oddVBand="0" w:evenVBand="0" w:oddHBand="0" w:evenHBand="0" w:firstRowFirstColumn="0" w:firstRowLastColumn="0" w:lastRowFirstColumn="0" w:lastRowLastColumn="0"/>
               <w:rPr>
@@ -9424,13 +9654,15 @@
             <w:cnfStyle w:val="001000000000" w:firstRow="0" w:lastRow="0" w:firstColumn="1" w:lastColumn="0" w:oddVBand="0" w:evenVBand="0" w:oddHBand="0" w:evenHBand="0" w:firstRowFirstColumn="0" w:firstRowLastColumn="0" w:lastRowFirstColumn="0" w:lastRowLastColumn="0"/>
             <w:tcBorders>
               <w:top w:val="nil"/>
+              <w:bottom w:val="nil"/>
             </w:tcBorders>
             <w:shd w:color="auto" w:fill="DDDBD5" w:themeFill="text2" w:themeFillTint="33" w:val="clear"/>
           </w:tcPr>
           <w:p>
             <w:pPr>
               <w:pStyle w:val="Normal"/>
-              <w:widowControl/>
+              <w:widowControl w:val="false"/>
+              <w:suppressAutoHyphens w:val="true"/>
               <w:spacing w:lineRule="auto" w:line="240" w:before="60" w:after="60"/>
               <w:rPr>
                 <w:rFonts w:eastAsia="" w:cs=""/>
@@ -9453,13 +9685,15 @@
             <w:tcW w:w="1701" w:type="dxa"/>
             <w:tcBorders>
               <w:top w:val="nil"/>
+              <w:bottom w:val="nil"/>
             </w:tcBorders>
             <w:shd w:color="auto" w:fill="DDDBD5" w:themeFill="text2" w:themeFillTint="33" w:val="clear"/>
           </w:tcPr>
           <w:p>
             <w:pPr>
               <w:pStyle w:val="Normal"/>
-              <w:widowControl/>
+              <w:widowControl w:val="false"/>
+              <w:suppressAutoHyphens w:val="true"/>
               <w:spacing w:lineRule="auto" w:line="240" w:before="60" w:after="60"/>
               <w:cnfStyle w:val="000000010000" w:firstRow="0" w:lastRow="0" w:firstColumn="0" w:lastColumn="0" w:oddVBand="0" w:evenVBand="0" w:oddHBand="0" w:evenHBand="1" w:firstRowFirstColumn="0" w:firstRowLastColumn="0" w:lastRowFirstColumn="0" w:lastRowLastColumn="0"/>
               <w:rPr>
@@ -9483,13 +9717,15 @@
             <w:tcW w:w="2410" w:type="dxa"/>
             <w:tcBorders>
               <w:top w:val="nil"/>
+              <w:bottom w:val="nil"/>
             </w:tcBorders>
             <w:shd w:color="auto" w:fill="DDDBD5" w:themeFill="text2" w:themeFillTint="33" w:val="clear"/>
           </w:tcPr>
           <w:p>
             <w:pPr>
               <w:pStyle w:val="Normal"/>
-              <w:widowControl/>
+              <w:widowControl w:val="false"/>
+              <w:suppressAutoHyphens w:val="true"/>
               <w:spacing w:lineRule="auto" w:line="240" w:before="60" w:after="60"/>
               <w:cnfStyle w:val="000000010000" w:firstRow="0" w:lastRow="0" w:firstColumn="0" w:lastColumn="0" w:oddVBand="0" w:evenVBand="0" w:oddHBand="0" w:evenHBand="1" w:firstRowFirstColumn="0" w:firstRowLastColumn="0" w:lastRowFirstColumn="0" w:lastRowLastColumn="0"/>
               <w:rPr>
@@ -9513,13 +9749,15 @@
             <w:tcW w:w="3786" w:type="dxa"/>
             <w:tcBorders>
               <w:top w:val="nil"/>
+              <w:bottom w:val="nil"/>
             </w:tcBorders>
             <w:shd w:color="auto" w:fill="DDDBD5" w:themeFill="text2" w:themeFillTint="33" w:val="clear"/>
           </w:tcPr>
           <w:p>
             <w:pPr>
               <w:pStyle w:val="Normal"/>
-              <w:widowControl/>
+              <w:widowControl w:val="false"/>
+              <w:suppressAutoHyphens w:val="true"/>
               <w:spacing w:lineRule="auto" w:line="240" w:before="60" w:after="60"/>
               <w:cnfStyle w:val="000000010000" w:firstRow="0" w:lastRow="0" w:firstColumn="0" w:lastColumn="0" w:oddVBand="0" w:evenVBand="0" w:oddHBand="0" w:evenHBand="1" w:firstRowFirstColumn="0" w:firstRowLastColumn="0" w:lastRowFirstColumn="0" w:lastRowLastColumn="0"/>
               <w:rPr>
@@ -9555,7 +9793,8 @@
           <w:p>
             <w:pPr>
               <w:pStyle w:val="Normal"/>
-              <w:widowControl/>
+              <w:widowControl w:val="false"/>
+              <w:suppressAutoHyphens w:val="true"/>
               <w:spacing w:lineRule="auto" w:line="240" w:before="60" w:after="60"/>
               <w:rPr>
                 <w:rFonts w:eastAsia="" w:cs=""/>
@@ -9584,7 +9823,8 @@
           <w:p>
             <w:pPr>
               <w:pStyle w:val="Normal"/>
-              <w:widowControl/>
+              <w:widowControl w:val="false"/>
+              <w:suppressAutoHyphens w:val="true"/>
               <w:spacing w:lineRule="auto" w:line="240" w:before="60" w:after="60"/>
               <w:cnfStyle w:val="000000010000" w:firstRow="0" w:lastRow="0" w:firstColumn="0" w:lastColumn="0" w:oddVBand="0" w:evenVBand="0" w:oddHBand="0" w:evenHBand="1" w:firstRowFirstColumn="0" w:firstRowLastColumn="0" w:lastRowFirstColumn="0" w:lastRowLastColumn="0"/>
               <w:rPr>
@@ -9614,7 +9854,8 @@
           <w:p>
             <w:pPr>
               <w:pStyle w:val="Normal"/>
-              <w:widowControl/>
+              <w:widowControl w:val="false"/>
+              <w:suppressAutoHyphens w:val="true"/>
               <w:spacing w:lineRule="auto" w:line="240" w:before="60" w:after="60"/>
               <w:cnfStyle w:val="000000010000" w:firstRow="0" w:lastRow="0" w:firstColumn="0" w:lastColumn="0" w:oddVBand="0" w:evenVBand="0" w:oddHBand="0" w:evenHBand="1" w:firstRowFirstColumn="0" w:firstRowLastColumn="0" w:lastRowFirstColumn="0" w:lastRowLastColumn="0"/>
               <w:rPr>
@@ -9644,7 +9885,8 @@
           <w:p>
             <w:pPr>
               <w:pStyle w:val="Normal"/>
-              <w:widowControl/>
+              <w:widowControl w:val="false"/>
+              <w:suppressAutoHyphens w:val="true"/>
               <w:spacing w:lineRule="auto" w:line="240" w:before="60" w:after="60"/>
               <w:cnfStyle w:val="000000010000" w:firstRow="0" w:lastRow="0" w:firstColumn="0" w:lastColumn="0" w:oddVBand="0" w:evenVBand="0" w:oddHBand="0" w:evenHBand="1" w:firstRowFirstColumn="0" w:firstRowLastColumn="0" w:lastRowFirstColumn="0" w:lastRowLastColumn="0"/>
               <w:rPr>
@@ -9740,7 +9982,8 @@
           <w:p>
             <w:pPr>
               <w:pStyle w:val="Normal"/>
-              <w:widowControl/>
+              <w:widowControl w:val="false"/>
+              <w:suppressAutoHyphens w:val="true"/>
               <w:spacing w:lineRule="auto" w:line="240" w:before="0" w:after="0"/>
               <w:rPr>
                 <w:rFonts w:eastAsia="" w:cs=""/>
@@ -9765,7 +10008,8 @@
           <w:p>
             <w:pPr>
               <w:pStyle w:val="Normal"/>
-              <w:widowControl/>
+              <w:widowControl w:val="false"/>
+              <w:suppressAutoHyphens w:val="true"/>
               <w:spacing w:lineRule="auto" w:line="240" w:before="0" w:after="0"/>
               <w:rPr>
                 <w:rFonts w:eastAsia="" w:cs=""/>
@@ -9795,7 +10039,8 @@
           <w:p>
             <w:pPr>
               <w:pStyle w:val="Normal"/>
-              <w:widowControl/>
+              <w:widowControl w:val="false"/>
+              <w:suppressAutoHyphens w:val="true"/>
               <w:spacing w:lineRule="auto" w:line="240" w:before="0" w:after="0"/>
               <w:rPr>
                 <w:rFonts w:eastAsia="" w:cs=""/>
@@ -9820,7 +10065,8 @@
           <w:p>
             <w:pPr>
               <w:pStyle w:val="Normal"/>
-              <w:widowControl/>
+              <w:widowControl w:val="false"/>
+              <w:suppressAutoHyphens w:val="true"/>
               <w:spacing w:lineRule="auto" w:line="240" w:before="0" w:after="0"/>
               <w:rPr>
                 <w:rFonts w:eastAsia="" w:cs=""/>
@@ -9898,7 +10144,7 @@
       <mc:AlternateContent>
         <mc:Choice Requires="wps">
           <w:drawing>
-            <wp:anchor behindDoc="1" distT="0" distB="0" distL="0" distR="0" simplePos="0" locked="0" layoutInCell="0" allowOverlap="1" relativeHeight="31" wp14:anchorId="3EC3DD82">
+            <wp:anchor behindDoc="1" distT="0" distB="0" distL="0" distR="0" simplePos="0" locked="0" layoutInCell="0" allowOverlap="1" relativeHeight="28" wp14:anchorId="3EC3DD82">
               <wp:simplePos x="0" y="0"/>
               <wp:positionH relativeFrom="margin">
                 <wp:align>left</wp:align>
@@ -9945,7 +10191,7 @@
                           <w:tblPr>
                             <w:tblW w:w="5000" w:type="pct"/>
                             <w:jc w:val="left"/>
-                            <w:tblInd w:w="0" w:type="dxa"/>
+                            <w:tblInd w:w="14" w:type="dxa"/>
                             <w:tblLayout w:type="fixed"/>
                             <w:tblCellMar>
                               <w:top w:w="72" w:type="dxa"/>
@@ -10000,8 +10246,8 @@
                                   <w:rPr/>
                                   <w:fldChar w:fldCharType="end"/>
                                 </w:r>
-                                <w:bookmarkStart w:id="9" w:name="_GoBack"/>
-                                <w:bookmarkEnd w:id="9"/>
+                                <w:bookmarkStart w:id="8" w:name="_GoBack"/>
+                                <w:bookmarkEnd w:id="8"/>
                               </w:p>
                             </w:tc>
                             <w:tc>
@@ -10122,7 +10368,7 @@
                     <w:tblPr>
                       <w:tblW w:w="5000" w:type="pct"/>
                       <w:jc w:val="left"/>
-                      <w:tblInd w:w="0" w:type="dxa"/>
+                      <w:tblInd w:w="14" w:type="dxa"/>
                       <w:tblLayout w:type="fixed"/>
                       <w:tblCellMar>
                         <w:top w:w="72" w:type="dxa"/>
@@ -10177,8 +10423,8 @@
                             <w:rPr/>
                             <w:fldChar w:fldCharType="end"/>
                           </w:r>
-                          <w:bookmarkStart w:id="10" w:name="_GoBack"/>
-                          <w:bookmarkEnd w:id="10"/>
+                          <w:bookmarkStart w:id="9" w:name="_GoBack"/>
+                          <w:bookmarkEnd w:id="9"/>
                         </w:p>
                       </w:tc>
                       <w:tc>
@@ -10329,7 +10575,8 @@
         <w:p>
           <w:pPr>
             <w:pStyle w:val="Name"/>
-            <w:widowControl/>
+            <w:widowControl w:val="false"/>
+            <w:suppressAutoHyphens w:val="true"/>
             <w:spacing w:before="60" w:after="60"/>
             <w:ind w:left="0" w:right="144" w:hanging="0"/>
             <w:rPr>
@@ -10348,7 +10595,8 @@
         <w:p>
           <w:pPr>
             <w:pStyle w:val="NoSpacing"/>
-            <w:widowControl/>
+            <w:widowControl w:val="false"/>
+            <w:suppressAutoHyphens w:val="true"/>
             <w:ind w:left="0" w:right="0" w:hanging="0"/>
             <w:jc w:val="left"/>
             <w:rPr>
@@ -10407,7 +10655,8 @@
         <w:p>
           <w:pPr>
             <w:pStyle w:val="Name"/>
-            <w:widowControl/>
+            <w:widowControl w:val="false"/>
+            <w:suppressAutoHyphens w:val="true"/>
             <w:spacing w:before="60" w:after="60"/>
             <w:ind w:left="144" w:right="144" w:hanging="0"/>
             <w:jc w:val="right"/>
@@ -10450,7 +10699,8 @@
         <w:p>
           <w:pPr>
             <w:pStyle w:val="Name"/>
-            <w:widowControl/>
+            <w:widowControl w:val="false"/>
+            <w:suppressAutoHyphens w:val="true"/>
             <w:ind w:left="144" w:right="144" w:hanging="0"/>
             <w:jc w:val="right"/>
             <w:rPr>
@@ -10482,7 +10732,8 @@
         <w:p>
           <w:pPr>
             <w:pStyle w:val="Name"/>
-            <w:widowControl/>
+            <w:widowControl w:val="false"/>
+            <w:suppressAutoHyphens w:val="true"/>
             <w:spacing w:before="60" w:after="60"/>
             <w:ind w:left="144" w:right="144" w:hanging="0"/>
             <w:jc w:val="right"/>
@@ -10510,10 +10761,7 @@
             <w:br/>
           </w:r>
           <w:r>
-            <w:rPr>
-              <w:kern w:val="0"/>
-              <w:lang w:eastAsia="ja-JP" w:bidi="ar-SA"/>
-            </w:rPr>
+            <w:rPr/>
             <w:drawing>
               <wp:inline distT="0" distB="0" distL="0" distR="0">
                 <wp:extent cx="2762250" cy="255905"/>
@@ -10561,10 +10809,7 @@
             <w:br/>
           </w:r>
           <w:r>
-            <w:rPr>
-              <w:kern w:val="0"/>
-              <w:lang w:eastAsia="ja-JP" w:bidi="ar-SA"/>
-            </w:rPr>
+            <w:rPr/>
             <w:drawing>
               <wp:inline distT="0" distB="0" distL="0" distR="0">
                 <wp:extent cx="1014730" cy="496570"/>
@@ -10690,6 +10935,7 @@
         </w:tabs>
         <w:ind w:left="1080" w:hanging="360"/>
       </w:pPr>
+      <w:rPr/>
     </w:lvl>
     <w:lvl w:ilvl="2">
       <w:start w:val="1"/>
@@ -10702,6 +10948,7 @@
         </w:tabs>
         <w:ind w:left="1440" w:hanging="360"/>
       </w:pPr>
+      <w:rPr/>
     </w:lvl>
     <w:lvl w:ilvl="3">
       <w:start w:val="1"/>
@@ -10714,6 +10961,7 @@
         </w:tabs>
         <w:ind w:left="1800" w:hanging="360"/>
       </w:pPr>
+      <w:rPr/>
     </w:lvl>
     <w:lvl w:ilvl="4">
       <w:start w:val="1"/>
@@ -10726,6 +10974,7 @@
         </w:tabs>
         <w:ind w:left="2160" w:hanging="360"/>
       </w:pPr>
+      <w:rPr/>
     </w:lvl>
     <w:lvl w:ilvl="5">
       <w:start w:val="1"/>
@@ -10738,6 +10987,7 @@
         </w:tabs>
         <w:ind w:left="2520" w:hanging="360"/>
       </w:pPr>
+      <w:rPr/>
     </w:lvl>
     <w:lvl w:ilvl="6">
       <w:start w:val="1"/>
@@ -10750,6 +11000,7 @@
         </w:tabs>
         <w:ind w:left="2880" w:hanging="360"/>
       </w:pPr>
+      <w:rPr/>
     </w:lvl>
     <w:lvl w:ilvl="7">
       <w:start w:val="1"/>
@@ -10762,6 +11013,7 @@
         </w:tabs>
         <w:ind w:left="3240" w:hanging="360"/>
       </w:pPr>
+      <w:rPr/>
     </w:lvl>
     <w:lvl w:ilvl="8">
       <w:start w:val="1"/>
@@ -10774,6 +11026,7 @@
         </w:tabs>
         <w:ind w:left="3600" w:hanging="360"/>
       </w:pPr>
+      <w:rPr/>
     </w:lvl>
   </w:abstractNum>
   <w:abstractNum w:abstractNumId="2">
@@ -11831,12 +12084,13 @@
     <w:rsid w:val="00835d6c"/>
     <w:pPr>
       <w:widowControl/>
+      <w:suppressAutoHyphens w:val="true"/>
       <w:bidi w:val="0"/>
       <w:spacing w:lineRule="auto" w:line="300" w:before="0" w:after="320"/>
       <w:jc w:val="both"/>
     </w:pPr>
     <w:rPr>
-      <w:rFonts w:ascii="Century Gothic" w:hAnsi="Century Gothic" w:asciiTheme="majorHAnsi" w:hAnsiTheme="majorHAnsi" w:eastAsia="" w:cs=""/>
+      <w:rFonts w:ascii="Century Gothic" w:hAnsi="Century Gothic" w:eastAsia="" w:cs="" w:asciiTheme="majorHAnsi" w:hAnsiTheme="majorHAnsi"/>
       <w:color w:val="000000" w:themeColor="text1"/>
       <w:kern w:val="0"/>
       <w:sz w:val="22"/>
@@ -12321,6 +12575,7 @@
     <w:qFormat/>
     <w:pPr>
       <w:widowControl/>
+      <w:suppressAutoHyphens w:val="true"/>
       <w:bidi w:val="0"/>
       <w:spacing w:lineRule="auto" w:line="240" w:before="60" w:after="0"/>
       <w:jc w:val="left"/>

</xml_diff>